<commit_message>
Add appendix tables of all edge labels and relations; add standalone TikZ diagram
Restores the two reference tables (27 edge labels, 36 relations) that were
previously only shown in chat, as appendices in ARCHITECTURE.md/.docx. Also
adds diagram.tex, a standalone TikZ version of the section 5 summary diagram.
</commit_message>
<xml_diff>
--- a/ARCHITECTURE.docx
+++ b/ARCHITECTURE.docx
@@ -2102,6 +2102,4655 @@
           <w:szCs w:val="18"/>
         </w:rPr>
         <w:t xml:space="preserve"> Final answer, grounded in retrieved rows</w:t>
+      </w:r>
+    </w:p>
+    <w:p>
+      <w:r>
+        <w:br w:type="page"/>
+      </w:r>
+    </w:p>
+    <w:p>
+      <w:pPr>
+        <w:pStyle w:val="Heading1"/>
+      </w:pPr>
+      <w:r>
+        <w:t xml:space="preserve">Appendix A: All Edge Labels (Entity-Pair Types)</w:t>
+      </w:r>
+    </w:p>
+    <w:p>
+      <w:pPr>
+        <w:spacing w:after="160"/>
+      </w:pPr>
+      <w:r>
+        <w:t xml:space="preserve">The label column on edges.parquet is the coarse entity-pair category. All 27 distinct values, with edge counts:</w:t>
+      </w:r>
+    </w:p>
+    <w:tbl>
+      <w:tblPr>
+        <w:tblW w:type="dxa" w:w="9360"/>
+        <w:tblBorders>
+          <w:top w:val="single" w:color="auto" w:sz="4"/>
+          <w:left w:val="single" w:color="auto" w:sz="4"/>
+          <w:bottom w:val="single" w:color="auto" w:sz="4"/>
+          <w:right w:val="single" w:color="auto" w:sz="4"/>
+          <w:insideH w:val="single" w:color="auto" w:sz="4"/>
+          <w:insideV w:val="single" w:color="auto" w:sz="4"/>
+        </w:tblBorders>
+      </w:tblPr>
+      <w:tblGrid>
+        <w:gridCol w:w="1800"/>
+        <w:gridCol w:w="1800"/>
+        <w:gridCol w:w="5760"/>
+      </w:tblGrid>
+      <w:tr>
+        <w:tc>
+          <w:tcPr>
+            <w:tcW w:type="dxa" w:w="1800"/>
+            <w:tcBorders>
+              <w:top w:val="single" w:color="CCCCCC" w:sz="1"/>
+              <w:left w:val="single" w:color="CCCCCC" w:sz="1"/>
+              <w:bottom w:val="single" w:color="CCCCCC" w:sz="1"/>
+              <w:right w:val="single" w:color="CCCCCC" w:sz="1"/>
+            </w:tcBorders>
+            <w:shd w:fill="2E5C8A" w:val="clear"/>
+            <w:tcMar>
+              <w:top w:type="dxa" w:w="80"/>
+              <w:left w:type="dxa" w:w="120"/>
+              <w:bottom w:type="dxa" w:w="80"/>
+              <w:right w:type="dxa" w:w="120"/>
+            </w:tcMar>
+          </w:tcPr>
+          <w:p>
+            <w:r>
+              <w:rPr>
+                <w:b/>
+                <w:bCs/>
+                <w:color w:val="FFFFFF"/>
+                <w:sz w:val="20"/>
+                <w:szCs w:val="20"/>
+              </w:rPr>
+              <w:t xml:space="preserve">Label</w:t>
+            </w:r>
+          </w:p>
+        </w:tc>
+        <w:tc>
+          <w:tcPr>
+            <w:tcW w:type="dxa" w:w="1800"/>
+            <w:tcBorders>
+              <w:top w:val="single" w:color="CCCCCC" w:sz="1"/>
+              <w:left w:val="single" w:color="CCCCCC" w:sz="1"/>
+              <w:bottom w:val="single" w:color="CCCCCC" w:sz="1"/>
+              <w:right w:val="single" w:color="CCCCCC" w:sz="1"/>
+            </w:tcBorders>
+            <w:shd w:fill="2E5C8A" w:val="clear"/>
+            <w:tcMar>
+              <w:top w:type="dxa" w:w="80"/>
+              <w:left w:type="dxa" w:w="120"/>
+              <w:bottom w:type="dxa" w:w="80"/>
+              <w:right w:type="dxa" w:w="120"/>
+            </w:tcMar>
+          </w:tcPr>
+          <w:p>
+            <w:r>
+              <w:rPr>
+                <w:b/>
+                <w:bCs/>
+                <w:color w:val="FFFFFF"/>
+                <w:sz w:val="20"/>
+                <w:szCs w:val="20"/>
+              </w:rPr>
+              <w:t xml:space="preserve">Edge Count</w:t>
+            </w:r>
+          </w:p>
+        </w:tc>
+        <w:tc>
+          <w:tcPr>
+            <w:tcW w:type="dxa" w:w="5760"/>
+            <w:tcBorders>
+              <w:top w:val="single" w:color="CCCCCC" w:sz="1"/>
+              <w:left w:val="single" w:color="CCCCCC" w:sz="1"/>
+              <w:bottom w:val="single" w:color="CCCCCC" w:sz="1"/>
+              <w:right w:val="single" w:color="CCCCCC" w:sz="1"/>
+            </w:tcBorders>
+            <w:shd w:fill="2E5C8A" w:val="clear"/>
+            <w:tcMar>
+              <w:top w:type="dxa" w:w="80"/>
+              <w:left w:type="dxa" w:w="120"/>
+              <w:bottom w:type="dxa" w:w="80"/>
+              <w:right w:type="dxa" w:w="120"/>
+            </w:tcMar>
+          </w:tcPr>
+          <w:p>
+            <w:r>
+              <w:rPr>
+                <w:b/>
+                <w:bCs/>
+                <w:color w:val="FFFFFF"/>
+                <w:sz w:val="20"/>
+                <w:szCs w:val="20"/>
+              </w:rPr>
+              <w:t xml:space="preserve">Entity Types</w:t>
+            </w:r>
+          </w:p>
+        </w:tc>
+      </w:tr>
+      <w:tr>
+        <w:tc>
+          <w:tcPr>
+            <w:tcW w:type="dxa" w:w="1800"/>
+            <w:tcBorders>
+              <w:top w:val="single" w:color="CCCCCC" w:sz="1"/>
+              <w:left w:val="single" w:color="CCCCCC" w:sz="1"/>
+              <w:bottom w:val="single" w:color="CCCCCC" w:sz="1"/>
+              <w:right w:val="single" w:color="CCCCCC" w:sz="1"/>
+            </w:tcBorders>
+            <w:shd w:fill="FFFFFF" w:val="clear"/>
+            <w:tcMar>
+              <w:top w:type="dxa" w:w="80"/>
+              <w:left w:type="dxa" w:w="120"/>
+              <w:bottom w:type="dxa" w:w="80"/>
+              <w:right w:type="dxa" w:w="120"/>
+            </w:tcMar>
+          </w:tcPr>
+          <w:p>
+            <w:r>
+              <w:rPr>
+                <w:rFonts w:ascii="Consolas" w:cs="Consolas" w:eastAsia="Consolas" w:hAnsi="Consolas"/>
+                <w:sz w:val="20"/>
+                <w:szCs w:val="20"/>
+              </w:rPr>
+              <w:t xml:space="preserve">DIS-GEN</w:t>
+            </w:r>
+          </w:p>
+        </w:tc>
+        <w:tc>
+          <w:tcPr>
+            <w:tcW w:type="dxa" w:w="1800"/>
+            <w:tcBorders>
+              <w:top w:val="single" w:color="CCCCCC" w:sz="1"/>
+              <w:left w:val="single" w:color="CCCCCC" w:sz="1"/>
+              <w:bottom w:val="single" w:color="CCCCCC" w:sz="1"/>
+              <w:right w:val="single" w:color="CCCCCC" w:sz="1"/>
+            </w:tcBorders>
+            <w:shd w:fill="FFFFFF" w:val="clear"/>
+            <w:tcMar>
+              <w:top w:type="dxa" w:w="80"/>
+              <w:left w:type="dxa" w:w="120"/>
+              <w:bottom w:type="dxa" w:w="80"/>
+              <w:right w:type="dxa" w:w="120"/>
+            </w:tcMar>
+          </w:tcPr>
+          <w:p>
+            <w:r>
+              <w:rPr>
+                <w:rFonts w:ascii="Arial" w:cs="Arial" w:eastAsia="Arial" w:hAnsi="Arial"/>
+                <w:sz w:val="20"/>
+                <w:szCs w:val="20"/>
+              </w:rPr>
+              <w:t xml:space="preserve">9,734,774</w:t>
+            </w:r>
+          </w:p>
+        </w:tc>
+        <w:tc>
+          <w:tcPr>
+            <w:tcW w:type="dxa" w:w="5760"/>
+            <w:tcBorders>
+              <w:top w:val="single" w:color="CCCCCC" w:sz="1"/>
+              <w:left w:val="single" w:color="CCCCCC" w:sz="1"/>
+              <w:bottom w:val="single" w:color="CCCCCC" w:sz="1"/>
+              <w:right w:val="single" w:color="CCCCCC" w:sz="1"/>
+            </w:tcBorders>
+            <w:shd w:fill="FFFFFF" w:val="clear"/>
+            <w:tcMar>
+              <w:top w:type="dxa" w:w="80"/>
+              <w:left w:type="dxa" w:w="120"/>
+              <w:bottom w:type="dxa" w:w="80"/>
+              <w:right w:type="dxa" w:w="120"/>
+            </w:tcMar>
+          </w:tcPr>
+          <w:p>
+            <w:r>
+              <w:rPr>
+                <w:rFonts w:ascii="Arial" w:cs="Arial" w:eastAsia="Arial" w:hAnsi="Arial"/>
+                <w:sz w:val="20"/>
+                <w:szCs w:val="20"/>
+              </w:rPr>
+              <w:t xml:space="preserve">Disease–Gene</w:t>
+            </w:r>
+          </w:p>
+        </w:tc>
+      </w:tr>
+      <w:tr>
+        <w:tc>
+          <w:tcPr>
+            <w:tcW w:type="dxa" w:w="1800"/>
+            <w:tcBorders>
+              <w:top w:val="single" w:color="CCCCCC" w:sz="1"/>
+              <w:left w:val="single" w:color="CCCCCC" w:sz="1"/>
+              <w:bottom w:val="single" w:color="CCCCCC" w:sz="1"/>
+              <w:right w:val="single" w:color="CCCCCC" w:sz="1"/>
+            </w:tcBorders>
+            <w:shd w:fill="F2F6FA" w:val="clear"/>
+            <w:tcMar>
+              <w:top w:type="dxa" w:w="80"/>
+              <w:left w:type="dxa" w:w="120"/>
+              <w:bottom w:type="dxa" w:w="80"/>
+              <w:right w:type="dxa" w:w="120"/>
+            </w:tcMar>
+          </w:tcPr>
+          <w:p>
+            <w:r>
+              <w:rPr>
+                <w:rFonts w:ascii="Consolas" w:cs="Consolas" w:eastAsia="Consolas" w:hAnsi="Consolas"/>
+                <w:sz w:val="20"/>
+                <w:szCs w:val="20"/>
+              </w:rPr>
+              <w:t xml:space="preserve">ANA-GEN</w:t>
+            </w:r>
+          </w:p>
+        </w:tc>
+        <w:tc>
+          <w:tcPr>
+            <w:tcW w:type="dxa" w:w="1800"/>
+            <w:tcBorders>
+              <w:top w:val="single" w:color="CCCCCC" w:sz="1"/>
+              <w:left w:val="single" w:color="CCCCCC" w:sz="1"/>
+              <w:bottom w:val="single" w:color="CCCCCC" w:sz="1"/>
+              <w:right w:val="single" w:color="CCCCCC" w:sz="1"/>
+            </w:tcBorders>
+            <w:shd w:fill="F2F6FA" w:val="clear"/>
+            <w:tcMar>
+              <w:top w:type="dxa" w:w="80"/>
+              <w:left w:type="dxa" w:w="120"/>
+              <w:bottom w:type="dxa" w:w="80"/>
+              <w:right w:type="dxa" w:w="120"/>
+            </w:tcMar>
+          </w:tcPr>
+          <w:p>
+            <w:r>
+              <w:rPr>
+                <w:rFonts w:ascii="Arial" w:cs="Arial" w:eastAsia="Arial" w:hAnsi="Arial"/>
+                <w:sz w:val="20"/>
+                <w:szCs w:val="20"/>
+              </w:rPr>
+              <w:t xml:space="preserve">8,787,955</w:t>
+            </w:r>
+          </w:p>
+        </w:tc>
+        <w:tc>
+          <w:tcPr>
+            <w:tcW w:type="dxa" w:w="5760"/>
+            <w:tcBorders>
+              <w:top w:val="single" w:color="CCCCCC" w:sz="1"/>
+              <w:left w:val="single" w:color="CCCCCC" w:sz="1"/>
+              <w:bottom w:val="single" w:color="CCCCCC" w:sz="1"/>
+              <w:right w:val="single" w:color="CCCCCC" w:sz="1"/>
+            </w:tcBorders>
+            <w:shd w:fill="F2F6FA" w:val="clear"/>
+            <w:tcMar>
+              <w:top w:type="dxa" w:w="80"/>
+              <w:left w:type="dxa" w:w="120"/>
+              <w:bottom w:type="dxa" w:w="80"/>
+              <w:right w:type="dxa" w:w="120"/>
+            </w:tcMar>
+          </w:tcPr>
+          <w:p>
+            <w:r>
+              <w:rPr>
+                <w:rFonts w:ascii="Arial" w:cs="Arial" w:eastAsia="Arial" w:hAnsi="Arial"/>
+                <w:sz w:val="20"/>
+                <w:szCs w:val="20"/>
+              </w:rPr>
+              <w:t xml:space="preserve">Anatomy–Gene</w:t>
+            </w:r>
+          </w:p>
+        </w:tc>
+      </w:tr>
+      <w:tr>
+        <w:tc>
+          <w:tcPr>
+            <w:tcW w:type="dxa" w:w="1800"/>
+            <w:tcBorders>
+              <w:top w:val="single" w:color="CCCCCC" w:sz="1"/>
+              <w:left w:val="single" w:color="CCCCCC" w:sz="1"/>
+              <w:bottom w:val="single" w:color="CCCCCC" w:sz="1"/>
+              <w:right w:val="single" w:color="CCCCCC" w:sz="1"/>
+            </w:tcBorders>
+            <w:shd w:fill="FFFFFF" w:val="clear"/>
+            <w:tcMar>
+              <w:top w:type="dxa" w:w="80"/>
+              <w:left w:type="dxa" w:w="120"/>
+              <w:bottom w:type="dxa" w:w="80"/>
+              <w:right w:type="dxa" w:w="120"/>
+            </w:tcMar>
+          </w:tcPr>
+          <w:p>
+            <w:r>
+              <w:rPr>
+                <w:rFonts w:ascii="Consolas" w:cs="Consolas" w:eastAsia="Consolas" w:hAnsi="Consolas"/>
+                <w:sz w:val="20"/>
+                <w:szCs w:val="20"/>
+              </w:rPr>
+              <w:t xml:space="preserve">DRG-DRG</w:t>
+            </w:r>
+          </w:p>
+        </w:tc>
+        <w:tc>
+          <w:tcPr>
+            <w:tcW w:type="dxa" w:w="1800"/>
+            <w:tcBorders>
+              <w:top w:val="single" w:color="CCCCCC" w:sz="1"/>
+              <w:left w:val="single" w:color="CCCCCC" w:sz="1"/>
+              <w:bottom w:val="single" w:color="CCCCCC" w:sz="1"/>
+              <w:right w:val="single" w:color="CCCCCC" w:sz="1"/>
+            </w:tcBorders>
+            <w:shd w:fill="FFFFFF" w:val="clear"/>
+            <w:tcMar>
+              <w:top w:type="dxa" w:w="80"/>
+              <w:left w:type="dxa" w:w="120"/>
+              <w:bottom w:type="dxa" w:w="80"/>
+              <w:right w:type="dxa" w:w="120"/>
+            </w:tcMar>
+          </w:tcPr>
+          <w:p>
+            <w:r>
+              <w:rPr>
+                <w:rFonts w:ascii="Arial" w:cs="Arial" w:eastAsia="Arial" w:hAnsi="Arial"/>
+                <w:sz w:val="20"/>
+                <w:szCs w:val="20"/>
+              </w:rPr>
+              <w:t xml:space="preserve">1,345,376</w:t>
+            </w:r>
+          </w:p>
+        </w:tc>
+        <w:tc>
+          <w:tcPr>
+            <w:tcW w:type="dxa" w:w="5760"/>
+            <w:tcBorders>
+              <w:top w:val="single" w:color="CCCCCC" w:sz="1"/>
+              <w:left w:val="single" w:color="CCCCCC" w:sz="1"/>
+              <w:bottom w:val="single" w:color="CCCCCC" w:sz="1"/>
+              <w:right w:val="single" w:color="CCCCCC" w:sz="1"/>
+            </w:tcBorders>
+            <w:shd w:fill="FFFFFF" w:val="clear"/>
+            <w:tcMar>
+              <w:top w:type="dxa" w:w="80"/>
+              <w:left w:type="dxa" w:w="120"/>
+              <w:bottom w:type="dxa" w:w="80"/>
+              <w:right w:type="dxa" w:w="120"/>
+            </w:tcMar>
+          </w:tcPr>
+          <w:p>
+            <w:r>
+              <w:rPr>
+                <w:rFonts w:ascii="Arial" w:cs="Arial" w:eastAsia="Arial" w:hAnsi="Arial"/>
+                <w:sz w:val="20"/>
+                <w:szCs w:val="20"/>
+              </w:rPr>
+              <w:t xml:space="preserve">Drug–Drug</w:t>
+            </w:r>
+          </w:p>
+        </w:tc>
+      </w:tr>
+      <w:tr>
+        <w:tc>
+          <w:tcPr>
+            <w:tcW w:type="dxa" w:w="1800"/>
+            <w:tcBorders>
+              <w:top w:val="single" w:color="CCCCCC" w:sz="1"/>
+              <w:left w:val="single" w:color="CCCCCC" w:sz="1"/>
+              <w:bottom w:val="single" w:color="CCCCCC" w:sz="1"/>
+              <w:right w:val="single" w:color="CCCCCC" w:sz="1"/>
+            </w:tcBorders>
+            <w:shd w:fill="F2F6FA" w:val="clear"/>
+            <w:tcMar>
+              <w:top w:type="dxa" w:w="80"/>
+              <w:left w:type="dxa" w:w="120"/>
+              <w:bottom w:type="dxa" w:w="80"/>
+              <w:right w:type="dxa" w:w="120"/>
+            </w:tcMar>
+          </w:tcPr>
+          <w:p>
+            <w:r>
+              <w:rPr>
+                <w:rFonts w:ascii="Consolas" w:cs="Consolas" w:eastAsia="Consolas" w:hAnsi="Consolas"/>
+                <w:sz w:val="20"/>
+                <w:szCs w:val="20"/>
+              </w:rPr>
+              <w:t xml:space="preserve">PHE-GEN</w:t>
+            </w:r>
+          </w:p>
+        </w:tc>
+        <w:tc>
+          <w:tcPr>
+            <w:tcW w:type="dxa" w:w="1800"/>
+            <w:tcBorders>
+              <w:top w:val="single" w:color="CCCCCC" w:sz="1"/>
+              <w:left w:val="single" w:color="CCCCCC" w:sz="1"/>
+              <w:bottom w:val="single" w:color="CCCCCC" w:sz="1"/>
+              <w:right w:val="single" w:color="CCCCCC" w:sz="1"/>
+            </w:tcBorders>
+            <w:shd w:fill="F2F6FA" w:val="clear"/>
+            <w:tcMar>
+              <w:top w:type="dxa" w:w="80"/>
+              <w:left w:type="dxa" w:w="120"/>
+              <w:bottom w:type="dxa" w:w="80"/>
+              <w:right w:type="dxa" w:w="120"/>
+            </w:tcMar>
+          </w:tcPr>
+          <w:p>
+            <w:r>
+              <w:rPr>
+                <w:rFonts w:ascii="Arial" w:cs="Arial" w:eastAsia="Arial" w:hAnsi="Arial"/>
+                <w:sz w:val="20"/>
+                <w:szCs w:val="20"/>
+              </w:rPr>
+              <w:t xml:space="preserve">793,279</w:t>
+            </w:r>
+          </w:p>
+        </w:tc>
+        <w:tc>
+          <w:tcPr>
+            <w:tcW w:type="dxa" w:w="5760"/>
+            <w:tcBorders>
+              <w:top w:val="single" w:color="CCCCCC" w:sz="1"/>
+              <w:left w:val="single" w:color="CCCCCC" w:sz="1"/>
+              <w:bottom w:val="single" w:color="CCCCCC" w:sz="1"/>
+              <w:right w:val="single" w:color="CCCCCC" w:sz="1"/>
+            </w:tcBorders>
+            <w:shd w:fill="F2F6FA" w:val="clear"/>
+            <w:tcMar>
+              <w:top w:type="dxa" w:w="80"/>
+              <w:left w:type="dxa" w:w="120"/>
+              <w:bottom w:type="dxa" w:w="80"/>
+              <w:right w:type="dxa" w:w="120"/>
+            </w:tcMar>
+          </w:tcPr>
+          <w:p>
+            <w:r>
+              <w:rPr>
+                <w:rFonts w:ascii="Arial" w:cs="Arial" w:eastAsia="Arial" w:hAnsi="Arial"/>
+                <w:sz w:val="20"/>
+                <w:szCs w:val="20"/>
+              </w:rPr>
+              <w:t xml:space="preserve">Phenotype–Gene</w:t>
+            </w:r>
+          </w:p>
+        </w:tc>
+      </w:tr>
+      <w:tr>
+        <w:tc>
+          <w:tcPr>
+            <w:tcW w:type="dxa" w:w="1800"/>
+            <w:tcBorders>
+              <w:top w:val="single" w:color="CCCCCC" w:sz="1"/>
+              <w:left w:val="single" w:color="CCCCCC" w:sz="1"/>
+              <w:bottom w:val="single" w:color="CCCCCC" w:sz="1"/>
+              <w:right w:val="single" w:color="CCCCCC" w:sz="1"/>
+            </w:tcBorders>
+            <w:shd w:fill="FFFFFF" w:val="clear"/>
+            <w:tcMar>
+              <w:top w:type="dxa" w:w="80"/>
+              <w:left w:type="dxa" w:w="120"/>
+              <w:bottom w:type="dxa" w:w="80"/>
+              <w:right w:type="dxa" w:w="120"/>
+            </w:tcMar>
+          </w:tcPr>
+          <w:p>
+            <w:r>
+              <w:rPr>
+                <w:rFonts w:ascii="Consolas" w:cs="Consolas" w:eastAsia="Consolas" w:hAnsi="Consolas"/>
+                <w:sz w:val="20"/>
+                <w:szCs w:val="20"/>
+              </w:rPr>
+              <w:t xml:space="preserve">GEN-GEN</w:t>
+            </w:r>
+          </w:p>
+        </w:tc>
+        <w:tc>
+          <w:tcPr>
+            <w:tcW w:type="dxa" w:w="1800"/>
+            <w:tcBorders>
+              <w:top w:val="single" w:color="CCCCCC" w:sz="1"/>
+              <w:left w:val="single" w:color="CCCCCC" w:sz="1"/>
+              <w:bottom w:val="single" w:color="CCCCCC" w:sz="1"/>
+              <w:right w:val="single" w:color="CCCCCC" w:sz="1"/>
+            </w:tcBorders>
+            <w:shd w:fill="FFFFFF" w:val="clear"/>
+            <w:tcMar>
+              <w:top w:type="dxa" w:w="80"/>
+              <w:left w:type="dxa" w:w="120"/>
+              <w:bottom w:type="dxa" w:w="80"/>
+              <w:right w:type="dxa" w:w="120"/>
+            </w:tcMar>
+          </w:tcPr>
+          <w:p>
+            <w:r>
+              <w:rPr>
+                <w:rFonts w:ascii="Arial" w:cs="Arial" w:eastAsia="Arial" w:hAnsi="Arial"/>
+                <w:sz w:val="20"/>
+                <w:szCs w:val="20"/>
+              </w:rPr>
+              <w:t xml:space="preserve">327,924</w:t>
+            </w:r>
+          </w:p>
+        </w:tc>
+        <w:tc>
+          <w:tcPr>
+            <w:tcW w:type="dxa" w:w="5760"/>
+            <w:tcBorders>
+              <w:top w:val="single" w:color="CCCCCC" w:sz="1"/>
+              <w:left w:val="single" w:color="CCCCCC" w:sz="1"/>
+              <w:bottom w:val="single" w:color="CCCCCC" w:sz="1"/>
+              <w:right w:val="single" w:color="CCCCCC" w:sz="1"/>
+            </w:tcBorders>
+            <w:shd w:fill="FFFFFF" w:val="clear"/>
+            <w:tcMar>
+              <w:top w:type="dxa" w:w="80"/>
+              <w:left w:type="dxa" w:w="120"/>
+              <w:bottom w:type="dxa" w:w="80"/>
+              <w:right w:type="dxa" w:w="120"/>
+            </w:tcMar>
+          </w:tcPr>
+          <w:p>
+            <w:r>
+              <w:rPr>
+                <w:rFonts w:ascii="Arial" w:cs="Arial" w:eastAsia="Arial" w:hAnsi="Arial"/>
+                <w:sz w:val="20"/>
+                <w:szCs w:val="20"/>
+              </w:rPr>
+              <w:t xml:space="preserve">Gene–Gene</w:t>
+            </w:r>
+          </w:p>
+        </w:tc>
+      </w:tr>
+      <w:tr>
+        <w:tc>
+          <w:tcPr>
+            <w:tcW w:type="dxa" w:w="1800"/>
+            <w:tcBorders>
+              <w:top w:val="single" w:color="CCCCCC" w:sz="1"/>
+              <w:left w:val="single" w:color="CCCCCC" w:sz="1"/>
+              <w:bottom w:val="single" w:color="CCCCCC" w:sz="1"/>
+              <w:right w:val="single" w:color="CCCCCC" w:sz="1"/>
+            </w:tcBorders>
+            <w:shd w:fill="F2F6FA" w:val="clear"/>
+            <w:tcMar>
+              <w:top w:type="dxa" w:w="80"/>
+              <w:left w:type="dxa" w:w="120"/>
+              <w:bottom w:type="dxa" w:w="80"/>
+              <w:right w:type="dxa" w:w="120"/>
+            </w:tcMar>
+          </w:tcPr>
+          <w:p>
+            <w:r>
+              <w:rPr>
+                <w:rFonts w:ascii="Consolas" w:cs="Consolas" w:eastAsia="Consolas" w:hAnsi="Consolas"/>
+                <w:sz w:val="20"/>
+                <w:szCs w:val="20"/>
+              </w:rPr>
+              <w:t xml:space="preserve">BPO-GEN</w:t>
+            </w:r>
+          </w:p>
+        </w:tc>
+        <w:tc>
+          <w:tcPr>
+            <w:tcW w:type="dxa" w:w="1800"/>
+            <w:tcBorders>
+              <w:top w:val="single" w:color="CCCCCC" w:sz="1"/>
+              <w:left w:val="single" w:color="CCCCCC" w:sz="1"/>
+              <w:bottom w:val="single" w:color="CCCCCC" w:sz="1"/>
+              <w:right w:val="single" w:color="CCCCCC" w:sz="1"/>
+            </w:tcBorders>
+            <w:shd w:fill="F2F6FA" w:val="clear"/>
+            <w:tcMar>
+              <w:top w:type="dxa" w:w="80"/>
+              <w:left w:type="dxa" w:w="120"/>
+              <w:bottom w:type="dxa" w:w="80"/>
+              <w:right w:type="dxa" w:w="120"/>
+            </w:tcMar>
+          </w:tcPr>
+          <w:p>
+            <w:r>
+              <w:rPr>
+                <w:rFonts w:ascii="Arial" w:cs="Arial" w:eastAsia="Arial" w:hAnsi="Arial"/>
+                <w:sz w:val="20"/>
+                <w:szCs w:val="20"/>
+              </w:rPr>
+              <w:t xml:space="preserve">158,410</w:t>
+            </w:r>
+          </w:p>
+        </w:tc>
+        <w:tc>
+          <w:tcPr>
+            <w:tcW w:type="dxa" w:w="5760"/>
+            <w:tcBorders>
+              <w:top w:val="single" w:color="CCCCCC" w:sz="1"/>
+              <w:left w:val="single" w:color="CCCCCC" w:sz="1"/>
+              <w:bottom w:val="single" w:color="CCCCCC" w:sz="1"/>
+              <w:right w:val="single" w:color="CCCCCC" w:sz="1"/>
+            </w:tcBorders>
+            <w:shd w:fill="F2F6FA" w:val="clear"/>
+            <w:tcMar>
+              <w:top w:type="dxa" w:w="80"/>
+              <w:left w:type="dxa" w:w="120"/>
+              <w:bottom w:type="dxa" w:w="80"/>
+              <w:right w:type="dxa" w:w="120"/>
+            </w:tcMar>
+          </w:tcPr>
+          <w:p>
+            <w:r>
+              <w:rPr>
+                <w:rFonts w:ascii="Arial" w:cs="Arial" w:eastAsia="Arial" w:hAnsi="Arial"/>
+                <w:sz w:val="20"/>
+                <w:szCs w:val="20"/>
+              </w:rPr>
+              <w:t xml:space="preserve">Biological Process–Gene</w:t>
+            </w:r>
+          </w:p>
+        </w:tc>
+      </w:tr>
+      <w:tr>
+        <w:tc>
+          <w:tcPr>
+            <w:tcW w:type="dxa" w:w="1800"/>
+            <w:tcBorders>
+              <w:top w:val="single" w:color="CCCCCC" w:sz="1"/>
+              <w:left w:val="single" w:color="CCCCCC" w:sz="1"/>
+              <w:bottom w:val="single" w:color="CCCCCC" w:sz="1"/>
+              <w:right w:val="single" w:color="CCCCCC" w:sz="1"/>
+            </w:tcBorders>
+            <w:shd w:fill="FFFFFF" w:val="clear"/>
+            <w:tcMar>
+              <w:top w:type="dxa" w:w="80"/>
+              <w:left w:type="dxa" w:w="120"/>
+              <w:bottom w:type="dxa" w:w="80"/>
+              <w:right w:type="dxa" w:w="120"/>
+            </w:tcMar>
+          </w:tcPr>
+          <w:p>
+            <w:r>
+              <w:rPr>
+                <w:rFonts w:ascii="Consolas" w:cs="Consolas" w:eastAsia="Consolas" w:hAnsi="Consolas"/>
+                <w:sz w:val="20"/>
+                <w:szCs w:val="20"/>
+              </w:rPr>
+              <w:t xml:space="preserve">DIS-PHE</w:t>
+            </w:r>
+          </w:p>
+        </w:tc>
+        <w:tc>
+          <w:tcPr>
+            <w:tcW w:type="dxa" w:w="1800"/>
+            <w:tcBorders>
+              <w:top w:val="single" w:color="CCCCCC" w:sz="1"/>
+              <w:left w:val="single" w:color="CCCCCC" w:sz="1"/>
+              <w:bottom w:val="single" w:color="CCCCCC" w:sz="1"/>
+              <w:right w:val="single" w:color="CCCCCC" w:sz="1"/>
+            </w:tcBorders>
+            <w:shd w:fill="FFFFFF" w:val="clear"/>
+            <w:tcMar>
+              <w:top w:type="dxa" w:w="80"/>
+              <w:left w:type="dxa" w:w="120"/>
+              <w:bottom w:type="dxa" w:w="80"/>
+              <w:right w:type="dxa" w:w="120"/>
+            </w:tcMar>
+          </w:tcPr>
+          <w:p>
+            <w:r>
+              <w:rPr>
+                <w:rFonts w:ascii="Arial" w:cs="Arial" w:eastAsia="Arial" w:hAnsi="Arial"/>
+                <w:sz w:val="20"/>
+                <w:szCs w:val="20"/>
+              </w:rPr>
+              <w:t xml:space="preserve">157,144</w:t>
+            </w:r>
+          </w:p>
+        </w:tc>
+        <w:tc>
+          <w:tcPr>
+            <w:tcW w:type="dxa" w:w="5760"/>
+            <w:tcBorders>
+              <w:top w:val="single" w:color="CCCCCC" w:sz="1"/>
+              <w:left w:val="single" w:color="CCCCCC" w:sz="1"/>
+              <w:bottom w:val="single" w:color="CCCCCC" w:sz="1"/>
+              <w:right w:val="single" w:color="CCCCCC" w:sz="1"/>
+            </w:tcBorders>
+            <w:shd w:fill="FFFFFF" w:val="clear"/>
+            <w:tcMar>
+              <w:top w:type="dxa" w:w="80"/>
+              <w:left w:type="dxa" w:w="120"/>
+              <w:bottom w:type="dxa" w:w="80"/>
+              <w:right w:type="dxa" w:w="120"/>
+            </w:tcMar>
+          </w:tcPr>
+          <w:p>
+            <w:r>
+              <w:rPr>
+                <w:rFonts w:ascii="Arial" w:cs="Arial" w:eastAsia="Arial" w:hAnsi="Arial"/>
+                <w:sz w:val="20"/>
+                <w:szCs w:val="20"/>
+              </w:rPr>
+              <w:t xml:space="preserve">Disease–Phenotype</w:t>
+            </w:r>
+          </w:p>
+        </w:tc>
+      </w:tr>
+      <w:tr>
+        <w:tc>
+          <w:tcPr>
+            <w:tcW w:type="dxa" w:w="1800"/>
+            <w:tcBorders>
+              <w:top w:val="single" w:color="CCCCCC" w:sz="1"/>
+              <w:left w:val="single" w:color="CCCCCC" w:sz="1"/>
+              <w:bottom w:val="single" w:color="CCCCCC" w:sz="1"/>
+              <w:right w:val="single" w:color="CCCCCC" w:sz="1"/>
+            </w:tcBorders>
+            <w:shd w:fill="F2F6FA" w:val="clear"/>
+            <w:tcMar>
+              <w:top w:type="dxa" w:w="80"/>
+              <w:left w:type="dxa" w:w="120"/>
+              <w:bottom w:type="dxa" w:w="80"/>
+              <w:right w:type="dxa" w:w="120"/>
+            </w:tcMar>
+          </w:tcPr>
+          <w:p>
+            <w:r>
+              <w:rPr>
+                <w:rFonts w:ascii="Consolas" w:cs="Consolas" w:eastAsia="Consolas" w:hAnsi="Consolas"/>
+                <w:sz w:val="20"/>
+                <w:szCs w:val="20"/>
+              </w:rPr>
+              <w:t xml:space="preserve">CCO-GEN</w:t>
+            </w:r>
+          </w:p>
+        </w:tc>
+        <w:tc>
+          <w:tcPr>
+            <w:tcW w:type="dxa" w:w="1800"/>
+            <w:tcBorders>
+              <w:top w:val="single" w:color="CCCCCC" w:sz="1"/>
+              <w:left w:val="single" w:color="CCCCCC" w:sz="1"/>
+              <w:bottom w:val="single" w:color="CCCCCC" w:sz="1"/>
+              <w:right w:val="single" w:color="CCCCCC" w:sz="1"/>
+            </w:tcBorders>
+            <w:shd w:fill="F2F6FA" w:val="clear"/>
+            <w:tcMar>
+              <w:top w:type="dxa" w:w="80"/>
+              <w:left w:type="dxa" w:w="120"/>
+              <w:bottom w:type="dxa" w:w="80"/>
+              <w:right w:type="dxa" w:w="120"/>
+            </w:tcMar>
+          </w:tcPr>
+          <w:p>
+            <w:r>
+              <w:rPr>
+                <w:rFonts w:ascii="Arial" w:cs="Arial" w:eastAsia="Arial" w:hAnsi="Arial"/>
+                <w:sz w:val="20"/>
+                <w:szCs w:val="20"/>
+              </w:rPr>
+              <w:t xml:space="preserve">105,309</w:t>
+            </w:r>
+          </w:p>
+        </w:tc>
+        <w:tc>
+          <w:tcPr>
+            <w:tcW w:type="dxa" w:w="5760"/>
+            <w:tcBorders>
+              <w:top w:val="single" w:color="CCCCCC" w:sz="1"/>
+              <w:left w:val="single" w:color="CCCCCC" w:sz="1"/>
+              <w:bottom w:val="single" w:color="CCCCCC" w:sz="1"/>
+              <w:right w:val="single" w:color="CCCCCC" w:sz="1"/>
+            </w:tcBorders>
+            <w:shd w:fill="F2F6FA" w:val="clear"/>
+            <w:tcMar>
+              <w:top w:type="dxa" w:w="80"/>
+              <w:left w:type="dxa" w:w="120"/>
+              <w:bottom w:type="dxa" w:w="80"/>
+              <w:right w:type="dxa" w:w="120"/>
+            </w:tcMar>
+          </w:tcPr>
+          <w:p>
+            <w:r>
+              <w:rPr>
+                <w:rFonts w:ascii="Arial" w:cs="Arial" w:eastAsia="Arial" w:hAnsi="Arial"/>
+                <w:sz w:val="20"/>
+                <w:szCs w:val="20"/>
+              </w:rPr>
+              <w:t xml:space="preserve">Cellular Component–Gene</w:t>
+            </w:r>
+          </w:p>
+        </w:tc>
+      </w:tr>
+      <w:tr>
+        <w:tc>
+          <w:tcPr>
+            <w:tcW w:type="dxa" w:w="1800"/>
+            <w:tcBorders>
+              <w:top w:val="single" w:color="CCCCCC" w:sz="1"/>
+              <w:left w:val="single" w:color="CCCCCC" w:sz="1"/>
+              <w:bottom w:val="single" w:color="CCCCCC" w:sz="1"/>
+              <w:right w:val="single" w:color="CCCCCC" w:sz="1"/>
+            </w:tcBorders>
+            <w:shd w:fill="FFFFFF" w:val="clear"/>
+            <w:tcMar>
+              <w:top w:type="dxa" w:w="80"/>
+              <w:left w:type="dxa" w:w="120"/>
+              <w:bottom w:type="dxa" w:w="80"/>
+              <w:right w:type="dxa" w:w="120"/>
+            </w:tcMar>
+          </w:tcPr>
+          <w:p>
+            <w:r>
+              <w:rPr>
+                <w:rFonts w:ascii="Consolas" w:cs="Consolas" w:eastAsia="Consolas" w:hAnsi="Consolas"/>
+                <w:sz w:val="20"/>
+                <w:szCs w:val="20"/>
+              </w:rPr>
+              <w:t xml:space="preserve">MFN-GEN</w:t>
+            </w:r>
+          </w:p>
+        </w:tc>
+        <w:tc>
+          <w:tcPr>
+            <w:tcW w:type="dxa" w:w="1800"/>
+            <w:tcBorders>
+              <w:top w:val="single" w:color="CCCCCC" w:sz="1"/>
+              <w:left w:val="single" w:color="CCCCCC" w:sz="1"/>
+              <w:bottom w:val="single" w:color="CCCCCC" w:sz="1"/>
+              <w:right w:val="single" w:color="CCCCCC" w:sz="1"/>
+            </w:tcBorders>
+            <w:shd w:fill="FFFFFF" w:val="clear"/>
+            <w:tcMar>
+              <w:top w:type="dxa" w:w="80"/>
+              <w:left w:type="dxa" w:w="120"/>
+              <w:bottom w:type="dxa" w:w="80"/>
+              <w:right w:type="dxa" w:w="120"/>
+            </w:tcMar>
+          </w:tcPr>
+          <w:p>
+            <w:r>
+              <w:rPr>
+                <w:rFonts w:ascii="Arial" w:cs="Arial" w:eastAsia="Arial" w:hAnsi="Arial"/>
+                <w:sz w:val="20"/>
+                <w:szCs w:val="20"/>
+              </w:rPr>
+              <w:t xml:space="preserve">90,933</w:t>
+            </w:r>
+          </w:p>
+        </w:tc>
+        <w:tc>
+          <w:tcPr>
+            <w:tcW w:type="dxa" w:w="5760"/>
+            <w:tcBorders>
+              <w:top w:val="single" w:color="CCCCCC" w:sz="1"/>
+              <w:left w:val="single" w:color="CCCCCC" w:sz="1"/>
+              <w:bottom w:val="single" w:color="CCCCCC" w:sz="1"/>
+              <w:right w:val="single" w:color="CCCCCC" w:sz="1"/>
+            </w:tcBorders>
+            <w:shd w:fill="FFFFFF" w:val="clear"/>
+            <w:tcMar>
+              <w:top w:type="dxa" w:w="80"/>
+              <w:left w:type="dxa" w:w="120"/>
+              <w:bottom w:type="dxa" w:w="80"/>
+              <w:right w:type="dxa" w:w="120"/>
+            </w:tcMar>
+          </w:tcPr>
+          <w:p>
+            <w:r>
+              <w:rPr>
+                <w:rFonts w:ascii="Arial" w:cs="Arial" w:eastAsia="Arial" w:hAnsi="Arial"/>
+                <w:sz w:val="20"/>
+                <w:szCs w:val="20"/>
+              </w:rPr>
+              <w:t xml:space="preserve">Molecular Function–Gene</w:t>
+            </w:r>
+          </w:p>
+        </w:tc>
+      </w:tr>
+      <w:tr>
+        <w:tc>
+          <w:tcPr>
+            <w:tcW w:type="dxa" w:w="1800"/>
+            <w:tcBorders>
+              <w:top w:val="single" w:color="CCCCCC" w:sz="1"/>
+              <w:left w:val="single" w:color="CCCCCC" w:sz="1"/>
+              <w:bottom w:val="single" w:color="CCCCCC" w:sz="1"/>
+              <w:right w:val="single" w:color="CCCCCC" w:sz="1"/>
+            </w:tcBorders>
+            <w:shd w:fill="F2F6FA" w:val="clear"/>
+            <w:tcMar>
+              <w:top w:type="dxa" w:w="80"/>
+              <w:left w:type="dxa" w:w="120"/>
+              <w:bottom w:type="dxa" w:w="80"/>
+              <w:right w:type="dxa" w:w="120"/>
+            </w:tcMar>
+          </w:tcPr>
+          <w:p>
+            <w:r>
+              <w:rPr>
+                <w:rFonts w:ascii="Consolas" w:cs="Consolas" w:eastAsia="Consolas" w:hAnsi="Consolas"/>
+                <w:sz w:val="20"/>
+                <w:szCs w:val="20"/>
+              </w:rPr>
+              <w:t xml:space="preserve">DRG-DIS</w:t>
+            </w:r>
+          </w:p>
+        </w:tc>
+        <w:tc>
+          <w:tcPr>
+            <w:tcW w:type="dxa" w:w="1800"/>
+            <w:tcBorders>
+              <w:top w:val="single" w:color="CCCCCC" w:sz="1"/>
+              <w:left w:val="single" w:color="CCCCCC" w:sz="1"/>
+              <w:bottom w:val="single" w:color="CCCCCC" w:sz="1"/>
+              <w:right w:val="single" w:color="CCCCCC" w:sz="1"/>
+            </w:tcBorders>
+            <w:shd w:fill="F2F6FA" w:val="clear"/>
+            <w:tcMar>
+              <w:top w:type="dxa" w:w="80"/>
+              <w:left w:type="dxa" w:w="120"/>
+              <w:bottom w:type="dxa" w:w="80"/>
+              <w:right w:type="dxa" w:w="120"/>
+            </w:tcMar>
+          </w:tcPr>
+          <w:p>
+            <w:r>
+              <w:rPr>
+                <w:rFonts w:ascii="Arial" w:cs="Arial" w:eastAsia="Arial" w:hAnsi="Arial"/>
+                <w:sz w:val="20"/>
+                <w:szCs w:val="20"/>
+              </w:rPr>
+              <w:t xml:space="preserve">70,380</w:t>
+            </w:r>
+          </w:p>
+        </w:tc>
+        <w:tc>
+          <w:tcPr>
+            <w:tcW w:type="dxa" w:w="5760"/>
+            <w:tcBorders>
+              <w:top w:val="single" w:color="CCCCCC" w:sz="1"/>
+              <w:left w:val="single" w:color="CCCCCC" w:sz="1"/>
+              <w:bottom w:val="single" w:color="CCCCCC" w:sz="1"/>
+              <w:right w:val="single" w:color="CCCCCC" w:sz="1"/>
+            </w:tcBorders>
+            <w:shd w:fill="F2F6FA" w:val="clear"/>
+            <w:tcMar>
+              <w:top w:type="dxa" w:w="80"/>
+              <w:left w:type="dxa" w:w="120"/>
+              <w:bottom w:type="dxa" w:w="80"/>
+              <w:right w:type="dxa" w:w="120"/>
+            </w:tcMar>
+          </w:tcPr>
+          <w:p>
+            <w:r>
+              <w:rPr>
+                <w:rFonts w:ascii="Arial" w:cs="Arial" w:eastAsia="Arial" w:hAnsi="Arial"/>
+                <w:sz w:val="20"/>
+                <w:szCs w:val="20"/>
+              </w:rPr>
+              <w:t xml:space="preserve">Drug–Disease</w:t>
+            </w:r>
+          </w:p>
+        </w:tc>
+      </w:tr>
+      <w:tr>
+        <w:tc>
+          <w:tcPr>
+            <w:tcW w:type="dxa" w:w="1800"/>
+            <w:tcBorders>
+              <w:top w:val="single" w:color="CCCCCC" w:sz="1"/>
+              <w:left w:val="single" w:color="CCCCCC" w:sz="1"/>
+              <w:bottom w:val="single" w:color="CCCCCC" w:sz="1"/>
+              <w:right w:val="single" w:color="CCCCCC" w:sz="1"/>
+            </w:tcBorders>
+            <w:shd w:fill="FFFFFF" w:val="clear"/>
+            <w:tcMar>
+              <w:top w:type="dxa" w:w="80"/>
+              <w:left w:type="dxa" w:w="120"/>
+              <w:bottom w:type="dxa" w:w="80"/>
+              <w:right w:type="dxa" w:w="120"/>
+            </w:tcMar>
+          </w:tcPr>
+          <w:p>
+            <w:r>
+              <w:rPr>
+                <w:rFonts w:ascii="Consolas" w:cs="Consolas" w:eastAsia="Consolas" w:hAnsi="Consolas"/>
+                <w:sz w:val="20"/>
+                <w:szCs w:val="20"/>
+              </w:rPr>
+              <w:t xml:space="preserve">PWY-GEN</w:t>
+            </w:r>
+          </w:p>
+        </w:tc>
+        <w:tc>
+          <w:tcPr>
+            <w:tcW w:type="dxa" w:w="1800"/>
+            <w:tcBorders>
+              <w:top w:val="single" w:color="CCCCCC" w:sz="1"/>
+              <w:left w:val="single" w:color="CCCCCC" w:sz="1"/>
+              <w:bottom w:val="single" w:color="CCCCCC" w:sz="1"/>
+              <w:right w:val="single" w:color="CCCCCC" w:sz="1"/>
+            </w:tcBorders>
+            <w:shd w:fill="FFFFFF" w:val="clear"/>
+            <w:tcMar>
+              <w:top w:type="dxa" w:w="80"/>
+              <w:left w:type="dxa" w:w="120"/>
+              <w:bottom w:type="dxa" w:w="80"/>
+              <w:right w:type="dxa" w:w="120"/>
+            </w:tcMar>
+          </w:tcPr>
+          <w:p>
+            <w:r>
+              <w:rPr>
+                <w:rFonts w:ascii="Arial" w:cs="Arial" w:eastAsia="Arial" w:hAnsi="Arial"/>
+                <w:sz w:val="20"/>
+                <w:szCs w:val="20"/>
+              </w:rPr>
+              <w:t xml:space="preserve">46,977</w:t>
+            </w:r>
+          </w:p>
+        </w:tc>
+        <w:tc>
+          <w:tcPr>
+            <w:tcW w:type="dxa" w:w="5760"/>
+            <w:tcBorders>
+              <w:top w:val="single" w:color="CCCCCC" w:sz="1"/>
+              <w:left w:val="single" w:color="CCCCCC" w:sz="1"/>
+              <w:bottom w:val="single" w:color="CCCCCC" w:sz="1"/>
+              <w:right w:val="single" w:color="CCCCCC" w:sz="1"/>
+            </w:tcBorders>
+            <w:shd w:fill="FFFFFF" w:val="clear"/>
+            <w:tcMar>
+              <w:top w:type="dxa" w:w="80"/>
+              <w:left w:type="dxa" w:w="120"/>
+              <w:bottom w:type="dxa" w:w="80"/>
+              <w:right w:type="dxa" w:w="120"/>
+            </w:tcMar>
+          </w:tcPr>
+          <w:p>
+            <w:r>
+              <w:rPr>
+                <w:rFonts w:ascii="Arial" w:cs="Arial" w:eastAsia="Arial" w:hAnsi="Arial"/>
+                <w:sz w:val="20"/>
+                <w:szCs w:val="20"/>
+              </w:rPr>
+              <w:t xml:space="preserve">Pathway–Gene</w:t>
+            </w:r>
+          </w:p>
+        </w:tc>
+      </w:tr>
+      <w:tr>
+        <w:tc>
+          <w:tcPr>
+            <w:tcW w:type="dxa" w:w="1800"/>
+            <w:tcBorders>
+              <w:top w:val="single" w:color="CCCCCC" w:sz="1"/>
+              <w:left w:val="single" w:color="CCCCCC" w:sz="1"/>
+              <w:bottom w:val="single" w:color="CCCCCC" w:sz="1"/>
+              <w:right w:val="single" w:color="CCCCCC" w:sz="1"/>
+            </w:tcBorders>
+            <w:shd w:fill="F2F6FA" w:val="clear"/>
+            <w:tcMar>
+              <w:top w:type="dxa" w:w="80"/>
+              <w:left w:type="dxa" w:w="120"/>
+              <w:bottom w:type="dxa" w:w="80"/>
+              <w:right w:type="dxa" w:w="120"/>
+            </w:tcMar>
+          </w:tcPr>
+          <w:p>
+            <w:r>
+              <w:rPr>
+                <w:rFonts w:ascii="Consolas" w:cs="Consolas" w:eastAsia="Consolas" w:hAnsi="Consolas"/>
+                <w:sz w:val="20"/>
+                <w:szCs w:val="20"/>
+              </w:rPr>
+              <w:t xml:space="preserve">BPO-BPO</w:t>
+            </w:r>
+          </w:p>
+        </w:tc>
+        <w:tc>
+          <w:tcPr>
+            <w:tcW w:type="dxa" w:w="1800"/>
+            <w:tcBorders>
+              <w:top w:val="single" w:color="CCCCCC" w:sz="1"/>
+              <w:left w:val="single" w:color="CCCCCC" w:sz="1"/>
+              <w:bottom w:val="single" w:color="CCCCCC" w:sz="1"/>
+              <w:right w:val="single" w:color="CCCCCC" w:sz="1"/>
+            </w:tcBorders>
+            <w:shd w:fill="F2F6FA" w:val="clear"/>
+            <w:tcMar>
+              <w:top w:type="dxa" w:w="80"/>
+              <w:left w:type="dxa" w:w="120"/>
+              <w:bottom w:type="dxa" w:w="80"/>
+              <w:right w:type="dxa" w:w="120"/>
+            </w:tcMar>
+          </w:tcPr>
+          <w:p>
+            <w:r>
+              <w:rPr>
+                <w:rFonts w:ascii="Arial" w:cs="Arial" w:eastAsia="Arial" w:hAnsi="Arial"/>
+                <w:sz w:val="20"/>
+                <w:szCs w:val="20"/>
+              </w:rPr>
+              <w:t xml:space="preserve">44,494</w:t>
+            </w:r>
+          </w:p>
+        </w:tc>
+        <w:tc>
+          <w:tcPr>
+            <w:tcW w:type="dxa" w:w="5760"/>
+            <w:tcBorders>
+              <w:top w:val="single" w:color="CCCCCC" w:sz="1"/>
+              <w:left w:val="single" w:color="CCCCCC" w:sz="1"/>
+              <w:bottom w:val="single" w:color="CCCCCC" w:sz="1"/>
+              <w:right w:val="single" w:color="CCCCCC" w:sz="1"/>
+            </w:tcBorders>
+            <w:shd w:fill="F2F6FA" w:val="clear"/>
+            <w:tcMar>
+              <w:top w:type="dxa" w:w="80"/>
+              <w:left w:type="dxa" w:w="120"/>
+              <w:bottom w:type="dxa" w:w="80"/>
+              <w:right w:type="dxa" w:w="120"/>
+            </w:tcMar>
+          </w:tcPr>
+          <w:p>
+            <w:r>
+              <w:rPr>
+                <w:rFonts w:ascii="Arial" w:cs="Arial" w:eastAsia="Arial" w:hAnsi="Arial"/>
+                <w:sz w:val="20"/>
+                <w:szCs w:val="20"/>
+              </w:rPr>
+              <w:t xml:space="preserve">Biological Process–Biological Process</w:t>
+            </w:r>
+          </w:p>
+        </w:tc>
+      </w:tr>
+      <w:tr>
+        <w:tc>
+          <w:tcPr>
+            <w:tcW w:type="dxa" w:w="1800"/>
+            <w:tcBorders>
+              <w:top w:val="single" w:color="CCCCCC" w:sz="1"/>
+              <w:left w:val="single" w:color="CCCCCC" w:sz="1"/>
+              <w:bottom w:val="single" w:color="CCCCCC" w:sz="1"/>
+              <w:right w:val="single" w:color="CCCCCC" w:sz="1"/>
+            </w:tcBorders>
+            <w:shd w:fill="FFFFFF" w:val="clear"/>
+            <w:tcMar>
+              <w:top w:type="dxa" w:w="80"/>
+              <w:left w:type="dxa" w:w="120"/>
+              <w:bottom w:type="dxa" w:w="80"/>
+              <w:right w:type="dxa" w:w="120"/>
+            </w:tcMar>
+          </w:tcPr>
+          <w:p>
+            <w:r>
+              <w:rPr>
+                <w:rFonts w:ascii="Consolas" w:cs="Consolas" w:eastAsia="Consolas" w:hAnsi="Consolas"/>
+                <w:sz w:val="20"/>
+                <w:szCs w:val="20"/>
+              </w:rPr>
+              <w:t xml:space="preserve">DIS-DIS</w:t>
+            </w:r>
+          </w:p>
+        </w:tc>
+        <w:tc>
+          <w:tcPr>
+            <w:tcW w:type="dxa" w:w="1800"/>
+            <w:tcBorders>
+              <w:top w:val="single" w:color="CCCCCC" w:sz="1"/>
+              <w:left w:val="single" w:color="CCCCCC" w:sz="1"/>
+              <w:bottom w:val="single" w:color="CCCCCC" w:sz="1"/>
+              <w:right w:val="single" w:color="CCCCCC" w:sz="1"/>
+            </w:tcBorders>
+            <w:shd w:fill="FFFFFF" w:val="clear"/>
+            <w:tcMar>
+              <w:top w:type="dxa" w:w="80"/>
+              <w:left w:type="dxa" w:w="120"/>
+              <w:bottom w:type="dxa" w:w="80"/>
+              <w:right w:type="dxa" w:w="120"/>
+            </w:tcMar>
+          </w:tcPr>
+          <w:p>
+            <w:r>
+              <w:rPr>
+                <w:rFonts w:ascii="Arial" w:cs="Arial" w:eastAsia="Arial" w:hAnsi="Arial"/>
+                <w:sz w:val="20"/>
+                <w:szCs w:val="20"/>
+              </w:rPr>
+              <w:t xml:space="preserve">44,215</w:t>
+            </w:r>
+          </w:p>
+        </w:tc>
+        <w:tc>
+          <w:tcPr>
+            <w:tcW w:type="dxa" w:w="5760"/>
+            <w:tcBorders>
+              <w:top w:val="single" w:color="CCCCCC" w:sz="1"/>
+              <w:left w:val="single" w:color="CCCCCC" w:sz="1"/>
+              <w:bottom w:val="single" w:color="CCCCCC" w:sz="1"/>
+              <w:right w:val="single" w:color="CCCCCC" w:sz="1"/>
+            </w:tcBorders>
+            <w:shd w:fill="FFFFFF" w:val="clear"/>
+            <w:tcMar>
+              <w:top w:type="dxa" w:w="80"/>
+              <w:left w:type="dxa" w:w="120"/>
+              <w:bottom w:type="dxa" w:w="80"/>
+              <w:right w:type="dxa" w:w="120"/>
+            </w:tcMar>
+          </w:tcPr>
+          <w:p>
+            <w:r>
+              <w:rPr>
+                <w:rFonts w:ascii="Arial" w:cs="Arial" w:eastAsia="Arial" w:hAnsi="Arial"/>
+                <w:sz w:val="20"/>
+                <w:szCs w:val="20"/>
+              </w:rPr>
+              <w:t xml:space="preserve">Disease–Disease</w:t>
+            </w:r>
+          </w:p>
+        </w:tc>
+      </w:tr>
+      <w:tr>
+        <w:tc>
+          <w:tcPr>
+            <w:tcW w:type="dxa" w:w="1800"/>
+            <w:tcBorders>
+              <w:top w:val="single" w:color="CCCCCC" w:sz="1"/>
+              <w:left w:val="single" w:color="CCCCCC" w:sz="1"/>
+              <w:bottom w:val="single" w:color="CCCCCC" w:sz="1"/>
+              <w:right w:val="single" w:color="CCCCCC" w:sz="1"/>
+            </w:tcBorders>
+            <w:shd w:fill="F2F6FA" w:val="clear"/>
+            <w:tcMar>
+              <w:top w:type="dxa" w:w="80"/>
+              <w:left w:type="dxa" w:w="120"/>
+              <w:bottom w:type="dxa" w:w="80"/>
+              <w:right w:type="dxa" w:w="120"/>
+            </w:tcMar>
+          </w:tcPr>
+          <w:p>
+            <w:r>
+              <w:rPr>
+                <w:rFonts w:ascii="Consolas" w:cs="Consolas" w:eastAsia="Consolas" w:hAnsi="Consolas"/>
+                <w:sz w:val="20"/>
+                <w:szCs w:val="20"/>
+              </w:rPr>
+              <w:t xml:space="preserve">PHE-PHE</w:t>
+            </w:r>
+          </w:p>
+        </w:tc>
+        <w:tc>
+          <w:tcPr>
+            <w:tcW w:type="dxa" w:w="1800"/>
+            <w:tcBorders>
+              <w:top w:val="single" w:color="CCCCCC" w:sz="1"/>
+              <w:left w:val="single" w:color="CCCCCC" w:sz="1"/>
+              <w:bottom w:val="single" w:color="CCCCCC" w:sz="1"/>
+              <w:right w:val="single" w:color="CCCCCC" w:sz="1"/>
+            </w:tcBorders>
+            <w:shd w:fill="F2F6FA" w:val="clear"/>
+            <w:tcMar>
+              <w:top w:type="dxa" w:w="80"/>
+              <w:left w:type="dxa" w:w="120"/>
+              <w:bottom w:type="dxa" w:w="80"/>
+              <w:right w:type="dxa" w:w="120"/>
+            </w:tcMar>
+          </w:tcPr>
+          <w:p>
+            <w:r>
+              <w:rPr>
+                <w:rFonts w:ascii="Arial" w:cs="Arial" w:eastAsia="Arial" w:hAnsi="Arial"/>
+                <w:sz w:val="20"/>
+                <w:szCs w:val="20"/>
+              </w:rPr>
+              <w:t xml:space="preserve">24,862</w:t>
+            </w:r>
+          </w:p>
+        </w:tc>
+        <w:tc>
+          <w:tcPr>
+            <w:tcW w:type="dxa" w:w="5760"/>
+            <w:tcBorders>
+              <w:top w:val="single" w:color="CCCCCC" w:sz="1"/>
+              <w:left w:val="single" w:color="CCCCCC" w:sz="1"/>
+              <w:bottom w:val="single" w:color="CCCCCC" w:sz="1"/>
+              <w:right w:val="single" w:color="CCCCCC" w:sz="1"/>
+            </w:tcBorders>
+            <w:shd w:fill="F2F6FA" w:val="clear"/>
+            <w:tcMar>
+              <w:top w:type="dxa" w:w="80"/>
+              <w:left w:type="dxa" w:w="120"/>
+              <w:bottom w:type="dxa" w:w="80"/>
+              <w:right w:type="dxa" w:w="120"/>
+            </w:tcMar>
+          </w:tcPr>
+          <w:p>
+            <w:r>
+              <w:rPr>
+                <w:rFonts w:ascii="Arial" w:cs="Arial" w:eastAsia="Arial" w:hAnsi="Arial"/>
+                <w:sz w:val="20"/>
+                <w:szCs w:val="20"/>
+              </w:rPr>
+              <w:t xml:space="preserve">Phenotype–Phenotype</w:t>
+            </w:r>
+          </w:p>
+        </w:tc>
+      </w:tr>
+      <w:tr>
+        <w:tc>
+          <w:tcPr>
+            <w:tcW w:type="dxa" w:w="1800"/>
+            <w:tcBorders>
+              <w:top w:val="single" w:color="CCCCCC" w:sz="1"/>
+              <w:left w:val="single" w:color="CCCCCC" w:sz="1"/>
+              <w:bottom w:val="single" w:color="CCCCCC" w:sz="1"/>
+              <w:right w:val="single" w:color="CCCCCC" w:sz="1"/>
+            </w:tcBorders>
+            <w:shd w:fill="FFFFFF" w:val="clear"/>
+            <w:tcMar>
+              <w:top w:type="dxa" w:w="80"/>
+              <w:left w:type="dxa" w:w="120"/>
+              <w:bottom w:type="dxa" w:w="80"/>
+              <w:right w:type="dxa" w:w="120"/>
+            </w:tcMar>
+          </w:tcPr>
+          <w:p>
+            <w:r>
+              <w:rPr>
+                <w:rFonts w:ascii="Consolas" w:cs="Consolas" w:eastAsia="Consolas" w:hAnsi="Consolas"/>
+                <w:sz w:val="20"/>
+                <w:szCs w:val="20"/>
+              </w:rPr>
+              <w:t xml:space="preserve">DRG-GEN</w:t>
+            </w:r>
+          </w:p>
+        </w:tc>
+        <w:tc>
+          <w:tcPr>
+            <w:tcW w:type="dxa" w:w="1800"/>
+            <w:tcBorders>
+              <w:top w:val="single" w:color="CCCCCC" w:sz="1"/>
+              <w:left w:val="single" w:color="CCCCCC" w:sz="1"/>
+              <w:bottom w:val="single" w:color="CCCCCC" w:sz="1"/>
+              <w:right w:val="single" w:color="CCCCCC" w:sz="1"/>
+            </w:tcBorders>
+            <w:shd w:fill="FFFFFF" w:val="clear"/>
+            <w:tcMar>
+              <w:top w:type="dxa" w:w="80"/>
+              <w:left w:type="dxa" w:w="120"/>
+              <w:bottom w:type="dxa" w:w="80"/>
+              <w:right w:type="dxa" w:w="120"/>
+            </w:tcMar>
+          </w:tcPr>
+          <w:p>
+            <w:r>
+              <w:rPr>
+                <w:rFonts w:ascii="Arial" w:cs="Arial" w:eastAsia="Arial" w:hAnsi="Arial"/>
+                <w:sz w:val="20"/>
+                <w:szCs w:val="20"/>
+              </w:rPr>
+              <w:t xml:space="preserve">20,694</w:t>
+            </w:r>
+          </w:p>
+        </w:tc>
+        <w:tc>
+          <w:tcPr>
+            <w:tcW w:type="dxa" w:w="5760"/>
+            <w:tcBorders>
+              <w:top w:val="single" w:color="CCCCCC" w:sz="1"/>
+              <w:left w:val="single" w:color="CCCCCC" w:sz="1"/>
+              <w:bottom w:val="single" w:color="CCCCCC" w:sz="1"/>
+              <w:right w:val="single" w:color="CCCCCC" w:sz="1"/>
+            </w:tcBorders>
+            <w:shd w:fill="FFFFFF" w:val="clear"/>
+            <w:tcMar>
+              <w:top w:type="dxa" w:w="80"/>
+              <w:left w:type="dxa" w:w="120"/>
+              <w:bottom w:type="dxa" w:w="80"/>
+              <w:right w:type="dxa" w:w="120"/>
+            </w:tcMar>
+          </w:tcPr>
+          <w:p>
+            <w:r>
+              <w:rPr>
+                <w:rFonts w:ascii="Arial" w:cs="Arial" w:eastAsia="Arial" w:hAnsi="Arial"/>
+                <w:sz w:val="20"/>
+                <w:szCs w:val="20"/>
+              </w:rPr>
+              <w:t xml:space="preserve">Drug–Gene</w:t>
+            </w:r>
+          </w:p>
+        </w:tc>
+      </w:tr>
+      <w:tr>
+        <w:tc>
+          <w:tcPr>
+            <w:tcW w:type="dxa" w:w="1800"/>
+            <w:tcBorders>
+              <w:top w:val="single" w:color="CCCCCC" w:sz="1"/>
+              <w:left w:val="single" w:color="CCCCCC" w:sz="1"/>
+              <w:bottom w:val="single" w:color="CCCCCC" w:sz="1"/>
+              <w:right w:val="single" w:color="CCCCCC" w:sz="1"/>
+            </w:tcBorders>
+            <w:shd w:fill="F2F6FA" w:val="clear"/>
+            <w:tcMar>
+              <w:top w:type="dxa" w:w="80"/>
+              <w:left w:type="dxa" w:w="120"/>
+              <w:bottom w:type="dxa" w:w="80"/>
+              <w:right w:type="dxa" w:w="120"/>
+            </w:tcMar>
+          </w:tcPr>
+          <w:p>
+            <w:r>
+              <w:rPr>
+                <w:rFonts w:ascii="Consolas" w:cs="Consolas" w:eastAsia="Consolas" w:hAnsi="Consolas"/>
+                <w:sz w:val="20"/>
+                <w:szCs w:val="20"/>
+              </w:rPr>
+              <w:t xml:space="preserve">ANA-ANA</w:t>
+            </w:r>
+          </w:p>
+        </w:tc>
+        <w:tc>
+          <w:tcPr>
+            <w:tcW w:type="dxa" w:w="1800"/>
+            <w:tcBorders>
+              <w:top w:val="single" w:color="CCCCCC" w:sz="1"/>
+              <w:left w:val="single" w:color="CCCCCC" w:sz="1"/>
+              <w:bottom w:val="single" w:color="CCCCCC" w:sz="1"/>
+              <w:right w:val="single" w:color="CCCCCC" w:sz="1"/>
+            </w:tcBorders>
+            <w:shd w:fill="F2F6FA" w:val="clear"/>
+            <w:tcMar>
+              <w:top w:type="dxa" w:w="80"/>
+              <w:left w:type="dxa" w:w="120"/>
+              <w:bottom w:type="dxa" w:w="80"/>
+              <w:right w:type="dxa" w:w="120"/>
+            </w:tcMar>
+          </w:tcPr>
+          <w:p>
+            <w:r>
+              <w:rPr>
+                <w:rFonts w:ascii="Arial" w:cs="Arial" w:eastAsia="Arial" w:hAnsi="Arial"/>
+                <w:sz w:val="20"/>
+                <w:szCs w:val="20"/>
+              </w:rPr>
+              <w:t xml:space="preserve">17,082</w:t>
+            </w:r>
+          </w:p>
+        </w:tc>
+        <w:tc>
+          <w:tcPr>
+            <w:tcW w:type="dxa" w:w="5760"/>
+            <w:tcBorders>
+              <w:top w:val="single" w:color="CCCCCC" w:sz="1"/>
+              <w:left w:val="single" w:color="CCCCCC" w:sz="1"/>
+              <w:bottom w:val="single" w:color="CCCCCC" w:sz="1"/>
+              <w:right w:val="single" w:color="CCCCCC" w:sz="1"/>
+            </w:tcBorders>
+            <w:shd w:fill="F2F6FA" w:val="clear"/>
+            <w:tcMar>
+              <w:top w:type="dxa" w:w="80"/>
+              <w:left w:type="dxa" w:w="120"/>
+              <w:bottom w:type="dxa" w:w="80"/>
+              <w:right w:type="dxa" w:w="120"/>
+            </w:tcMar>
+          </w:tcPr>
+          <w:p>
+            <w:r>
+              <w:rPr>
+                <w:rFonts w:ascii="Arial" w:cs="Arial" w:eastAsia="Arial" w:hAnsi="Arial"/>
+                <w:sz w:val="20"/>
+                <w:szCs w:val="20"/>
+              </w:rPr>
+              <w:t xml:space="preserve">Anatomy–Anatomy</w:t>
+            </w:r>
+          </w:p>
+        </w:tc>
+      </w:tr>
+      <w:tr>
+        <w:tc>
+          <w:tcPr>
+            <w:tcW w:type="dxa" w:w="1800"/>
+            <w:tcBorders>
+              <w:top w:val="single" w:color="CCCCCC" w:sz="1"/>
+              <w:left w:val="single" w:color="CCCCCC" w:sz="1"/>
+              <w:bottom w:val="single" w:color="CCCCCC" w:sz="1"/>
+              <w:right w:val="single" w:color="CCCCCC" w:sz="1"/>
+            </w:tcBorders>
+            <w:shd w:fill="FFFFFF" w:val="clear"/>
+            <w:tcMar>
+              <w:top w:type="dxa" w:w="80"/>
+              <w:left w:type="dxa" w:w="120"/>
+              <w:bottom w:type="dxa" w:w="80"/>
+              <w:right w:type="dxa" w:w="120"/>
+            </w:tcMar>
+          </w:tcPr>
+          <w:p>
+            <w:r>
+              <w:rPr>
+                <w:rFonts w:ascii="Consolas" w:cs="Consolas" w:eastAsia="Consolas" w:hAnsi="Consolas"/>
+                <w:sz w:val="20"/>
+                <w:szCs w:val="20"/>
+              </w:rPr>
+              <w:t xml:space="preserve">DRG-PHE</w:t>
+            </w:r>
+          </w:p>
+        </w:tc>
+        <w:tc>
+          <w:tcPr>
+            <w:tcW w:type="dxa" w:w="1800"/>
+            <w:tcBorders>
+              <w:top w:val="single" w:color="CCCCCC" w:sz="1"/>
+              <w:left w:val="single" w:color="CCCCCC" w:sz="1"/>
+              <w:bottom w:val="single" w:color="CCCCCC" w:sz="1"/>
+              <w:right w:val="single" w:color="CCCCCC" w:sz="1"/>
+            </w:tcBorders>
+            <w:shd w:fill="FFFFFF" w:val="clear"/>
+            <w:tcMar>
+              <w:top w:type="dxa" w:w="80"/>
+              <w:left w:type="dxa" w:w="120"/>
+              <w:bottom w:type="dxa" w:w="80"/>
+              <w:right w:type="dxa" w:w="120"/>
+            </w:tcMar>
+          </w:tcPr>
+          <w:p>
+            <w:r>
+              <w:rPr>
+                <w:rFonts w:ascii="Arial" w:cs="Arial" w:eastAsia="Arial" w:hAnsi="Arial"/>
+                <w:sz w:val="20"/>
+                <w:szCs w:val="20"/>
+              </w:rPr>
+              <w:t xml:space="preserve">13,758</w:t>
+            </w:r>
+          </w:p>
+        </w:tc>
+        <w:tc>
+          <w:tcPr>
+            <w:tcW w:type="dxa" w:w="5760"/>
+            <w:tcBorders>
+              <w:top w:val="single" w:color="CCCCCC" w:sz="1"/>
+              <w:left w:val="single" w:color="CCCCCC" w:sz="1"/>
+              <w:bottom w:val="single" w:color="CCCCCC" w:sz="1"/>
+              <w:right w:val="single" w:color="CCCCCC" w:sz="1"/>
+            </w:tcBorders>
+            <w:shd w:fill="FFFFFF" w:val="clear"/>
+            <w:tcMar>
+              <w:top w:type="dxa" w:w="80"/>
+              <w:left w:type="dxa" w:w="120"/>
+              <w:bottom w:type="dxa" w:w="80"/>
+              <w:right w:type="dxa" w:w="120"/>
+            </w:tcMar>
+          </w:tcPr>
+          <w:p>
+            <w:r>
+              <w:rPr>
+                <w:rFonts w:ascii="Arial" w:cs="Arial" w:eastAsia="Arial" w:hAnsi="Arial"/>
+                <w:sz w:val="20"/>
+                <w:szCs w:val="20"/>
+              </w:rPr>
+              <w:t xml:space="preserve">Drug–Phenotype</w:t>
+            </w:r>
+          </w:p>
+        </w:tc>
+      </w:tr>
+      <w:tr>
+        <w:tc>
+          <w:tcPr>
+            <w:tcW w:type="dxa" w:w="1800"/>
+            <w:tcBorders>
+              <w:top w:val="single" w:color="CCCCCC" w:sz="1"/>
+              <w:left w:val="single" w:color="CCCCCC" w:sz="1"/>
+              <w:bottom w:val="single" w:color="CCCCCC" w:sz="1"/>
+              <w:right w:val="single" w:color="CCCCCC" w:sz="1"/>
+            </w:tcBorders>
+            <w:shd w:fill="F2F6FA" w:val="clear"/>
+            <w:tcMar>
+              <w:top w:type="dxa" w:w="80"/>
+              <w:left w:type="dxa" w:w="120"/>
+              <w:bottom w:type="dxa" w:w="80"/>
+              <w:right w:type="dxa" w:w="120"/>
+            </w:tcMar>
+          </w:tcPr>
+          <w:p>
+            <w:r>
+              <w:rPr>
+                <w:rFonts w:ascii="Consolas" w:cs="Consolas" w:eastAsia="Consolas" w:hAnsi="Consolas"/>
+                <w:sz w:val="20"/>
+                <w:szCs w:val="20"/>
+              </w:rPr>
+              <w:t xml:space="preserve">MFN-MFN</w:t>
+            </w:r>
+          </w:p>
+        </w:tc>
+        <w:tc>
+          <w:tcPr>
+            <w:tcW w:type="dxa" w:w="1800"/>
+            <w:tcBorders>
+              <w:top w:val="single" w:color="CCCCCC" w:sz="1"/>
+              <w:left w:val="single" w:color="CCCCCC" w:sz="1"/>
+              <w:bottom w:val="single" w:color="CCCCCC" w:sz="1"/>
+              <w:right w:val="single" w:color="CCCCCC" w:sz="1"/>
+            </w:tcBorders>
+            <w:shd w:fill="F2F6FA" w:val="clear"/>
+            <w:tcMar>
+              <w:top w:type="dxa" w:w="80"/>
+              <w:left w:type="dxa" w:w="120"/>
+              <w:bottom w:type="dxa" w:w="80"/>
+              <w:right w:type="dxa" w:w="120"/>
+            </w:tcMar>
+          </w:tcPr>
+          <w:p>
+            <w:r>
+              <w:rPr>
+                <w:rFonts w:ascii="Arial" w:cs="Arial" w:eastAsia="Arial" w:hAnsi="Arial"/>
+                <w:sz w:val="20"/>
+                <w:szCs w:val="20"/>
+              </w:rPr>
+              <w:t xml:space="preserve">12,587</w:t>
+            </w:r>
+          </w:p>
+        </w:tc>
+        <w:tc>
+          <w:tcPr>
+            <w:tcW w:type="dxa" w:w="5760"/>
+            <w:tcBorders>
+              <w:top w:val="single" w:color="CCCCCC" w:sz="1"/>
+              <w:left w:val="single" w:color="CCCCCC" w:sz="1"/>
+              <w:bottom w:val="single" w:color="CCCCCC" w:sz="1"/>
+              <w:right w:val="single" w:color="CCCCCC" w:sz="1"/>
+            </w:tcBorders>
+            <w:shd w:fill="F2F6FA" w:val="clear"/>
+            <w:tcMar>
+              <w:top w:type="dxa" w:w="80"/>
+              <w:left w:type="dxa" w:w="120"/>
+              <w:bottom w:type="dxa" w:w="80"/>
+              <w:right w:type="dxa" w:w="120"/>
+            </w:tcMar>
+          </w:tcPr>
+          <w:p>
+            <w:r>
+              <w:rPr>
+                <w:rFonts w:ascii="Arial" w:cs="Arial" w:eastAsia="Arial" w:hAnsi="Arial"/>
+                <w:sz w:val="20"/>
+                <w:szCs w:val="20"/>
+              </w:rPr>
+              <w:t xml:space="preserve">Molecular Function–Molecular Function</w:t>
+            </w:r>
+          </w:p>
+        </w:tc>
+      </w:tr>
+      <w:tr>
+        <w:tc>
+          <w:tcPr>
+            <w:tcW w:type="dxa" w:w="1800"/>
+            <w:tcBorders>
+              <w:top w:val="single" w:color="CCCCCC" w:sz="1"/>
+              <w:left w:val="single" w:color="CCCCCC" w:sz="1"/>
+              <w:bottom w:val="single" w:color="CCCCCC" w:sz="1"/>
+              <w:right w:val="single" w:color="CCCCCC" w:sz="1"/>
+            </w:tcBorders>
+            <w:shd w:fill="FFFFFF" w:val="clear"/>
+            <w:tcMar>
+              <w:top w:type="dxa" w:w="80"/>
+              <w:left w:type="dxa" w:w="120"/>
+              <w:bottom w:type="dxa" w:w="80"/>
+              <w:right w:type="dxa" w:w="120"/>
+            </w:tcMar>
+          </w:tcPr>
+          <w:p>
+            <w:r>
+              <w:rPr>
+                <w:rFonts w:ascii="Consolas" w:cs="Consolas" w:eastAsia="Consolas" w:hAnsi="Consolas"/>
+                <w:sz w:val="20"/>
+                <w:szCs w:val="20"/>
+              </w:rPr>
+              <w:t xml:space="preserve">CCO-CCO</w:t>
+            </w:r>
+          </w:p>
+        </w:tc>
+        <w:tc>
+          <w:tcPr>
+            <w:tcW w:type="dxa" w:w="1800"/>
+            <w:tcBorders>
+              <w:top w:val="single" w:color="CCCCCC" w:sz="1"/>
+              <w:left w:val="single" w:color="CCCCCC" w:sz="1"/>
+              <w:bottom w:val="single" w:color="CCCCCC" w:sz="1"/>
+              <w:right w:val="single" w:color="CCCCCC" w:sz="1"/>
+            </w:tcBorders>
+            <w:shd w:fill="FFFFFF" w:val="clear"/>
+            <w:tcMar>
+              <w:top w:type="dxa" w:w="80"/>
+              <w:left w:type="dxa" w:w="120"/>
+              <w:bottom w:type="dxa" w:w="80"/>
+              <w:right w:type="dxa" w:w="120"/>
+            </w:tcMar>
+          </w:tcPr>
+          <w:p>
+            <w:r>
+              <w:rPr>
+                <w:rFonts w:ascii="Arial" w:cs="Arial" w:eastAsia="Arial" w:hAnsi="Arial"/>
+                <w:sz w:val="20"/>
+                <w:szCs w:val="20"/>
+              </w:rPr>
+              <w:t xml:space="preserve">4,639</w:t>
+            </w:r>
+          </w:p>
+        </w:tc>
+        <w:tc>
+          <w:tcPr>
+            <w:tcW w:type="dxa" w:w="5760"/>
+            <w:tcBorders>
+              <w:top w:val="single" w:color="CCCCCC" w:sz="1"/>
+              <w:left w:val="single" w:color="CCCCCC" w:sz="1"/>
+              <w:bottom w:val="single" w:color="CCCCCC" w:sz="1"/>
+              <w:right w:val="single" w:color="CCCCCC" w:sz="1"/>
+            </w:tcBorders>
+            <w:shd w:fill="FFFFFF" w:val="clear"/>
+            <w:tcMar>
+              <w:top w:type="dxa" w:w="80"/>
+              <w:left w:type="dxa" w:w="120"/>
+              <w:bottom w:type="dxa" w:w="80"/>
+              <w:right w:type="dxa" w:w="120"/>
+            </w:tcMar>
+          </w:tcPr>
+          <w:p>
+            <w:r>
+              <w:rPr>
+                <w:rFonts w:ascii="Arial" w:cs="Arial" w:eastAsia="Arial" w:hAnsi="Arial"/>
+                <w:sz w:val="20"/>
+                <w:szCs w:val="20"/>
+              </w:rPr>
+              <w:t xml:space="preserve">Cellular Component–Cellular Component</w:t>
+            </w:r>
+          </w:p>
+        </w:tc>
+      </w:tr>
+      <w:tr>
+        <w:tc>
+          <w:tcPr>
+            <w:tcW w:type="dxa" w:w="1800"/>
+            <w:tcBorders>
+              <w:top w:val="single" w:color="CCCCCC" w:sz="1"/>
+              <w:left w:val="single" w:color="CCCCCC" w:sz="1"/>
+              <w:bottom w:val="single" w:color="CCCCCC" w:sz="1"/>
+              <w:right w:val="single" w:color="CCCCCC" w:sz="1"/>
+            </w:tcBorders>
+            <w:shd w:fill="F2F6FA" w:val="clear"/>
+            <w:tcMar>
+              <w:top w:type="dxa" w:w="80"/>
+              <w:left w:type="dxa" w:w="120"/>
+              <w:bottom w:type="dxa" w:w="80"/>
+              <w:right w:type="dxa" w:w="120"/>
+            </w:tcMar>
+          </w:tcPr>
+          <w:p>
+            <w:r>
+              <w:rPr>
+                <w:rFonts w:ascii="Consolas" w:cs="Consolas" w:eastAsia="Consolas" w:hAnsi="Consolas"/>
+                <w:sz w:val="20"/>
+                <w:szCs w:val="20"/>
+              </w:rPr>
+              <w:t xml:space="preserve">EXP-GEN</w:t>
+            </w:r>
+          </w:p>
+        </w:tc>
+        <w:tc>
+          <w:tcPr>
+            <w:tcW w:type="dxa" w:w="1800"/>
+            <w:tcBorders>
+              <w:top w:val="single" w:color="CCCCCC" w:sz="1"/>
+              <w:left w:val="single" w:color="CCCCCC" w:sz="1"/>
+              <w:bottom w:val="single" w:color="CCCCCC" w:sz="1"/>
+              <w:right w:val="single" w:color="CCCCCC" w:sz="1"/>
+            </w:tcBorders>
+            <w:shd w:fill="F2F6FA" w:val="clear"/>
+            <w:tcMar>
+              <w:top w:type="dxa" w:w="80"/>
+              <w:left w:type="dxa" w:w="120"/>
+              <w:bottom w:type="dxa" w:w="80"/>
+              <w:right w:type="dxa" w:w="120"/>
+            </w:tcMar>
+          </w:tcPr>
+          <w:p>
+            <w:r>
+              <w:rPr>
+                <w:rFonts w:ascii="Arial" w:cs="Arial" w:eastAsia="Arial" w:hAnsi="Arial"/>
+                <w:sz w:val="20"/>
+                <w:szCs w:val="20"/>
+              </w:rPr>
+              <w:t xml:space="preserve">2,989</w:t>
+            </w:r>
+          </w:p>
+        </w:tc>
+        <w:tc>
+          <w:tcPr>
+            <w:tcW w:type="dxa" w:w="5760"/>
+            <w:tcBorders>
+              <w:top w:val="single" w:color="CCCCCC" w:sz="1"/>
+              <w:left w:val="single" w:color="CCCCCC" w:sz="1"/>
+              <w:bottom w:val="single" w:color="CCCCCC" w:sz="1"/>
+              <w:right w:val="single" w:color="CCCCCC" w:sz="1"/>
+            </w:tcBorders>
+            <w:shd w:fill="F2F6FA" w:val="clear"/>
+            <w:tcMar>
+              <w:top w:type="dxa" w:w="80"/>
+              <w:left w:type="dxa" w:w="120"/>
+              <w:bottom w:type="dxa" w:w="80"/>
+              <w:right w:type="dxa" w:w="120"/>
+            </w:tcMar>
+          </w:tcPr>
+          <w:p>
+            <w:r>
+              <w:rPr>
+                <w:rFonts w:ascii="Arial" w:cs="Arial" w:eastAsia="Arial" w:hAnsi="Arial"/>
+                <w:sz w:val="20"/>
+                <w:szCs w:val="20"/>
+              </w:rPr>
+              <w:t xml:space="preserve">Exposure–Gene</w:t>
+            </w:r>
+          </w:p>
+        </w:tc>
+      </w:tr>
+      <w:tr>
+        <w:tc>
+          <w:tcPr>
+            <w:tcW w:type="dxa" w:w="1800"/>
+            <w:tcBorders>
+              <w:top w:val="single" w:color="CCCCCC" w:sz="1"/>
+              <w:left w:val="single" w:color="CCCCCC" w:sz="1"/>
+              <w:bottom w:val="single" w:color="CCCCCC" w:sz="1"/>
+              <w:right w:val="single" w:color="CCCCCC" w:sz="1"/>
+            </w:tcBorders>
+            <w:shd w:fill="FFFFFF" w:val="clear"/>
+            <w:tcMar>
+              <w:top w:type="dxa" w:w="80"/>
+              <w:left w:type="dxa" w:w="120"/>
+              <w:bottom w:type="dxa" w:w="80"/>
+              <w:right w:type="dxa" w:w="120"/>
+            </w:tcMar>
+          </w:tcPr>
+          <w:p>
+            <w:r>
+              <w:rPr>
+                <w:rFonts w:ascii="Consolas" w:cs="Consolas" w:eastAsia="Consolas" w:hAnsi="Consolas"/>
+                <w:sz w:val="20"/>
+                <w:szCs w:val="20"/>
+              </w:rPr>
+              <w:t xml:space="preserve">PWY-PWY</w:t>
+            </w:r>
+          </w:p>
+        </w:tc>
+        <w:tc>
+          <w:tcPr>
+            <w:tcW w:type="dxa" w:w="1800"/>
+            <w:tcBorders>
+              <w:top w:val="single" w:color="CCCCCC" w:sz="1"/>
+              <w:left w:val="single" w:color="CCCCCC" w:sz="1"/>
+              <w:bottom w:val="single" w:color="CCCCCC" w:sz="1"/>
+              <w:right w:val="single" w:color="CCCCCC" w:sz="1"/>
+            </w:tcBorders>
+            <w:shd w:fill="FFFFFF" w:val="clear"/>
+            <w:tcMar>
+              <w:top w:type="dxa" w:w="80"/>
+              <w:left w:type="dxa" w:w="120"/>
+              <w:bottom w:type="dxa" w:w="80"/>
+              <w:right w:type="dxa" w:w="120"/>
+            </w:tcMar>
+          </w:tcPr>
+          <w:p>
+            <w:r>
+              <w:rPr>
+                <w:rFonts w:ascii="Arial" w:cs="Arial" w:eastAsia="Arial" w:hAnsi="Arial"/>
+                <w:sz w:val="20"/>
+                <w:szCs w:val="20"/>
+              </w:rPr>
+              <w:t xml:space="preserve">2,819</w:t>
+            </w:r>
+          </w:p>
+        </w:tc>
+        <w:tc>
+          <w:tcPr>
+            <w:tcW w:type="dxa" w:w="5760"/>
+            <w:tcBorders>
+              <w:top w:val="single" w:color="CCCCCC" w:sz="1"/>
+              <w:left w:val="single" w:color="CCCCCC" w:sz="1"/>
+              <w:bottom w:val="single" w:color="CCCCCC" w:sz="1"/>
+              <w:right w:val="single" w:color="CCCCCC" w:sz="1"/>
+            </w:tcBorders>
+            <w:shd w:fill="FFFFFF" w:val="clear"/>
+            <w:tcMar>
+              <w:top w:type="dxa" w:w="80"/>
+              <w:left w:type="dxa" w:w="120"/>
+              <w:bottom w:type="dxa" w:w="80"/>
+              <w:right w:type="dxa" w:w="120"/>
+            </w:tcMar>
+          </w:tcPr>
+          <w:p>
+            <w:r>
+              <w:rPr>
+                <w:rFonts w:ascii="Arial" w:cs="Arial" w:eastAsia="Arial" w:hAnsi="Arial"/>
+                <w:sz w:val="20"/>
+                <w:szCs w:val="20"/>
+              </w:rPr>
+              <w:t xml:space="preserve">Pathway–Pathway</w:t>
+            </w:r>
+          </w:p>
+        </w:tc>
+      </w:tr>
+      <w:tr>
+        <w:tc>
+          <w:tcPr>
+            <w:tcW w:type="dxa" w:w="1800"/>
+            <w:tcBorders>
+              <w:top w:val="single" w:color="CCCCCC" w:sz="1"/>
+              <w:left w:val="single" w:color="CCCCCC" w:sz="1"/>
+              <w:bottom w:val="single" w:color="CCCCCC" w:sz="1"/>
+              <w:right w:val="single" w:color="CCCCCC" w:sz="1"/>
+            </w:tcBorders>
+            <w:shd w:fill="F2F6FA" w:val="clear"/>
+            <w:tcMar>
+              <w:top w:type="dxa" w:w="80"/>
+              <w:left w:type="dxa" w:w="120"/>
+              <w:bottom w:type="dxa" w:w="80"/>
+              <w:right w:type="dxa" w:w="120"/>
+            </w:tcMar>
+          </w:tcPr>
+          <w:p>
+            <w:r>
+              <w:rPr>
+                <w:rFonts w:ascii="Consolas" w:cs="Consolas" w:eastAsia="Consolas" w:hAnsi="Consolas"/>
+                <w:sz w:val="20"/>
+                <w:szCs w:val="20"/>
+              </w:rPr>
+              <w:t xml:space="preserve">EXP-EXP</w:t>
+            </w:r>
+          </w:p>
+        </w:tc>
+        <w:tc>
+          <w:tcPr>
+            <w:tcW w:type="dxa" w:w="1800"/>
+            <w:tcBorders>
+              <w:top w:val="single" w:color="CCCCCC" w:sz="1"/>
+              <w:left w:val="single" w:color="CCCCCC" w:sz="1"/>
+              <w:bottom w:val="single" w:color="CCCCCC" w:sz="1"/>
+              <w:right w:val="single" w:color="CCCCCC" w:sz="1"/>
+            </w:tcBorders>
+            <w:shd w:fill="F2F6FA" w:val="clear"/>
+            <w:tcMar>
+              <w:top w:type="dxa" w:w="80"/>
+              <w:left w:type="dxa" w:w="120"/>
+              <w:bottom w:type="dxa" w:w="80"/>
+              <w:right w:type="dxa" w:w="120"/>
+            </w:tcMar>
+          </w:tcPr>
+          <w:p>
+            <w:r>
+              <w:rPr>
+                <w:rFonts w:ascii="Arial" w:cs="Arial" w:eastAsia="Arial" w:hAnsi="Arial"/>
+                <w:sz w:val="20"/>
+                <w:szCs w:val="20"/>
+              </w:rPr>
+              <w:t xml:space="preserve">2,443</w:t>
+            </w:r>
+          </w:p>
+        </w:tc>
+        <w:tc>
+          <w:tcPr>
+            <w:tcW w:type="dxa" w:w="5760"/>
+            <w:tcBorders>
+              <w:top w:val="single" w:color="CCCCCC" w:sz="1"/>
+              <w:left w:val="single" w:color="CCCCCC" w:sz="1"/>
+              <w:bottom w:val="single" w:color="CCCCCC" w:sz="1"/>
+              <w:right w:val="single" w:color="CCCCCC" w:sz="1"/>
+            </w:tcBorders>
+            <w:shd w:fill="F2F6FA" w:val="clear"/>
+            <w:tcMar>
+              <w:top w:type="dxa" w:w="80"/>
+              <w:left w:type="dxa" w:w="120"/>
+              <w:bottom w:type="dxa" w:w="80"/>
+              <w:right w:type="dxa" w:w="120"/>
+            </w:tcMar>
+          </w:tcPr>
+          <w:p>
+            <w:r>
+              <w:rPr>
+                <w:rFonts w:ascii="Arial" w:cs="Arial" w:eastAsia="Arial" w:hAnsi="Arial"/>
+                <w:sz w:val="20"/>
+                <w:szCs w:val="20"/>
+              </w:rPr>
+              <w:t xml:space="preserve">Exposure–Exposure</w:t>
+            </w:r>
+          </w:p>
+        </w:tc>
+      </w:tr>
+      <w:tr>
+        <w:tc>
+          <w:tcPr>
+            <w:tcW w:type="dxa" w:w="1800"/>
+            <w:tcBorders>
+              <w:top w:val="single" w:color="CCCCCC" w:sz="1"/>
+              <w:left w:val="single" w:color="CCCCCC" w:sz="1"/>
+              <w:bottom w:val="single" w:color="CCCCCC" w:sz="1"/>
+              <w:right w:val="single" w:color="CCCCCC" w:sz="1"/>
+            </w:tcBorders>
+            <w:shd w:fill="FFFFFF" w:val="clear"/>
+            <w:tcMar>
+              <w:top w:type="dxa" w:w="80"/>
+              <w:left w:type="dxa" w:w="120"/>
+              <w:bottom w:type="dxa" w:w="80"/>
+              <w:right w:type="dxa" w:w="120"/>
+            </w:tcMar>
+          </w:tcPr>
+          <w:p>
+            <w:r>
+              <w:rPr>
+                <w:rFonts w:ascii="Consolas" w:cs="Consolas" w:eastAsia="Consolas" w:hAnsi="Consolas"/>
+                <w:sz w:val="20"/>
+                <w:szCs w:val="20"/>
+              </w:rPr>
+              <w:t xml:space="preserve">EXP-DIS</w:t>
+            </w:r>
+          </w:p>
+        </w:tc>
+        <w:tc>
+          <w:tcPr>
+            <w:tcW w:type="dxa" w:w="1800"/>
+            <w:tcBorders>
+              <w:top w:val="single" w:color="CCCCCC" w:sz="1"/>
+              <w:left w:val="single" w:color="CCCCCC" w:sz="1"/>
+              <w:bottom w:val="single" w:color="CCCCCC" w:sz="1"/>
+              <w:right w:val="single" w:color="CCCCCC" w:sz="1"/>
+            </w:tcBorders>
+            <w:shd w:fill="FFFFFF" w:val="clear"/>
+            <w:tcMar>
+              <w:top w:type="dxa" w:w="80"/>
+              <w:left w:type="dxa" w:w="120"/>
+              <w:bottom w:type="dxa" w:w="80"/>
+              <w:right w:type="dxa" w:w="120"/>
+            </w:tcMar>
+          </w:tcPr>
+          <w:p>
+            <w:r>
+              <w:rPr>
+                <w:rFonts w:ascii="Arial" w:cs="Arial" w:eastAsia="Arial" w:hAnsi="Arial"/>
+                <w:sz w:val="20"/>
+                <w:szCs w:val="20"/>
+              </w:rPr>
+              <w:t xml:space="preserve">2,391</w:t>
+            </w:r>
+          </w:p>
+        </w:tc>
+        <w:tc>
+          <w:tcPr>
+            <w:tcW w:type="dxa" w:w="5760"/>
+            <w:tcBorders>
+              <w:top w:val="single" w:color="CCCCCC" w:sz="1"/>
+              <w:left w:val="single" w:color="CCCCCC" w:sz="1"/>
+              <w:bottom w:val="single" w:color="CCCCCC" w:sz="1"/>
+              <w:right w:val="single" w:color="CCCCCC" w:sz="1"/>
+            </w:tcBorders>
+            <w:shd w:fill="FFFFFF" w:val="clear"/>
+            <w:tcMar>
+              <w:top w:type="dxa" w:w="80"/>
+              <w:left w:type="dxa" w:w="120"/>
+              <w:bottom w:type="dxa" w:w="80"/>
+              <w:right w:type="dxa" w:w="120"/>
+            </w:tcMar>
+          </w:tcPr>
+          <w:p>
+            <w:r>
+              <w:rPr>
+                <w:rFonts w:ascii="Arial" w:cs="Arial" w:eastAsia="Arial" w:hAnsi="Arial"/>
+                <w:sz w:val="20"/>
+                <w:szCs w:val="20"/>
+              </w:rPr>
+              <w:t xml:space="preserve">Exposure–Disease</w:t>
+            </w:r>
+          </w:p>
+        </w:tc>
+      </w:tr>
+      <w:tr>
+        <w:tc>
+          <w:tcPr>
+            <w:tcW w:type="dxa" w:w="1800"/>
+            <w:tcBorders>
+              <w:top w:val="single" w:color="CCCCCC" w:sz="1"/>
+              <w:left w:val="single" w:color="CCCCCC" w:sz="1"/>
+              <w:bottom w:val="single" w:color="CCCCCC" w:sz="1"/>
+              <w:right w:val="single" w:color="CCCCCC" w:sz="1"/>
+            </w:tcBorders>
+            <w:shd w:fill="F2F6FA" w:val="clear"/>
+            <w:tcMar>
+              <w:top w:type="dxa" w:w="80"/>
+              <w:left w:type="dxa" w:w="120"/>
+              <w:bottom w:type="dxa" w:w="80"/>
+              <w:right w:type="dxa" w:w="120"/>
+            </w:tcMar>
+          </w:tcPr>
+          <w:p>
+            <w:r>
+              <w:rPr>
+                <w:rFonts w:ascii="Consolas" w:cs="Consolas" w:eastAsia="Consolas" w:hAnsi="Consolas"/>
+                <w:sz w:val="20"/>
+                <w:szCs w:val="20"/>
+              </w:rPr>
+              <w:t xml:space="preserve">EXP-BPO</w:t>
+            </w:r>
+          </w:p>
+        </w:tc>
+        <w:tc>
+          <w:tcPr>
+            <w:tcW w:type="dxa" w:w="1800"/>
+            <w:tcBorders>
+              <w:top w:val="single" w:color="CCCCCC" w:sz="1"/>
+              <w:left w:val="single" w:color="CCCCCC" w:sz="1"/>
+              <w:bottom w:val="single" w:color="CCCCCC" w:sz="1"/>
+              <w:right w:val="single" w:color="CCCCCC" w:sz="1"/>
+            </w:tcBorders>
+            <w:shd w:fill="F2F6FA" w:val="clear"/>
+            <w:tcMar>
+              <w:top w:type="dxa" w:w="80"/>
+              <w:left w:type="dxa" w:w="120"/>
+              <w:bottom w:type="dxa" w:w="80"/>
+              <w:right w:type="dxa" w:w="120"/>
+            </w:tcMar>
+          </w:tcPr>
+          <w:p>
+            <w:r>
+              <w:rPr>
+                <w:rFonts w:ascii="Arial" w:cs="Arial" w:eastAsia="Arial" w:hAnsi="Arial"/>
+                <w:sz w:val="20"/>
+                <w:szCs w:val="20"/>
+              </w:rPr>
+              <w:t xml:space="preserve">2,260</w:t>
+            </w:r>
+          </w:p>
+        </w:tc>
+        <w:tc>
+          <w:tcPr>
+            <w:tcW w:type="dxa" w:w="5760"/>
+            <w:tcBorders>
+              <w:top w:val="single" w:color="CCCCCC" w:sz="1"/>
+              <w:left w:val="single" w:color="CCCCCC" w:sz="1"/>
+              <w:bottom w:val="single" w:color="CCCCCC" w:sz="1"/>
+              <w:right w:val="single" w:color="CCCCCC" w:sz="1"/>
+            </w:tcBorders>
+            <w:shd w:fill="F2F6FA" w:val="clear"/>
+            <w:tcMar>
+              <w:top w:type="dxa" w:w="80"/>
+              <w:left w:type="dxa" w:w="120"/>
+              <w:bottom w:type="dxa" w:w="80"/>
+              <w:right w:type="dxa" w:w="120"/>
+            </w:tcMar>
+          </w:tcPr>
+          <w:p>
+            <w:r>
+              <w:rPr>
+                <w:rFonts w:ascii="Arial" w:cs="Arial" w:eastAsia="Arial" w:hAnsi="Arial"/>
+                <w:sz w:val="20"/>
+                <w:szCs w:val="20"/>
+              </w:rPr>
+              <w:t xml:space="preserve">Exposure–Biological Process</w:t>
+            </w:r>
+          </w:p>
+        </w:tc>
+      </w:tr>
+      <w:tr>
+        <w:tc>
+          <w:tcPr>
+            <w:tcW w:type="dxa" w:w="1800"/>
+            <w:tcBorders>
+              <w:top w:val="single" w:color="CCCCCC" w:sz="1"/>
+              <w:left w:val="single" w:color="CCCCCC" w:sz="1"/>
+              <w:bottom w:val="single" w:color="CCCCCC" w:sz="1"/>
+              <w:right w:val="single" w:color="CCCCCC" w:sz="1"/>
+            </w:tcBorders>
+            <w:shd w:fill="FFFFFF" w:val="clear"/>
+            <w:tcMar>
+              <w:top w:type="dxa" w:w="80"/>
+              <w:left w:type="dxa" w:w="120"/>
+              <w:bottom w:type="dxa" w:w="80"/>
+              <w:right w:type="dxa" w:w="120"/>
+            </w:tcMar>
+          </w:tcPr>
+          <w:p>
+            <w:r>
+              <w:rPr>
+                <w:rFonts w:ascii="Consolas" w:cs="Consolas" w:eastAsia="Consolas" w:hAnsi="Consolas"/>
+                <w:sz w:val="20"/>
+                <w:szCs w:val="20"/>
+              </w:rPr>
+              <w:t xml:space="preserve">DRG-BPO</w:t>
+            </w:r>
+          </w:p>
+        </w:tc>
+        <w:tc>
+          <w:tcPr>
+            <w:tcW w:type="dxa" w:w="1800"/>
+            <w:tcBorders>
+              <w:top w:val="single" w:color="CCCCCC" w:sz="1"/>
+              <w:left w:val="single" w:color="CCCCCC" w:sz="1"/>
+              <w:bottom w:val="single" w:color="CCCCCC" w:sz="1"/>
+              <w:right w:val="single" w:color="CCCCCC" w:sz="1"/>
+            </w:tcBorders>
+            <w:shd w:fill="FFFFFF" w:val="clear"/>
+            <w:tcMar>
+              <w:top w:type="dxa" w:w="80"/>
+              <w:left w:type="dxa" w:w="120"/>
+              <w:bottom w:type="dxa" w:w="80"/>
+              <w:right w:type="dxa" w:w="120"/>
+            </w:tcMar>
+          </w:tcPr>
+          <w:p>
+            <w:r>
+              <w:rPr>
+                <w:rFonts w:ascii="Arial" w:cs="Arial" w:eastAsia="Arial" w:hAnsi="Arial"/>
+                <w:sz w:val="20"/>
+                <w:szCs w:val="20"/>
+              </w:rPr>
+              <w:t xml:space="preserve">62</w:t>
+            </w:r>
+          </w:p>
+        </w:tc>
+        <w:tc>
+          <w:tcPr>
+            <w:tcW w:type="dxa" w:w="5760"/>
+            <w:tcBorders>
+              <w:top w:val="single" w:color="CCCCCC" w:sz="1"/>
+              <w:left w:val="single" w:color="CCCCCC" w:sz="1"/>
+              <w:bottom w:val="single" w:color="CCCCCC" w:sz="1"/>
+              <w:right w:val="single" w:color="CCCCCC" w:sz="1"/>
+            </w:tcBorders>
+            <w:shd w:fill="FFFFFF" w:val="clear"/>
+            <w:tcMar>
+              <w:top w:type="dxa" w:w="80"/>
+              <w:left w:type="dxa" w:w="120"/>
+              <w:bottom w:type="dxa" w:w="80"/>
+              <w:right w:type="dxa" w:w="120"/>
+            </w:tcMar>
+          </w:tcPr>
+          <w:p>
+            <w:r>
+              <w:rPr>
+                <w:rFonts w:ascii="Arial" w:cs="Arial" w:eastAsia="Arial" w:hAnsi="Arial"/>
+                <w:sz w:val="20"/>
+                <w:szCs w:val="20"/>
+              </w:rPr>
+              <w:t xml:space="preserve">Drug–Biological Process</w:t>
+            </w:r>
+          </w:p>
+        </w:tc>
+      </w:tr>
+      <w:tr>
+        <w:tc>
+          <w:tcPr>
+            <w:tcW w:type="dxa" w:w="1800"/>
+            <w:tcBorders>
+              <w:top w:val="single" w:color="CCCCCC" w:sz="1"/>
+              <w:left w:val="single" w:color="CCCCCC" w:sz="1"/>
+              <w:bottom w:val="single" w:color="CCCCCC" w:sz="1"/>
+              <w:right w:val="single" w:color="CCCCCC" w:sz="1"/>
+            </w:tcBorders>
+            <w:shd w:fill="F2F6FA" w:val="clear"/>
+            <w:tcMar>
+              <w:top w:type="dxa" w:w="80"/>
+              <w:left w:type="dxa" w:w="120"/>
+              <w:bottom w:type="dxa" w:w="80"/>
+              <w:right w:type="dxa" w:w="120"/>
+            </w:tcMar>
+          </w:tcPr>
+          <w:p>
+            <w:r>
+              <w:rPr>
+                <w:rFonts w:ascii="Consolas" w:cs="Consolas" w:eastAsia="Consolas" w:hAnsi="Consolas"/>
+                <w:sz w:val="20"/>
+                <w:szCs w:val="20"/>
+              </w:rPr>
+              <w:t xml:space="preserve">EXP-MFN</w:t>
+            </w:r>
+          </w:p>
+        </w:tc>
+        <w:tc>
+          <w:tcPr>
+            <w:tcW w:type="dxa" w:w="1800"/>
+            <w:tcBorders>
+              <w:top w:val="single" w:color="CCCCCC" w:sz="1"/>
+              <w:left w:val="single" w:color="CCCCCC" w:sz="1"/>
+              <w:bottom w:val="single" w:color="CCCCCC" w:sz="1"/>
+              <w:right w:val="single" w:color="CCCCCC" w:sz="1"/>
+            </w:tcBorders>
+            <w:shd w:fill="F2F6FA" w:val="clear"/>
+            <w:tcMar>
+              <w:top w:type="dxa" w:w="80"/>
+              <w:left w:type="dxa" w:w="120"/>
+              <w:bottom w:type="dxa" w:w="80"/>
+              <w:right w:type="dxa" w:w="120"/>
+            </w:tcMar>
+          </w:tcPr>
+          <w:p>
+            <w:r>
+              <w:rPr>
+                <w:rFonts w:ascii="Arial" w:cs="Arial" w:eastAsia="Arial" w:hAnsi="Arial"/>
+                <w:sz w:val="20"/>
+                <w:szCs w:val="20"/>
+              </w:rPr>
+              <w:t xml:space="preserve">47</w:t>
+            </w:r>
+          </w:p>
+        </w:tc>
+        <w:tc>
+          <w:tcPr>
+            <w:tcW w:type="dxa" w:w="5760"/>
+            <w:tcBorders>
+              <w:top w:val="single" w:color="CCCCCC" w:sz="1"/>
+              <w:left w:val="single" w:color="CCCCCC" w:sz="1"/>
+              <w:bottom w:val="single" w:color="CCCCCC" w:sz="1"/>
+              <w:right w:val="single" w:color="CCCCCC" w:sz="1"/>
+            </w:tcBorders>
+            <w:shd w:fill="F2F6FA" w:val="clear"/>
+            <w:tcMar>
+              <w:top w:type="dxa" w:w="80"/>
+              <w:left w:type="dxa" w:w="120"/>
+              <w:bottom w:type="dxa" w:w="80"/>
+              <w:right w:type="dxa" w:w="120"/>
+            </w:tcMar>
+          </w:tcPr>
+          <w:p>
+            <w:r>
+              <w:rPr>
+                <w:rFonts w:ascii="Arial" w:cs="Arial" w:eastAsia="Arial" w:hAnsi="Arial"/>
+                <w:sz w:val="20"/>
+                <w:szCs w:val="20"/>
+              </w:rPr>
+              <w:t xml:space="preserve">Exposure–Molecular Function</w:t>
+            </w:r>
+          </w:p>
+        </w:tc>
+      </w:tr>
+      <w:tr>
+        <w:tc>
+          <w:tcPr>
+            <w:tcW w:type="dxa" w:w="1800"/>
+            <w:tcBorders>
+              <w:top w:val="single" w:color="CCCCCC" w:sz="1"/>
+              <w:left w:val="single" w:color="CCCCCC" w:sz="1"/>
+              <w:bottom w:val="single" w:color="CCCCCC" w:sz="1"/>
+              <w:right w:val="single" w:color="CCCCCC" w:sz="1"/>
+            </w:tcBorders>
+            <w:shd w:fill="FFFFFF" w:val="clear"/>
+            <w:tcMar>
+              <w:top w:type="dxa" w:w="80"/>
+              <w:left w:type="dxa" w:w="120"/>
+              <w:bottom w:type="dxa" w:w="80"/>
+              <w:right w:type="dxa" w:w="120"/>
+            </w:tcMar>
+          </w:tcPr>
+          <w:p>
+            <w:r>
+              <w:rPr>
+                <w:rFonts w:ascii="Consolas" w:cs="Consolas" w:eastAsia="Consolas" w:hAnsi="Consolas"/>
+                <w:sz w:val="20"/>
+                <w:szCs w:val="20"/>
+              </w:rPr>
+              <w:t xml:space="preserve">EXP-CCO</w:t>
+            </w:r>
+          </w:p>
+        </w:tc>
+        <w:tc>
+          <w:tcPr>
+            <w:tcW w:type="dxa" w:w="1800"/>
+            <w:tcBorders>
+              <w:top w:val="single" w:color="CCCCCC" w:sz="1"/>
+              <w:left w:val="single" w:color="CCCCCC" w:sz="1"/>
+              <w:bottom w:val="single" w:color="CCCCCC" w:sz="1"/>
+              <w:right w:val="single" w:color="CCCCCC" w:sz="1"/>
+            </w:tcBorders>
+            <w:shd w:fill="FFFFFF" w:val="clear"/>
+            <w:tcMar>
+              <w:top w:type="dxa" w:w="80"/>
+              <w:left w:type="dxa" w:w="120"/>
+              <w:bottom w:type="dxa" w:w="80"/>
+              <w:right w:type="dxa" w:w="120"/>
+            </w:tcMar>
+          </w:tcPr>
+          <w:p>
+            <w:r>
+              <w:rPr>
+                <w:rFonts w:ascii="Arial" w:cs="Arial" w:eastAsia="Arial" w:hAnsi="Arial"/>
+                <w:sz w:val="20"/>
+                <w:szCs w:val="20"/>
+              </w:rPr>
+              <w:t xml:space="preserve">13</w:t>
+            </w:r>
+          </w:p>
+        </w:tc>
+        <w:tc>
+          <w:tcPr>
+            <w:tcW w:type="dxa" w:w="5760"/>
+            <w:tcBorders>
+              <w:top w:val="single" w:color="CCCCCC" w:sz="1"/>
+              <w:left w:val="single" w:color="CCCCCC" w:sz="1"/>
+              <w:bottom w:val="single" w:color="CCCCCC" w:sz="1"/>
+              <w:right w:val="single" w:color="CCCCCC" w:sz="1"/>
+            </w:tcBorders>
+            <w:shd w:fill="FFFFFF" w:val="clear"/>
+            <w:tcMar>
+              <w:top w:type="dxa" w:w="80"/>
+              <w:left w:type="dxa" w:w="120"/>
+              <w:bottom w:type="dxa" w:w="80"/>
+              <w:right w:type="dxa" w:w="120"/>
+            </w:tcMar>
+          </w:tcPr>
+          <w:p>
+            <w:r>
+              <w:rPr>
+                <w:rFonts w:ascii="Arial" w:cs="Arial" w:eastAsia="Arial" w:hAnsi="Arial"/>
+                <w:sz w:val="20"/>
+                <w:szCs w:val="20"/>
+              </w:rPr>
+              <w:t xml:space="preserve">Exposure–Cellular Component</w:t>
+            </w:r>
+          </w:p>
+        </w:tc>
+      </w:tr>
+    </w:tbl>
+    <w:p>
+      <w:r>
+        <w:br w:type="page"/>
+      </w:r>
+    </w:p>
+    <w:p>
+      <w:pPr>
+        <w:pStyle w:val="Heading1"/>
+      </w:pPr>
+      <w:r>
+        <w:t xml:space="preserve">Appendix B: All Relations</w:t>
+      </w:r>
+    </w:p>
+    <w:p>
+      <w:pPr>
+        <w:spacing w:after="160"/>
+      </w:pPr>
+      <w:r>
+        <w:t xml:space="preserve">The relation column is the actual semantic relationship, finer-grained than label. All 36 distinct values, with edge counts:</w:t>
+      </w:r>
+    </w:p>
+    <w:tbl>
+      <w:tblPr>
+        <w:tblW w:type="dxa" w:w="9360"/>
+        <w:tblBorders>
+          <w:top w:val="single" w:color="auto" w:sz="4"/>
+          <w:left w:val="single" w:color="auto" w:sz="4"/>
+          <w:bottom w:val="single" w:color="auto" w:sz="4"/>
+          <w:right w:val="single" w:color="auto" w:sz="4"/>
+          <w:insideH w:val="single" w:color="auto" w:sz="4"/>
+          <w:insideV w:val="single" w:color="auto" w:sz="4"/>
+        </w:tblBorders>
+      </w:tblPr>
+      <w:tblGrid>
+        <w:gridCol w:w="5900"/>
+        <w:gridCol w:w="3460"/>
+      </w:tblGrid>
+      <w:tr>
+        <w:tc>
+          <w:tcPr>
+            <w:tcW w:type="dxa" w:w="5900"/>
+            <w:tcBorders>
+              <w:top w:val="single" w:color="CCCCCC" w:sz="1"/>
+              <w:left w:val="single" w:color="CCCCCC" w:sz="1"/>
+              <w:bottom w:val="single" w:color="CCCCCC" w:sz="1"/>
+              <w:right w:val="single" w:color="CCCCCC" w:sz="1"/>
+            </w:tcBorders>
+            <w:shd w:fill="2E5C8A" w:val="clear"/>
+            <w:tcMar>
+              <w:top w:type="dxa" w:w="80"/>
+              <w:left w:type="dxa" w:w="120"/>
+              <w:bottom w:type="dxa" w:w="80"/>
+              <w:right w:type="dxa" w:w="120"/>
+            </w:tcMar>
+          </w:tcPr>
+          <w:p>
+            <w:r>
+              <w:rPr>
+                <w:b/>
+                <w:bCs/>
+                <w:color w:val="FFFFFF"/>
+                <w:sz w:val="20"/>
+                <w:szCs w:val="20"/>
+              </w:rPr>
+              <w:t xml:space="preserve">Relation</w:t>
+            </w:r>
+          </w:p>
+        </w:tc>
+        <w:tc>
+          <w:tcPr>
+            <w:tcW w:type="dxa" w:w="3460"/>
+            <w:tcBorders>
+              <w:top w:val="single" w:color="CCCCCC" w:sz="1"/>
+              <w:left w:val="single" w:color="CCCCCC" w:sz="1"/>
+              <w:bottom w:val="single" w:color="CCCCCC" w:sz="1"/>
+              <w:right w:val="single" w:color="CCCCCC" w:sz="1"/>
+            </w:tcBorders>
+            <w:shd w:fill="2E5C8A" w:val="clear"/>
+            <w:tcMar>
+              <w:top w:type="dxa" w:w="80"/>
+              <w:left w:type="dxa" w:w="120"/>
+              <w:bottom w:type="dxa" w:w="80"/>
+              <w:right w:type="dxa" w:w="120"/>
+            </w:tcMar>
+          </w:tcPr>
+          <w:p>
+            <w:r>
+              <w:rPr>
+                <w:b/>
+                <w:bCs/>
+                <w:color w:val="FFFFFF"/>
+                <w:sz w:val="20"/>
+                <w:szCs w:val="20"/>
+              </w:rPr>
+              <w:t xml:space="preserve">Edge Count</w:t>
+            </w:r>
+          </w:p>
+        </w:tc>
+      </w:tr>
+      <w:tr>
+        <w:tc>
+          <w:tcPr>
+            <w:tcW w:type="dxa" w:w="5900"/>
+            <w:tcBorders>
+              <w:top w:val="single" w:color="CCCCCC" w:sz="1"/>
+              <w:left w:val="single" w:color="CCCCCC" w:sz="1"/>
+              <w:bottom w:val="single" w:color="CCCCCC" w:sz="1"/>
+              <w:right w:val="single" w:color="CCCCCC" w:sz="1"/>
+            </w:tcBorders>
+            <w:shd w:fill="FFFFFF" w:val="clear"/>
+            <w:tcMar>
+              <w:top w:type="dxa" w:w="80"/>
+              <w:left w:type="dxa" w:w="120"/>
+              <w:bottom w:type="dxa" w:w="80"/>
+              <w:right w:type="dxa" w:w="120"/>
+            </w:tcMar>
+          </w:tcPr>
+          <w:p>
+            <w:r>
+              <w:rPr>
+                <w:rFonts w:ascii="Consolas" w:cs="Consolas" w:eastAsia="Consolas" w:hAnsi="Consolas"/>
+                <w:sz w:val="20"/>
+                <w:szCs w:val="20"/>
+              </w:rPr>
+              <w:t xml:space="preserve">ASSOCIATED_WITH</w:t>
+            </w:r>
+          </w:p>
+        </w:tc>
+        <w:tc>
+          <w:tcPr>
+            <w:tcW w:type="dxa" w:w="3460"/>
+            <w:tcBorders>
+              <w:top w:val="single" w:color="CCCCCC" w:sz="1"/>
+              <w:left w:val="single" w:color="CCCCCC" w:sz="1"/>
+              <w:bottom w:val="single" w:color="CCCCCC" w:sz="1"/>
+              <w:right w:val="single" w:color="CCCCCC" w:sz="1"/>
+            </w:tcBorders>
+            <w:shd w:fill="FFFFFF" w:val="clear"/>
+            <w:tcMar>
+              <w:top w:type="dxa" w:w="80"/>
+              <w:left w:type="dxa" w:w="120"/>
+              <w:bottom w:type="dxa" w:w="80"/>
+              <w:right w:type="dxa" w:w="120"/>
+            </w:tcMar>
+          </w:tcPr>
+          <w:p>
+            <w:r>
+              <w:rPr>
+                <w:rFonts w:ascii="Arial" w:cs="Arial" w:eastAsia="Arial" w:hAnsi="Arial"/>
+                <w:sz w:val="20"/>
+                <w:szCs w:val="20"/>
+              </w:rPr>
+              <w:t xml:space="preserve">10,531,730</w:t>
+            </w:r>
+          </w:p>
+        </w:tc>
+      </w:tr>
+      <w:tr>
+        <w:tc>
+          <w:tcPr>
+            <w:tcW w:type="dxa" w:w="5900"/>
+            <w:tcBorders>
+              <w:top w:val="single" w:color="CCCCCC" w:sz="1"/>
+              <w:left w:val="single" w:color="CCCCCC" w:sz="1"/>
+              <w:bottom w:val="single" w:color="CCCCCC" w:sz="1"/>
+              <w:right w:val="single" w:color="CCCCCC" w:sz="1"/>
+            </w:tcBorders>
+            <w:shd w:fill="F2F6FA" w:val="clear"/>
+            <w:tcMar>
+              <w:top w:type="dxa" w:w="80"/>
+              <w:left w:type="dxa" w:w="120"/>
+              <w:bottom w:type="dxa" w:w="80"/>
+              <w:right w:type="dxa" w:w="120"/>
+            </w:tcMar>
+          </w:tcPr>
+          <w:p>
+            <w:r>
+              <w:rPr>
+                <w:rFonts w:ascii="Consolas" w:cs="Consolas" w:eastAsia="Consolas" w:hAnsi="Consolas"/>
+                <w:sz w:val="20"/>
+                <w:szCs w:val="20"/>
+              </w:rPr>
+              <w:t xml:space="preserve">EXPRESSION_PRESENT</w:t>
+            </w:r>
+          </w:p>
+        </w:tc>
+        <w:tc>
+          <w:tcPr>
+            <w:tcW w:type="dxa" w:w="3460"/>
+            <w:tcBorders>
+              <w:top w:val="single" w:color="CCCCCC" w:sz="1"/>
+              <w:left w:val="single" w:color="CCCCCC" w:sz="1"/>
+              <w:bottom w:val="single" w:color="CCCCCC" w:sz="1"/>
+              <w:right w:val="single" w:color="CCCCCC" w:sz="1"/>
+            </w:tcBorders>
+            <w:shd w:fill="F2F6FA" w:val="clear"/>
+            <w:tcMar>
+              <w:top w:type="dxa" w:w="80"/>
+              <w:left w:type="dxa" w:w="120"/>
+              <w:bottom w:type="dxa" w:w="80"/>
+              <w:right w:type="dxa" w:w="120"/>
+            </w:tcMar>
+          </w:tcPr>
+          <w:p>
+            <w:r>
+              <w:rPr>
+                <w:rFonts w:ascii="Arial" w:cs="Arial" w:eastAsia="Arial" w:hAnsi="Arial"/>
+                <w:sz w:val="20"/>
+                <w:szCs w:val="20"/>
+              </w:rPr>
+              <w:t xml:space="preserve">6,616,463</w:t>
+            </w:r>
+          </w:p>
+        </w:tc>
+      </w:tr>
+      <w:tr>
+        <w:tc>
+          <w:tcPr>
+            <w:tcW w:type="dxa" w:w="5900"/>
+            <w:tcBorders>
+              <w:top w:val="single" w:color="CCCCCC" w:sz="1"/>
+              <w:left w:val="single" w:color="CCCCCC" w:sz="1"/>
+              <w:bottom w:val="single" w:color="CCCCCC" w:sz="1"/>
+              <w:right w:val="single" w:color="CCCCCC" w:sz="1"/>
+            </w:tcBorders>
+            <w:shd w:fill="FFFFFF" w:val="clear"/>
+            <w:tcMar>
+              <w:top w:type="dxa" w:w="80"/>
+              <w:left w:type="dxa" w:w="120"/>
+              <w:bottom w:type="dxa" w:w="80"/>
+              <w:right w:type="dxa" w:w="120"/>
+            </w:tcMar>
+          </w:tcPr>
+          <w:p>
+            <w:r>
+              <w:rPr>
+                <w:rFonts w:ascii="Consolas" w:cs="Consolas" w:eastAsia="Consolas" w:hAnsi="Consolas"/>
+                <w:sz w:val="20"/>
+                <w:szCs w:val="20"/>
+              </w:rPr>
+              <w:t xml:space="preserve">EXPRESSION_ABSENT</w:t>
+            </w:r>
+          </w:p>
+        </w:tc>
+        <w:tc>
+          <w:tcPr>
+            <w:tcW w:type="dxa" w:w="3460"/>
+            <w:tcBorders>
+              <w:top w:val="single" w:color="CCCCCC" w:sz="1"/>
+              <w:left w:val="single" w:color="CCCCCC" w:sz="1"/>
+              <w:bottom w:val="single" w:color="CCCCCC" w:sz="1"/>
+              <w:right w:val="single" w:color="CCCCCC" w:sz="1"/>
+            </w:tcBorders>
+            <w:shd w:fill="FFFFFF" w:val="clear"/>
+            <w:tcMar>
+              <w:top w:type="dxa" w:w="80"/>
+              <w:left w:type="dxa" w:w="120"/>
+              <w:bottom w:type="dxa" w:w="80"/>
+              <w:right w:type="dxa" w:w="120"/>
+            </w:tcMar>
+          </w:tcPr>
+          <w:p>
+            <w:r>
+              <w:rPr>
+                <w:rFonts w:ascii="Arial" w:cs="Arial" w:eastAsia="Arial" w:hAnsi="Arial"/>
+                <w:sz w:val="20"/>
+                <w:szCs w:val="20"/>
+              </w:rPr>
+              <w:t xml:space="preserve">2,171,492</w:t>
+            </w:r>
+          </w:p>
+        </w:tc>
+      </w:tr>
+      <w:tr>
+        <w:tc>
+          <w:tcPr>
+            <w:tcW w:type="dxa" w:w="5900"/>
+            <w:tcBorders>
+              <w:top w:val="single" w:color="CCCCCC" w:sz="1"/>
+              <w:left w:val="single" w:color="CCCCCC" w:sz="1"/>
+              <w:bottom w:val="single" w:color="CCCCCC" w:sz="1"/>
+              <w:right w:val="single" w:color="CCCCCC" w:sz="1"/>
+            </w:tcBorders>
+            <w:shd w:fill="F2F6FA" w:val="clear"/>
+            <w:tcMar>
+              <w:top w:type="dxa" w:w="80"/>
+              <w:left w:type="dxa" w:w="120"/>
+              <w:bottom w:type="dxa" w:w="80"/>
+              <w:right w:type="dxa" w:w="120"/>
+            </w:tcMar>
+          </w:tcPr>
+          <w:p>
+            <w:r>
+              <w:rPr>
+                <w:rFonts w:ascii="Consolas" w:cs="Consolas" w:eastAsia="Consolas" w:hAnsi="Consolas"/>
+                <w:sz w:val="20"/>
+                <w:szCs w:val="20"/>
+              </w:rPr>
+              <w:t xml:space="preserve">SYNERGISTIC_INTERACTION</w:t>
+            </w:r>
+          </w:p>
+        </w:tc>
+        <w:tc>
+          <w:tcPr>
+            <w:tcW w:type="dxa" w:w="3460"/>
+            <w:tcBorders>
+              <w:top w:val="single" w:color="CCCCCC" w:sz="1"/>
+              <w:left w:val="single" w:color="CCCCCC" w:sz="1"/>
+              <w:bottom w:val="single" w:color="CCCCCC" w:sz="1"/>
+              <w:right w:val="single" w:color="CCCCCC" w:sz="1"/>
+            </w:tcBorders>
+            <w:shd w:fill="F2F6FA" w:val="clear"/>
+            <w:tcMar>
+              <w:top w:type="dxa" w:w="80"/>
+              <w:left w:type="dxa" w:w="120"/>
+              <w:bottom w:type="dxa" w:w="80"/>
+              <w:right w:type="dxa" w:w="120"/>
+            </w:tcMar>
+          </w:tcPr>
+          <w:p>
+            <w:r>
+              <w:rPr>
+                <w:rFonts w:ascii="Arial" w:cs="Arial" w:eastAsia="Arial" w:hAnsi="Arial"/>
+                <w:sz w:val="20"/>
+                <w:szCs w:val="20"/>
+              </w:rPr>
+              <w:t xml:space="preserve">1,341,086</w:t>
+            </w:r>
+          </w:p>
+        </w:tc>
+      </w:tr>
+      <w:tr>
+        <w:tc>
+          <w:tcPr>
+            <w:tcW w:type="dxa" w:w="5900"/>
+            <w:tcBorders>
+              <w:top w:val="single" w:color="CCCCCC" w:sz="1"/>
+              <w:left w:val="single" w:color="CCCCCC" w:sz="1"/>
+              <w:bottom w:val="single" w:color="CCCCCC" w:sz="1"/>
+              <w:right w:val="single" w:color="CCCCCC" w:sz="1"/>
+            </w:tcBorders>
+            <w:shd w:fill="FFFFFF" w:val="clear"/>
+            <w:tcMar>
+              <w:top w:type="dxa" w:w="80"/>
+              <w:left w:type="dxa" w:w="120"/>
+              <w:bottom w:type="dxa" w:w="80"/>
+              <w:right w:type="dxa" w:w="120"/>
+            </w:tcMar>
+          </w:tcPr>
+          <w:p>
+            <w:r>
+              <w:rPr>
+                <w:rFonts w:ascii="Consolas" w:cs="Consolas" w:eastAsia="Consolas" w:hAnsi="Consolas"/>
+                <w:sz w:val="20"/>
+                <w:szCs w:val="20"/>
+              </w:rPr>
+              <w:t xml:space="preserve">INTERACTS_WITH</w:t>
+            </w:r>
+          </w:p>
+        </w:tc>
+        <w:tc>
+          <w:tcPr>
+            <w:tcW w:type="dxa" w:w="3460"/>
+            <w:tcBorders>
+              <w:top w:val="single" w:color="CCCCCC" w:sz="1"/>
+              <w:left w:val="single" w:color="CCCCCC" w:sz="1"/>
+              <w:bottom w:val="single" w:color="CCCCCC" w:sz="1"/>
+              <w:right w:val="single" w:color="CCCCCC" w:sz="1"/>
+            </w:tcBorders>
+            <w:shd w:fill="FFFFFF" w:val="clear"/>
+            <w:tcMar>
+              <w:top w:type="dxa" w:w="80"/>
+              <w:left w:type="dxa" w:w="120"/>
+              <w:bottom w:type="dxa" w:w="80"/>
+              <w:right w:type="dxa" w:w="120"/>
+            </w:tcMar>
+          </w:tcPr>
+          <w:p>
+            <w:r>
+              <w:rPr>
+                <w:rFonts w:ascii="Arial" w:cs="Arial" w:eastAsia="Arial" w:hAnsi="Arial"/>
+                <w:sz w:val="20"/>
+                <w:szCs w:val="20"/>
+              </w:rPr>
+              <w:t xml:space="preserve">734,862</w:t>
+            </w:r>
+          </w:p>
+        </w:tc>
+      </w:tr>
+      <w:tr>
+        <w:tc>
+          <w:tcPr>
+            <w:tcW w:type="dxa" w:w="5900"/>
+            <w:tcBorders>
+              <w:top w:val="single" w:color="CCCCCC" w:sz="1"/>
+              <w:left w:val="single" w:color="CCCCCC" w:sz="1"/>
+              <w:bottom w:val="single" w:color="CCCCCC" w:sz="1"/>
+              <w:right w:val="single" w:color="CCCCCC" w:sz="1"/>
+            </w:tcBorders>
+            <w:shd w:fill="F2F6FA" w:val="clear"/>
+            <w:tcMar>
+              <w:top w:type="dxa" w:w="80"/>
+              <w:left w:type="dxa" w:w="120"/>
+              <w:bottom w:type="dxa" w:w="80"/>
+              <w:right w:type="dxa" w:w="120"/>
+            </w:tcMar>
+          </w:tcPr>
+          <w:p>
+            <w:r>
+              <w:rPr>
+                <w:rFonts w:ascii="Consolas" w:cs="Consolas" w:eastAsia="Consolas" w:hAnsi="Consolas"/>
+                <w:sz w:val="20"/>
+                <w:szCs w:val="20"/>
+              </w:rPr>
+              <w:t xml:space="preserve">PHENOTYPE_PRESENT</w:t>
+            </w:r>
+          </w:p>
+        </w:tc>
+        <w:tc>
+          <w:tcPr>
+            <w:tcW w:type="dxa" w:w="3460"/>
+            <w:tcBorders>
+              <w:top w:val="single" w:color="CCCCCC" w:sz="1"/>
+              <w:left w:val="single" w:color="CCCCCC" w:sz="1"/>
+              <w:bottom w:val="single" w:color="CCCCCC" w:sz="1"/>
+              <w:right w:val="single" w:color="CCCCCC" w:sz="1"/>
+            </w:tcBorders>
+            <w:shd w:fill="F2F6FA" w:val="clear"/>
+            <w:tcMar>
+              <w:top w:type="dxa" w:w="80"/>
+              <w:left w:type="dxa" w:w="120"/>
+              <w:bottom w:type="dxa" w:w="80"/>
+              <w:right w:type="dxa" w:w="120"/>
+            </w:tcMar>
+          </w:tcPr>
+          <w:p>
+            <w:r>
+              <w:rPr>
+                <w:rFonts w:ascii="Arial" w:cs="Arial" w:eastAsia="Arial" w:hAnsi="Arial"/>
+                <w:sz w:val="20"/>
+                <w:szCs w:val="20"/>
+              </w:rPr>
+              <w:t xml:space="preserve">157,144</w:t>
+            </w:r>
+          </w:p>
+        </w:tc>
+      </w:tr>
+      <w:tr>
+        <w:tc>
+          <w:tcPr>
+            <w:tcW w:type="dxa" w:w="5900"/>
+            <w:tcBorders>
+              <w:top w:val="single" w:color="CCCCCC" w:sz="1"/>
+              <w:left w:val="single" w:color="CCCCCC" w:sz="1"/>
+              <w:bottom w:val="single" w:color="CCCCCC" w:sz="1"/>
+              <w:right w:val="single" w:color="CCCCCC" w:sz="1"/>
+            </w:tcBorders>
+            <w:shd w:fill="FFFFFF" w:val="clear"/>
+            <w:tcMar>
+              <w:top w:type="dxa" w:w="80"/>
+              <w:left w:type="dxa" w:w="120"/>
+              <w:bottom w:type="dxa" w:w="80"/>
+              <w:right w:type="dxa" w:w="120"/>
+            </w:tcMar>
+          </w:tcPr>
+          <w:p>
+            <w:r>
+              <w:rPr>
+                <w:rFonts w:ascii="Consolas" w:cs="Consolas" w:eastAsia="Consolas" w:hAnsi="Consolas"/>
+                <w:sz w:val="20"/>
+                <w:szCs w:val="20"/>
+              </w:rPr>
+              <w:t xml:space="preserve">PARENT</w:t>
+            </w:r>
+          </w:p>
+        </w:tc>
+        <w:tc>
+          <w:tcPr>
+            <w:tcW w:type="dxa" w:w="3460"/>
+            <w:tcBorders>
+              <w:top w:val="single" w:color="CCCCCC" w:sz="1"/>
+              <w:left w:val="single" w:color="CCCCCC" w:sz="1"/>
+              <w:bottom w:val="single" w:color="CCCCCC" w:sz="1"/>
+              <w:right w:val="single" w:color="CCCCCC" w:sz="1"/>
+            </w:tcBorders>
+            <w:shd w:fill="FFFFFF" w:val="clear"/>
+            <w:tcMar>
+              <w:top w:type="dxa" w:w="80"/>
+              <w:left w:type="dxa" w:w="120"/>
+              <w:bottom w:type="dxa" w:w="80"/>
+              <w:right w:type="dxa" w:w="120"/>
+            </w:tcMar>
+          </w:tcPr>
+          <w:p>
+            <w:r>
+              <w:rPr>
+                <w:rFonts w:ascii="Arial" w:cs="Arial" w:eastAsia="Arial" w:hAnsi="Arial"/>
+                <w:sz w:val="20"/>
+                <w:szCs w:val="20"/>
+              </w:rPr>
+              <w:t xml:space="preserve">95,711</w:t>
+            </w:r>
+          </w:p>
+        </w:tc>
+      </w:tr>
+      <w:tr>
+        <w:tc>
+          <w:tcPr>
+            <w:tcW w:type="dxa" w:w="5900"/>
+            <w:tcBorders>
+              <w:top w:val="single" w:color="CCCCCC" w:sz="1"/>
+              <w:left w:val="single" w:color="CCCCCC" w:sz="1"/>
+              <w:bottom w:val="single" w:color="CCCCCC" w:sz="1"/>
+              <w:right w:val="single" w:color="CCCCCC" w:sz="1"/>
+            </w:tcBorders>
+            <w:shd w:fill="F2F6FA" w:val="clear"/>
+            <w:tcMar>
+              <w:top w:type="dxa" w:w="80"/>
+              <w:left w:type="dxa" w:w="120"/>
+              <w:bottom w:type="dxa" w:w="80"/>
+              <w:right w:type="dxa" w:w="120"/>
+            </w:tcMar>
+          </w:tcPr>
+          <w:p>
+            <w:r>
+              <w:rPr>
+                <w:rFonts w:ascii="Consolas" w:cs="Consolas" w:eastAsia="Consolas" w:hAnsi="Consolas"/>
+                <w:sz w:val="20"/>
+                <w:szCs w:val="20"/>
+              </w:rPr>
+              <w:t xml:space="preserve">IS_A</w:t>
+            </w:r>
+          </w:p>
+        </w:tc>
+        <w:tc>
+          <w:tcPr>
+            <w:tcW w:type="dxa" w:w="3460"/>
+            <w:tcBorders>
+              <w:top w:val="single" w:color="CCCCCC" w:sz="1"/>
+              <w:left w:val="single" w:color="CCCCCC" w:sz="1"/>
+              <w:bottom w:val="single" w:color="CCCCCC" w:sz="1"/>
+              <w:right w:val="single" w:color="CCCCCC" w:sz="1"/>
+            </w:tcBorders>
+            <w:shd w:fill="F2F6FA" w:val="clear"/>
+            <w:tcMar>
+              <w:top w:type="dxa" w:w="80"/>
+              <w:left w:type="dxa" w:w="120"/>
+              <w:bottom w:type="dxa" w:w="80"/>
+              <w:right w:type="dxa" w:w="120"/>
+            </w:tcMar>
+          </w:tcPr>
+          <w:p>
+            <w:r>
+              <w:rPr>
+                <w:rFonts w:ascii="Arial" w:cs="Arial" w:eastAsia="Arial" w:hAnsi="Arial"/>
+                <w:sz w:val="20"/>
+                <w:szCs w:val="20"/>
+              </w:rPr>
+              <w:t xml:space="preserve">61,720</w:t>
+            </w:r>
+          </w:p>
+        </w:tc>
+      </w:tr>
+      <w:tr>
+        <w:tc>
+          <w:tcPr>
+            <w:tcW w:type="dxa" w:w="5900"/>
+            <w:tcBorders>
+              <w:top w:val="single" w:color="CCCCCC" w:sz="1"/>
+              <w:left w:val="single" w:color="CCCCCC" w:sz="1"/>
+              <w:bottom w:val="single" w:color="CCCCCC" w:sz="1"/>
+              <w:right w:val="single" w:color="CCCCCC" w:sz="1"/>
+            </w:tcBorders>
+            <w:shd w:fill="FFFFFF" w:val="clear"/>
+            <w:tcMar>
+              <w:top w:type="dxa" w:w="80"/>
+              <w:left w:type="dxa" w:w="120"/>
+              <w:bottom w:type="dxa" w:w="80"/>
+              <w:right w:type="dxa" w:w="120"/>
+            </w:tcMar>
+          </w:tcPr>
+          <w:p>
+            <w:r>
+              <w:rPr>
+                <w:rFonts w:ascii="Consolas" w:cs="Consolas" w:eastAsia="Consolas" w:hAnsi="Consolas"/>
+                <w:sz w:val="20"/>
+                <w:szCs w:val="20"/>
+              </w:rPr>
+              <w:t xml:space="preserve">INDICATION</w:t>
+            </w:r>
+          </w:p>
+        </w:tc>
+        <w:tc>
+          <w:tcPr>
+            <w:tcW w:type="dxa" w:w="3460"/>
+            <w:tcBorders>
+              <w:top w:val="single" w:color="CCCCCC" w:sz="1"/>
+              <w:left w:val="single" w:color="CCCCCC" w:sz="1"/>
+              <w:bottom w:val="single" w:color="CCCCCC" w:sz="1"/>
+              <w:right w:val="single" w:color="CCCCCC" w:sz="1"/>
+            </w:tcBorders>
+            <w:shd w:fill="FFFFFF" w:val="clear"/>
+            <w:tcMar>
+              <w:top w:type="dxa" w:w="80"/>
+              <w:left w:type="dxa" w:w="120"/>
+              <w:bottom w:type="dxa" w:w="80"/>
+              <w:right w:type="dxa" w:w="120"/>
+            </w:tcMar>
+          </w:tcPr>
+          <w:p>
+            <w:r>
+              <w:rPr>
+                <w:rFonts w:ascii="Arial" w:cs="Arial" w:eastAsia="Arial" w:hAnsi="Arial"/>
+                <w:sz w:val="20"/>
+                <w:szCs w:val="20"/>
+              </w:rPr>
+              <w:t xml:space="preserve">58,690</w:t>
+            </w:r>
+          </w:p>
+        </w:tc>
+      </w:tr>
+      <w:tr>
+        <w:tc>
+          <w:tcPr>
+            <w:tcW w:type="dxa" w:w="5900"/>
+            <w:tcBorders>
+              <w:top w:val="single" w:color="CCCCCC" w:sz="1"/>
+              <w:left w:val="single" w:color="CCCCCC" w:sz="1"/>
+              <w:bottom w:val="single" w:color="CCCCCC" w:sz="1"/>
+              <w:right w:val="single" w:color="CCCCCC" w:sz="1"/>
+            </w:tcBorders>
+            <w:shd w:fill="F2F6FA" w:val="clear"/>
+            <w:tcMar>
+              <w:top w:type="dxa" w:w="80"/>
+              <w:left w:type="dxa" w:w="120"/>
+              <w:bottom w:type="dxa" w:w="80"/>
+              <w:right w:type="dxa" w:w="120"/>
+            </w:tcMar>
+          </w:tcPr>
+          <w:p>
+            <w:r>
+              <w:rPr>
+                <w:rFonts w:ascii="Consolas" w:cs="Consolas" w:eastAsia="Consolas" w:hAnsi="Consolas"/>
+                <w:sz w:val="20"/>
+                <w:szCs w:val="20"/>
+              </w:rPr>
+              <w:t xml:space="preserve">CONTRAINDICATION</w:t>
+            </w:r>
+          </w:p>
+        </w:tc>
+        <w:tc>
+          <w:tcPr>
+            <w:tcW w:type="dxa" w:w="3460"/>
+            <w:tcBorders>
+              <w:top w:val="single" w:color="CCCCCC" w:sz="1"/>
+              <w:left w:val="single" w:color="CCCCCC" w:sz="1"/>
+              <w:bottom w:val="single" w:color="CCCCCC" w:sz="1"/>
+              <w:right w:val="single" w:color="CCCCCC" w:sz="1"/>
+            </w:tcBorders>
+            <w:shd w:fill="F2F6FA" w:val="clear"/>
+            <w:tcMar>
+              <w:top w:type="dxa" w:w="80"/>
+              <w:left w:type="dxa" w:w="120"/>
+              <w:bottom w:type="dxa" w:w="80"/>
+              <w:right w:type="dxa" w:w="120"/>
+            </w:tcMar>
+          </w:tcPr>
+          <w:p>
+            <w:r>
+              <w:rPr>
+                <w:rFonts w:ascii="Arial" w:cs="Arial" w:eastAsia="Arial" w:hAnsi="Arial"/>
+                <w:sz w:val="20"/>
+                <w:szCs w:val="20"/>
+              </w:rPr>
+              <w:t xml:space="preserve">19,997</w:t>
+            </w:r>
+          </w:p>
+        </w:tc>
+      </w:tr>
+      <w:tr>
+        <w:tc>
+          <w:tcPr>
+            <w:tcW w:type="dxa" w:w="5900"/>
+            <w:tcBorders>
+              <w:top w:val="single" w:color="CCCCCC" w:sz="1"/>
+              <w:left w:val="single" w:color="CCCCCC" w:sz="1"/>
+              <w:bottom w:val="single" w:color="CCCCCC" w:sz="1"/>
+              <w:right w:val="single" w:color="CCCCCC" w:sz="1"/>
+            </w:tcBorders>
+            <w:shd w:fill="FFFFFF" w:val="clear"/>
+            <w:tcMar>
+              <w:top w:type="dxa" w:w="80"/>
+              <w:left w:type="dxa" w:w="120"/>
+              <w:bottom w:type="dxa" w:w="80"/>
+              <w:right w:type="dxa" w:w="120"/>
+            </w:tcMar>
+          </w:tcPr>
+          <w:p>
+            <w:r>
+              <w:rPr>
+                <w:rFonts w:ascii="Consolas" w:cs="Consolas" w:eastAsia="Consolas" w:hAnsi="Consolas"/>
+                <w:sz w:val="20"/>
+                <w:szCs w:val="20"/>
+              </w:rPr>
+              <w:t xml:space="preserve">TARGET</w:t>
+            </w:r>
+          </w:p>
+        </w:tc>
+        <w:tc>
+          <w:tcPr>
+            <w:tcW w:type="dxa" w:w="3460"/>
+            <w:tcBorders>
+              <w:top w:val="single" w:color="CCCCCC" w:sz="1"/>
+              <w:left w:val="single" w:color="CCCCCC" w:sz="1"/>
+              <w:bottom w:val="single" w:color="CCCCCC" w:sz="1"/>
+              <w:right w:val="single" w:color="CCCCCC" w:sz="1"/>
+            </w:tcBorders>
+            <w:shd w:fill="FFFFFF" w:val="clear"/>
+            <w:tcMar>
+              <w:top w:type="dxa" w:w="80"/>
+              <w:left w:type="dxa" w:w="120"/>
+              <w:bottom w:type="dxa" w:w="80"/>
+              <w:right w:type="dxa" w:w="120"/>
+            </w:tcMar>
+          </w:tcPr>
+          <w:p>
+            <w:r>
+              <w:rPr>
+                <w:rFonts w:ascii="Arial" w:cs="Arial" w:eastAsia="Arial" w:hAnsi="Arial"/>
+                <w:sz w:val="20"/>
+                <w:szCs w:val="20"/>
+              </w:rPr>
+              <w:t xml:space="preserve">9,465</w:t>
+            </w:r>
+          </w:p>
+        </w:tc>
+      </w:tr>
+      <w:tr>
+        <w:tc>
+          <w:tcPr>
+            <w:tcW w:type="dxa" w:w="5900"/>
+            <w:tcBorders>
+              <w:top w:val="single" w:color="CCCCCC" w:sz="1"/>
+              <w:left w:val="single" w:color="CCCCCC" w:sz="1"/>
+              <w:bottom w:val="single" w:color="CCCCCC" w:sz="1"/>
+              <w:right w:val="single" w:color="CCCCCC" w:sz="1"/>
+            </w:tcBorders>
+            <w:shd w:fill="F2F6FA" w:val="clear"/>
+            <w:tcMar>
+              <w:top w:type="dxa" w:w="80"/>
+              <w:left w:type="dxa" w:w="120"/>
+              <w:bottom w:type="dxa" w:w="80"/>
+              <w:right w:type="dxa" w:w="120"/>
+            </w:tcMar>
+          </w:tcPr>
+          <w:p>
+            <w:r>
+              <w:rPr>
+                <w:rFonts w:ascii="Consolas" w:cs="Consolas" w:eastAsia="Consolas" w:hAnsi="Consolas"/>
+                <w:sz w:val="20"/>
+                <w:szCs w:val="20"/>
+              </w:rPr>
+              <w:t xml:space="preserve">ENZYME</w:t>
+            </w:r>
+          </w:p>
+        </w:tc>
+        <w:tc>
+          <w:tcPr>
+            <w:tcW w:type="dxa" w:w="3460"/>
+            <w:tcBorders>
+              <w:top w:val="single" w:color="CCCCCC" w:sz="1"/>
+              <w:left w:val="single" w:color="CCCCCC" w:sz="1"/>
+              <w:bottom w:val="single" w:color="CCCCCC" w:sz="1"/>
+              <w:right w:val="single" w:color="CCCCCC" w:sz="1"/>
+            </w:tcBorders>
+            <w:shd w:fill="F2F6FA" w:val="clear"/>
+            <w:tcMar>
+              <w:top w:type="dxa" w:w="80"/>
+              <w:left w:type="dxa" w:w="120"/>
+              <w:bottom w:type="dxa" w:w="80"/>
+              <w:right w:type="dxa" w:w="120"/>
+            </w:tcMar>
+          </w:tcPr>
+          <w:p>
+            <w:r>
+              <w:rPr>
+                <w:rFonts w:ascii="Arial" w:cs="Arial" w:eastAsia="Arial" w:hAnsi="Arial"/>
+                <w:sz w:val="20"/>
+                <w:szCs w:val="20"/>
+              </w:rPr>
+              <w:t xml:space="preserve">4,857</w:t>
+            </w:r>
+          </w:p>
+        </w:tc>
+      </w:tr>
+      <w:tr>
+        <w:tc>
+          <w:tcPr>
+            <w:tcW w:type="dxa" w:w="5900"/>
+            <w:tcBorders>
+              <w:top w:val="single" w:color="CCCCCC" w:sz="1"/>
+              <w:left w:val="single" w:color="CCCCCC" w:sz="1"/>
+              <w:bottom w:val="single" w:color="CCCCCC" w:sz="1"/>
+              <w:right w:val="single" w:color="CCCCCC" w:sz="1"/>
+            </w:tcBorders>
+            <w:shd w:fill="FFFFFF" w:val="clear"/>
+            <w:tcMar>
+              <w:top w:type="dxa" w:w="80"/>
+              <w:left w:type="dxa" w:w="120"/>
+              <w:bottom w:type="dxa" w:w="80"/>
+              <w:right w:type="dxa" w:w="120"/>
+            </w:tcMar>
+          </w:tcPr>
+          <w:p>
+            <w:r>
+              <w:rPr>
+                <w:rFonts w:ascii="Consolas" w:cs="Consolas" w:eastAsia="Consolas" w:hAnsi="Consolas"/>
+                <w:sz w:val="20"/>
+                <w:szCs w:val="20"/>
+              </w:rPr>
+              <w:t xml:space="preserve">TRANSPORTER</w:t>
+            </w:r>
+          </w:p>
+        </w:tc>
+        <w:tc>
+          <w:tcPr>
+            <w:tcW w:type="dxa" w:w="3460"/>
+            <w:tcBorders>
+              <w:top w:val="single" w:color="CCCCCC" w:sz="1"/>
+              <w:left w:val="single" w:color="CCCCCC" w:sz="1"/>
+              <w:bottom w:val="single" w:color="CCCCCC" w:sz="1"/>
+              <w:right w:val="single" w:color="CCCCCC" w:sz="1"/>
+            </w:tcBorders>
+            <w:shd w:fill="FFFFFF" w:val="clear"/>
+            <w:tcMar>
+              <w:top w:type="dxa" w:w="80"/>
+              <w:left w:type="dxa" w:w="120"/>
+              <w:bottom w:type="dxa" w:w="80"/>
+              <w:right w:type="dxa" w:w="120"/>
+            </w:tcMar>
+          </w:tcPr>
+          <w:p>
+            <w:r>
+              <w:rPr>
+                <w:rFonts w:ascii="Arial" w:cs="Arial" w:eastAsia="Arial" w:hAnsi="Arial"/>
+                <w:sz w:val="20"/>
+                <w:szCs w:val="20"/>
+              </w:rPr>
+              <w:t xml:space="preserve">2,764</w:t>
+            </w:r>
+          </w:p>
+        </w:tc>
+      </w:tr>
+      <w:tr>
+        <w:tc>
+          <w:tcPr>
+            <w:tcW w:type="dxa" w:w="5900"/>
+            <w:tcBorders>
+              <w:top w:val="single" w:color="CCCCCC" w:sz="1"/>
+              <w:left w:val="single" w:color="CCCCCC" w:sz="1"/>
+              <w:bottom w:val="single" w:color="CCCCCC" w:sz="1"/>
+              <w:right w:val="single" w:color="CCCCCC" w:sz="1"/>
+            </w:tcBorders>
+            <w:shd w:fill="F2F6FA" w:val="clear"/>
+            <w:tcMar>
+              <w:top w:type="dxa" w:w="80"/>
+              <w:left w:type="dxa" w:w="120"/>
+              <w:bottom w:type="dxa" w:w="80"/>
+              <w:right w:type="dxa" w:w="120"/>
+            </w:tcMar>
+          </w:tcPr>
+          <w:p>
+            <w:r>
+              <w:rPr>
+                <w:rFonts w:ascii="Consolas" w:cs="Consolas" w:eastAsia="Consolas" w:hAnsi="Consolas"/>
+                <w:sz w:val="20"/>
+                <w:szCs w:val="20"/>
+              </w:rPr>
+              <w:t xml:space="preserve">LINKED_TO</w:t>
+            </w:r>
+          </w:p>
+        </w:tc>
+        <w:tc>
+          <w:tcPr>
+            <w:tcW w:type="dxa" w:w="3460"/>
+            <w:tcBorders>
+              <w:top w:val="single" w:color="CCCCCC" w:sz="1"/>
+              <w:left w:val="single" w:color="CCCCCC" w:sz="1"/>
+              <w:bottom w:val="single" w:color="CCCCCC" w:sz="1"/>
+              <w:right w:val="single" w:color="CCCCCC" w:sz="1"/>
+            </w:tcBorders>
+            <w:shd w:fill="F2F6FA" w:val="clear"/>
+            <w:tcMar>
+              <w:top w:type="dxa" w:w="80"/>
+              <w:left w:type="dxa" w:w="120"/>
+              <w:bottom w:type="dxa" w:w="80"/>
+              <w:right w:type="dxa" w:w="120"/>
+            </w:tcMar>
+          </w:tcPr>
+          <w:p>
+            <w:r>
+              <w:rPr>
+                <w:rFonts w:ascii="Arial" w:cs="Arial" w:eastAsia="Arial" w:hAnsi="Arial"/>
+                <w:sz w:val="20"/>
+                <w:szCs w:val="20"/>
+              </w:rPr>
+              <w:t xml:space="preserve">2,391</w:t>
+            </w:r>
+          </w:p>
+        </w:tc>
+      </w:tr>
+      <w:tr>
+        <w:tc>
+          <w:tcPr>
+            <w:tcW w:type="dxa" w:w="5900"/>
+            <w:tcBorders>
+              <w:top w:val="single" w:color="CCCCCC" w:sz="1"/>
+              <w:left w:val="single" w:color="CCCCCC" w:sz="1"/>
+              <w:bottom w:val="single" w:color="CCCCCC" w:sz="1"/>
+              <w:right w:val="single" w:color="CCCCCC" w:sz="1"/>
+            </w:tcBorders>
+            <w:shd w:fill="FFFFFF" w:val="clear"/>
+            <w:tcMar>
+              <w:top w:type="dxa" w:w="80"/>
+              <w:left w:type="dxa" w:w="120"/>
+              <w:bottom w:type="dxa" w:w="80"/>
+              <w:right w:type="dxa" w:w="120"/>
+            </w:tcMar>
+          </w:tcPr>
+          <w:p>
+            <w:r>
+              <w:rPr>
+                <w:rFonts w:ascii="Consolas" w:cs="Consolas" w:eastAsia="Consolas" w:hAnsi="Consolas"/>
+                <w:sz w:val="20"/>
+                <w:szCs w:val="20"/>
+              </w:rPr>
+              <w:t xml:space="preserve">OFF_LABEL_USE</w:t>
+            </w:r>
+          </w:p>
+        </w:tc>
+        <w:tc>
+          <w:tcPr>
+            <w:tcW w:type="dxa" w:w="3460"/>
+            <w:tcBorders>
+              <w:top w:val="single" w:color="CCCCCC" w:sz="1"/>
+              <w:left w:val="single" w:color="CCCCCC" w:sz="1"/>
+              <w:bottom w:val="single" w:color="CCCCCC" w:sz="1"/>
+              <w:right w:val="single" w:color="CCCCCC" w:sz="1"/>
+            </w:tcBorders>
+            <w:shd w:fill="FFFFFF" w:val="clear"/>
+            <w:tcMar>
+              <w:top w:type="dxa" w:w="80"/>
+              <w:left w:type="dxa" w:w="120"/>
+              <w:bottom w:type="dxa" w:w="80"/>
+              <w:right w:type="dxa" w:w="120"/>
+            </w:tcMar>
+          </w:tcPr>
+          <w:p>
+            <w:r>
+              <w:rPr>
+                <w:rFonts w:ascii="Arial" w:cs="Arial" w:eastAsia="Arial" w:hAnsi="Arial"/>
+                <w:sz w:val="20"/>
+                <w:szCs w:val="20"/>
+              </w:rPr>
+              <w:t xml:space="preserve">1,262</w:t>
+            </w:r>
+          </w:p>
+        </w:tc>
+      </w:tr>
+      <w:tr>
+        <w:tc>
+          <w:tcPr>
+            <w:tcW w:type="dxa" w:w="5900"/>
+            <w:tcBorders>
+              <w:top w:val="single" w:color="CCCCCC" w:sz="1"/>
+              <w:left w:val="single" w:color="CCCCCC" w:sz="1"/>
+              <w:bottom w:val="single" w:color="CCCCCC" w:sz="1"/>
+              <w:right w:val="single" w:color="CCCCCC" w:sz="1"/>
+            </w:tcBorders>
+            <w:shd w:fill="F2F6FA" w:val="clear"/>
+            <w:tcMar>
+              <w:top w:type="dxa" w:w="80"/>
+              <w:left w:type="dxa" w:w="120"/>
+              <w:bottom w:type="dxa" w:w="80"/>
+              <w:right w:type="dxa" w:w="120"/>
+            </w:tcMar>
+          </w:tcPr>
+          <w:p>
+            <w:r>
+              <w:rPr>
+                <w:rFonts w:ascii="Consolas" w:cs="Consolas" w:eastAsia="Consolas" w:hAnsi="Consolas"/>
+                <w:sz w:val="20"/>
+                <w:szCs w:val="20"/>
+              </w:rPr>
+              <w:t xml:space="preserve">INHIBITOR</w:t>
+            </w:r>
+          </w:p>
+        </w:tc>
+        <w:tc>
+          <w:tcPr>
+            <w:tcW w:type="dxa" w:w="3460"/>
+            <w:tcBorders>
+              <w:top w:val="single" w:color="CCCCCC" w:sz="1"/>
+              <w:left w:val="single" w:color="CCCCCC" w:sz="1"/>
+              <w:bottom w:val="single" w:color="CCCCCC" w:sz="1"/>
+              <w:right w:val="single" w:color="CCCCCC" w:sz="1"/>
+            </w:tcBorders>
+            <w:shd w:fill="F2F6FA" w:val="clear"/>
+            <w:tcMar>
+              <w:top w:type="dxa" w:w="80"/>
+              <w:left w:type="dxa" w:w="120"/>
+              <w:bottom w:type="dxa" w:w="80"/>
+              <w:right w:type="dxa" w:w="120"/>
+            </w:tcMar>
+          </w:tcPr>
+          <w:p>
+            <w:r>
+              <w:rPr>
+                <w:rFonts w:ascii="Arial" w:cs="Arial" w:eastAsia="Arial" w:hAnsi="Arial"/>
+                <w:sz w:val="20"/>
+                <w:szCs w:val="20"/>
+              </w:rPr>
+              <w:t xml:space="preserve">845</w:t>
+            </w:r>
+          </w:p>
+        </w:tc>
+      </w:tr>
+      <w:tr>
+        <w:tc>
+          <w:tcPr>
+            <w:tcW w:type="dxa" w:w="5900"/>
+            <w:tcBorders>
+              <w:top w:val="single" w:color="CCCCCC" w:sz="1"/>
+              <w:left w:val="single" w:color="CCCCCC" w:sz="1"/>
+              <w:bottom w:val="single" w:color="CCCCCC" w:sz="1"/>
+              <w:right w:val="single" w:color="CCCCCC" w:sz="1"/>
+            </w:tcBorders>
+            <w:shd w:fill="FFFFFF" w:val="clear"/>
+            <w:tcMar>
+              <w:top w:type="dxa" w:w="80"/>
+              <w:left w:type="dxa" w:w="120"/>
+              <w:bottom w:type="dxa" w:w="80"/>
+              <w:right w:type="dxa" w:w="120"/>
+            </w:tcMar>
+          </w:tcPr>
+          <w:p>
+            <w:r>
+              <w:rPr>
+                <w:rFonts w:ascii="Consolas" w:cs="Consolas" w:eastAsia="Consolas" w:hAnsi="Consolas"/>
+                <w:sz w:val="20"/>
+                <w:szCs w:val="20"/>
+              </w:rPr>
+              <w:t xml:space="preserve">CARRIER</w:t>
+            </w:r>
+          </w:p>
+        </w:tc>
+        <w:tc>
+          <w:tcPr>
+            <w:tcW w:type="dxa" w:w="3460"/>
+            <w:tcBorders>
+              <w:top w:val="single" w:color="CCCCCC" w:sz="1"/>
+              <w:left w:val="single" w:color="CCCCCC" w:sz="1"/>
+              <w:bottom w:val="single" w:color="CCCCCC" w:sz="1"/>
+              <w:right w:val="single" w:color="CCCCCC" w:sz="1"/>
+            </w:tcBorders>
+            <w:shd w:fill="FFFFFF" w:val="clear"/>
+            <w:tcMar>
+              <w:top w:type="dxa" w:w="80"/>
+              <w:left w:type="dxa" w:w="120"/>
+              <w:bottom w:type="dxa" w:w="80"/>
+              <w:right w:type="dxa" w:w="120"/>
+            </w:tcMar>
+          </w:tcPr>
+          <w:p>
+            <w:r>
+              <w:rPr>
+                <w:rFonts w:ascii="Arial" w:cs="Arial" w:eastAsia="Arial" w:hAnsi="Arial"/>
+                <w:sz w:val="20"/>
+                <w:szCs w:val="20"/>
+              </w:rPr>
+              <w:t xml:space="preserve">711</w:t>
+            </w:r>
+          </w:p>
+        </w:tc>
+      </w:tr>
+      <w:tr>
+        <w:tc>
+          <w:tcPr>
+            <w:tcW w:type="dxa" w:w="5900"/>
+            <w:tcBorders>
+              <w:top w:val="single" w:color="CCCCCC" w:sz="1"/>
+              <w:left w:val="single" w:color="CCCCCC" w:sz="1"/>
+              <w:bottom w:val="single" w:color="CCCCCC" w:sz="1"/>
+              <w:right w:val="single" w:color="CCCCCC" w:sz="1"/>
+            </w:tcBorders>
+            <w:shd w:fill="F2F6FA" w:val="clear"/>
+            <w:tcMar>
+              <w:top w:type="dxa" w:w="80"/>
+              <w:left w:type="dxa" w:w="120"/>
+              <w:bottom w:type="dxa" w:w="80"/>
+              <w:right w:type="dxa" w:w="120"/>
+            </w:tcMar>
+          </w:tcPr>
+          <w:p>
+            <w:r>
+              <w:rPr>
+                <w:rFonts w:ascii="Consolas" w:cs="Consolas" w:eastAsia="Consolas" w:hAnsi="Consolas"/>
+                <w:sz w:val="20"/>
+                <w:szCs w:val="20"/>
+              </w:rPr>
+              <w:t xml:space="preserve">ADVERSE_DRUG_REACTION</w:t>
+            </w:r>
+          </w:p>
+        </w:tc>
+        <w:tc>
+          <w:tcPr>
+            <w:tcW w:type="dxa" w:w="3460"/>
+            <w:tcBorders>
+              <w:top w:val="single" w:color="CCCCCC" w:sz="1"/>
+              <w:left w:val="single" w:color="CCCCCC" w:sz="1"/>
+              <w:bottom w:val="single" w:color="CCCCCC" w:sz="1"/>
+              <w:right w:val="single" w:color="CCCCCC" w:sz="1"/>
+            </w:tcBorders>
+            <w:shd w:fill="F2F6FA" w:val="clear"/>
+            <w:tcMar>
+              <w:top w:type="dxa" w:w="80"/>
+              <w:left w:type="dxa" w:w="120"/>
+              <w:bottom w:type="dxa" w:w="80"/>
+              <w:right w:type="dxa" w:w="120"/>
+            </w:tcMar>
+          </w:tcPr>
+          <w:p>
+            <w:r>
+              <w:rPr>
+                <w:rFonts w:ascii="Arial" w:cs="Arial" w:eastAsia="Arial" w:hAnsi="Arial"/>
+                <w:sz w:val="20"/>
+                <w:szCs w:val="20"/>
+              </w:rPr>
+              <w:t xml:space="preserve">574</w:t>
+            </w:r>
+          </w:p>
+        </w:tc>
+      </w:tr>
+      <w:tr>
+        <w:tc>
+          <w:tcPr>
+            <w:tcW w:type="dxa" w:w="5900"/>
+            <w:tcBorders>
+              <w:top w:val="single" w:color="CCCCCC" w:sz="1"/>
+              <w:left w:val="single" w:color="CCCCCC" w:sz="1"/>
+              <w:bottom w:val="single" w:color="CCCCCC" w:sz="1"/>
+              <w:right w:val="single" w:color="CCCCCC" w:sz="1"/>
+            </w:tcBorders>
+            <w:shd w:fill="FFFFFF" w:val="clear"/>
+            <w:tcMar>
+              <w:top w:type="dxa" w:w="80"/>
+              <w:left w:type="dxa" w:w="120"/>
+              <w:bottom w:type="dxa" w:w="80"/>
+              <w:right w:type="dxa" w:w="120"/>
+            </w:tcMar>
+          </w:tcPr>
+          <w:p>
+            <w:r>
+              <w:rPr>
+                <w:rFonts w:ascii="Consolas" w:cs="Consolas" w:eastAsia="Consolas" w:hAnsi="Consolas"/>
+                <w:sz w:val="20"/>
+                <w:szCs w:val="20"/>
+              </w:rPr>
+              <w:t xml:space="preserve">POSITIVE_ALLOSTERIC_MODULATOR</w:t>
+            </w:r>
+          </w:p>
+        </w:tc>
+        <w:tc>
+          <w:tcPr>
+            <w:tcW w:type="dxa" w:w="3460"/>
+            <w:tcBorders>
+              <w:top w:val="single" w:color="CCCCCC" w:sz="1"/>
+              <w:left w:val="single" w:color="CCCCCC" w:sz="1"/>
+              <w:bottom w:val="single" w:color="CCCCCC" w:sz="1"/>
+              <w:right w:val="single" w:color="CCCCCC" w:sz="1"/>
+            </w:tcBorders>
+            <w:shd w:fill="FFFFFF" w:val="clear"/>
+            <w:tcMar>
+              <w:top w:type="dxa" w:w="80"/>
+              <w:left w:type="dxa" w:w="120"/>
+              <w:bottom w:type="dxa" w:w="80"/>
+              <w:right w:type="dxa" w:w="120"/>
+            </w:tcMar>
+          </w:tcPr>
+          <w:p>
+            <w:r>
+              <w:rPr>
+                <w:rFonts w:ascii="Arial" w:cs="Arial" w:eastAsia="Arial" w:hAnsi="Arial"/>
+                <w:sz w:val="20"/>
+                <w:szCs w:val="20"/>
+              </w:rPr>
+              <w:t xml:space="preserve">564</w:t>
+            </w:r>
+          </w:p>
+        </w:tc>
+      </w:tr>
+      <w:tr>
+        <w:tc>
+          <w:tcPr>
+            <w:tcW w:type="dxa" w:w="5900"/>
+            <w:tcBorders>
+              <w:top w:val="single" w:color="CCCCCC" w:sz="1"/>
+              <w:left w:val="single" w:color="CCCCCC" w:sz="1"/>
+              <w:bottom w:val="single" w:color="CCCCCC" w:sz="1"/>
+              <w:right w:val="single" w:color="CCCCCC" w:sz="1"/>
+            </w:tcBorders>
+            <w:shd w:fill="F2F6FA" w:val="clear"/>
+            <w:tcMar>
+              <w:top w:type="dxa" w:w="80"/>
+              <w:left w:type="dxa" w:w="120"/>
+              <w:bottom w:type="dxa" w:w="80"/>
+              <w:right w:type="dxa" w:w="120"/>
+            </w:tcMar>
+          </w:tcPr>
+          <w:p>
+            <w:r>
+              <w:rPr>
+                <w:rFonts w:ascii="Consolas" w:cs="Consolas" w:eastAsia="Consolas" w:hAnsi="Consolas"/>
+                <w:sz w:val="20"/>
+                <w:szCs w:val="20"/>
+              </w:rPr>
+              <w:t xml:space="preserve">AGONIST</w:t>
+            </w:r>
+          </w:p>
+        </w:tc>
+        <w:tc>
+          <w:tcPr>
+            <w:tcW w:type="dxa" w:w="3460"/>
+            <w:tcBorders>
+              <w:top w:val="single" w:color="CCCCCC" w:sz="1"/>
+              <w:left w:val="single" w:color="CCCCCC" w:sz="1"/>
+              <w:bottom w:val="single" w:color="CCCCCC" w:sz="1"/>
+              <w:right w:val="single" w:color="CCCCCC" w:sz="1"/>
+            </w:tcBorders>
+            <w:shd w:fill="F2F6FA" w:val="clear"/>
+            <w:tcMar>
+              <w:top w:type="dxa" w:w="80"/>
+              <w:left w:type="dxa" w:w="120"/>
+              <w:bottom w:type="dxa" w:w="80"/>
+              <w:right w:type="dxa" w:w="120"/>
+            </w:tcMar>
+          </w:tcPr>
+          <w:p>
+            <w:r>
+              <w:rPr>
+                <w:rFonts w:ascii="Arial" w:cs="Arial" w:eastAsia="Arial" w:hAnsi="Arial"/>
+                <w:sz w:val="20"/>
+                <w:szCs w:val="20"/>
+              </w:rPr>
+              <w:t xml:space="preserve">499</w:t>
+            </w:r>
+          </w:p>
+        </w:tc>
+      </w:tr>
+      <w:tr>
+        <w:tc>
+          <w:tcPr>
+            <w:tcW w:type="dxa" w:w="5900"/>
+            <w:tcBorders>
+              <w:top w:val="single" w:color="CCCCCC" w:sz="1"/>
+              <w:left w:val="single" w:color="CCCCCC" w:sz="1"/>
+              <w:bottom w:val="single" w:color="CCCCCC" w:sz="1"/>
+              <w:right w:val="single" w:color="CCCCCC" w:sz="1"/>
+            </w:tcBorders>
+            <w:shd w:fill="FFFFFF" w:val="clear"/>
+            <w:tcMar>
+              <w:top w:type="dxa" w:w="80"/>
+              <w:left w:type="dxa" w:w="120"/>
+              <w:bottom w:type="dxa" w:w="80"/>
+              <w:right w:type="dxa" w:w="120"/>
+            </w:tcMar>
+          </w:tcPr>
+          <w:p>
+            <w:r>
+              <w:rPr>
+                <w:rFonts w:ascii="Consolas" w:cs="Consolas" w:eastAsia="Consolas" w:hAnsi="Consolas"/>
+                <w:sz w:val="20"/>
+                <w:szCs w:val="20"/>
+              </w:rPr>
+              <w:t xml:space="preserve">ANTAGONIST</w:t>
+            </w:r>
+          </w:p>
+        </w:tc>
+        <w:tc>
+          <w:tcPr>
+            <w:tcW w:type="dxa" w:w="3460"/>
+            <w:tcBorders>
+              <w:top w:val="single" w:color="CCCCCC" w:sz="1"/>
+              <w:left w:val="single" w:color="CCCCCC" w:sz="1"/>
+              <w:bottom w:val="single" w:color="CCCCCC" w:sz="1"/>
+              <w:right w:val="single" w:color="CCCCCC" w:sz="1"/>
+            </w:tcBorders>
+            <w:shd w:fill="FFFFFF" w:val="clear"/>
+            <w:tcMar>
+              <w:top w:type="dxa" w:w="80"/>
+              <w:left w:type="dxa" w:w="120"/>
+              <w:bottom w:type="dxa" w:w="80"/>
+              <w:right w:type="dxa" w:w="120"/>
+            </w:tcMar>
+          </w:tcPr>
+          <w:p>
+            <w:r>
+              <w:rPr>
+                <w:rFonts w:ascii="Arial" w:cs="Arial" w:eastAsia="Arial" w:hAnsi="Arial"/>
+                <w:sz w:val="20"/>
+                <w:szCs w:val="20"/>
+              </w:rPr>
+              <w:t xml:space="preserve">475</w:t>
+            </w:r>
+          </w:p>
+        </w:tc>
+      </w:tr>
+      <w:tr>
+        <w:tc>
+          <w:tcPr>
+            <w:tcW w:type="dxa" w:w="5900"/>
+            <w:tcBorders>
+              <w:top w:val="single" w:color="CCCCCC" w:sz="1"/>
+              <w:left w:val="single" w:color="CCCCCC" w:sz="1"/>
+              <w:bottom w:val="single" w:color="CCCCCC" w:sz="1"/>
+              <w:right w:val="single" w:color="CCCCCC" w:sz="1"/>
+            </w:tcBorders>
+            <w:shd w:fill="F2F6FA" w:val="clear"/>
+            <w:tcMar>
+              <w:top w:type="dxa" w:w="80"/>
+              <w:left w:type="dxa" w:w="120"/>
+              <w:bottom w:type="dxa" w:w="80"/>
+              <w:right w:type="dxa" w:w="120"/>
+            </w:tcMar>
+          </w:tcPr>
+          <w:p>
+            <w:r>
+              <w:rPr>
+                <w:rFonts w:ascii="Consolas" w:cs="Consolas" w:eastAsia="Consolas" w:hAnsi="Consolas"/>
+                <w:sz w:val="20"/>
+                <w:szCs w:val="20"/>
+              </w:rPr>
+              <w:t xml:space="preserve">BLOCKER</w:t>
+            </w:r>
+          </w:p>
+        </w:tc>
+        <w:tc>
+          <w:tcPr>
+            <w:tcW w:type="dxa" w:w="3460"/>
+            <w:tcBorders>
+              <w:top w:val="single" w:color="CCCCCC" w:sz="1"/>
+              <w:left w:val="single" w:color="CCCCCC" w:sz="1"/>
+              <w:bottom w:val="single" w:color="CCCCCC" w:sz="1"/>
+              <w:right w:val="single" w:color="CCCCCC" w:sz="1"/>
+            </w:tcBorders>
+            <w:shd w:fill="F2F6FA" w:val="clear"/>
+            <w:tcMar>
+              <w:top w:type="dxa" w:w="80"/>
+              <w:left w:type="dxa" w:w="120"/>
+              <w:bottom w:type="dxa" w:w="80"/>
+              <w:right w:type="dxa" w:w="120"/>
+            </w:tcMar>
+          </w:tcPr>
+          <w:p>
+            <w:r>
+              <w:rPr>
+                <w:rFonts w:ascii="Arial" w:cs="Arial" w:eastAsia="Arial" w:hAnsi="Arial"/>
+                <w:sz w:val="20"/>
+                <w:szCs w:val="20"/>
+              </w:rPr>
+              <w:t xml:space="preserve">241</w:t>
+            </w:r>
+          </w:p>
+        </w:tc>
+      </w:tr>
+      <w:tr>
+        <w:tc>
+          <w:tcPr>
+            <w:tcW w:type="dxa" w:w="5900"/>
+            <w:tcBorders>
+              <w:top w:val="single" w:color="CCCCCC" w:sz="1"/>
+              <w:left w:val="single" w:color="CCCCCC" w:sz="1"/>
+              <w:bottom w:val="single" w:color="CCCCCC" w:sz="1"/>
+              <w:right w:val="single" w:color="CCCCCC" w:sz="1"/>
+            </w:tcBorders>
+            <w:shd w:fill="FFFFFF" w:val="clear"/>
+            <w:tcMar>
+              <w:top w:type="dxa" w:w="80"/>
+              <w:left w:type="dxa" w:w="120"/>
+              <w:bottom w:type="dxa" w:w="80"/>
+              <w:right w:type="dxa" w:w="120"/>
+            </w:tcMar>
+          </w:tcPr>
+          <w:p>
+            <w:r>
+              <w:rPr>
+                <w:rFonts w:ascii="Consolas" w:cs="Consolas" w:eastAsia="Consolas" w:hAnsi="Consolas"/>
+                <w:sz w:val="20"/>
+                <w:szCs w:val="20"/>
+              </w:rPr>
+              <w:t xml:space="preserve">POSITIVE_MODULATOR</w:t>
+            </w:r>
+          </w:p>
+        </w:tc>
+        <w:tc>
+          <w:tcPr>
+            <w:tcW w:type="dxa" w:w="3460"/>
+            <w:tcBorders>
+              <w:top w:val="single" w:color="CCCCCC" w:sz="1"/>
+              <w:left w:val="single" w:color="CCCCCC" w:sz="1"/>
+              <w:bottom w:val="single" w:color="CCCCCC" w:sz="1"/>
+              <w:right w:val="single" w:color="CCCCCC" w:sz="1"/>
+            </w:tcBorders>
+            <w:shd w:fill="FFFFFF" w:val="clear"/>
+            <w:tcMar>
+              <w:top w:type="dxa" w:w="80"/>
+              <w:left w:type="dxa" w:w="120"/>
+              <w:bottom w:type="dxa" w:w="80"/>
+              <w:right w:type="dxa" w:w="120"/>
+            </w:tcMar>
+          </w:tcPr>
+          <w:p>
+            <w:r>
+              <w:rPr>
+                <w:rFonts w:ascii="Arial" w:cs="Arial" w:eastAsia="Arial" w:hAnsi="Arial"/>
+                <w:sz w:val="20"/>
+                <w:szCs w:val="20"/>
+              </w:rPr>
+              <w:t xml:space="preserve">108</w:t>
+            </w:r>
+          </w:p>
+        </w:tc>
+      </w:tr>
+      <w:tr>
+        <w:tc>
+          <w:tcPr>
+            <w:tcW w:type="dxa" w:w="5900"/>
+            <w:tcBorders>
+              <w:top w:val="single" w:color="CCCCCC" w:sz="1"/>
+              <w:left w:val="single" w:color="CCCCCC" w:sz="1"/>
+              <w:bottom w:val="single" w:color="CCCCCC" w:sz="1"/>
+              <w:right w:val="single" w:color="CCCCCC" w:sz="1"/>
+            </w:tcBorders>
+            <w:shd w:fill="F2F6FA" w:val="clear"/>
+            <w:tcMar>
+              <w:top w:type="dxa" w:w="80"/>
+              <w:left w:type="dxa" w:w="120"/>
+              <w:bottom w:type="dxa" w:w="80"/>
+              <w:right w:type="dxa" w:w="120"/>
+            </w:tcMar>
+          </w:tcPr>
+          <w:p>
+            <w:r>
+              <w:rPr>
+                <w:rFonts w:ascii="Consolas" w:cs="Consolas" w:eastAsia="Consolas" w:hAnsi="Consolas"/>
+                <w:sz w:val="20"/>
+                <w:szCs w:val="20"/>
+              </w:rPr>
+              <w:t xml:space="preserve">MODULATOR</w:t>
+            </w:r>
+          </w:p>
+        </w:tc>
+        <w:tc>
+          <w:tcPr>
+            <w:tcW w:type="dxa" w:w="3460"/>
+            <w:tcBorders>
+              <w:top w:val="single" w:color="CCCCCC" w:sz="1"/>
+              <w:left w:val="single" w:color="CCCCCC" w:sz="1"/>
+              <w:bottom w:val="single" w:color="CCCCCC" w:sz="1"/>
+              <w:right w:val="single" w:color="CCCCCC" w:sz="1"/>
+            </w:tcBorders>
+            <w:shd w:fill="F2F6FA" w:val="clear"/>
+            <w:tcMar>
+              <w:top w:type="dxa" w:w="80"/>
+              <w:left w:type="dxa" w:w="120"/>
+              <w:bottom w:type="dxa" w:w="80"/>
+              <w:right w:type="dxa" w:w="120"/>
+            </w:tcMar>
+          </w:tcPr>
+          <w:p>
+            <w:r>
+              <w:rPr>
+                <w:rFonts w:ascii="Arial" w:cs="Arial" w:eastAsia="Arial" w:hAnsi="Arial"/>
+                <w:sz w:val="20"/>
+                <w:szCs w:val="20"/>
+              </w:rPr>
+              <w:t xml:space="preserve">35</w:t>
+            </w:r>
+          </w:p>
+        </w:tc>
+      </w:tr>
+      <w:tr>
+        <w:tc>
+          <w:tcPr>
+            <w:tcW w:type="dxa" w:w="5900"/>
+            <w:tcBorders>
+              <w:top w:val="single" w:color="CCCCCC" w:sz="1"/>
+              <w:left w:val="single" w:color="CCCCCC" w:sz="1"/>
+              <w:bottom w:val="single" w:color="CCCCCC" w:sz="1"/>
+              <w:right w:val="single" w:color="CCCCCC" w:sz="1"/>
+            </w:tcBorders>
+            <w:shd w:fill="FFFFFF" w:val="clear"/>
+            <w:tcMar>
+              <w:top w:type="dxa" w:w="80"/>
+              <w:left w:type="dxa" w:w="120"/>
+              <w:bottom w:type="dxa" w:w="80"/>
+              <w:right w:type="dxa" w:w="120"/>
+            </w:tcMar>
+          </w:tcPr>
+          <w:p>
+            <w:r>
+              <w:rPr>
+                <w:rFonts w:ascii="Consolas" w:cs="Consolas" w:eastAsia="Consolas" w:hAnsi="Consolas"/>
+                <w:sz w:val="20"/>
+                <w:szCs w:val="20"/>
+              </w:rPr>
+              <w:t xml:space="preserve">PARTIAL_AGONIST</w:t>
+            </w:r>
+          </w:p>
+        </w:tc>
+        <w:tc>
+          <w:tcPr>
+            <w:tcW w:type="dxa" w:w="3460"/>
+            <w:tcBorders>
+              <w:top w:val="single" w:color="CCCCCC" w:sz="1"/>
+              <w:left w:val="single" w:color="CCCCCC" w:sz="1"/>
+              <w:bottom w:val="single" w:color="CCCCCC" w:sz="1"/>
+              <w:right w:val="single" w:color="CCCCCC" w:sz="1"/>
+            </w:tcBorders>
+            <w:shd w:fill="FFFFFF" w:val="clear"/>
+            <w:tcMar>
+              <w:top w:type="dxa" w:w="80"/>
+              <w:left w:type="dxa" w:w="120"/>
+              <w:bottom w:type="dxa" w:w="80"/>
+              <w:right w:type="dxa" w:w="120"/>
+            </w:tcMar>
+          </w:tcPr>
+          <w:p>
+            <w:r>
+              <w:rPr>
+                <w:rFonts w:ascii="Arial" w:cs="Arial" w:eastAsia="Arial" w:hAnsi="Arial"/>
+                <w:sz w:val="20"/>
+                <w:szCs w:val="20"/>
+              </w:rPr>
+              <w:t xml:space="preserve">35</w:t>
+            </w:r>
+          </w:p>
+        </w:tc>
+      </w:tr>
+      <w:tr>
+        <w:tc>
+          <w:tcPr>
+            <w:tcW w:type="dxa" w:w="5900"/>
+            <w:tcBorders>
+              <w:top w:val="single" w:color="CCCCCC" w:sz="1"/>
+              <w:left w:val="single" w:color="CCCCCC" w:sz="1"/>
+              <w:bottom w:val="single" w:color="CCCCCC" w:sz="1"/>
+              <w:right w:val="single" w:color="CCCCCC" w:sz="1"/>
+            </w:tcBorders>
+            <w:shd w:fill="F2F6FA" w:val="clear"/>
+            <w:tcMar>
+              <w:top w:type="dxa" w:w="80"/>
+              <w:left w:type="dxa" w:w="120"/>
+              <w:bottom w:type="dxa" w:w="80"/>
+              <w:right w:type="dxa" w:w="120"/>
+            </w:tcMar>
+          </w:tcPr>
+          <w:p>
+            <w:r>
+              <w:rPr>
+                <w:rFonts w:ascii="Consolas" w:cs="Consolas" w:eastAsia="Consolas" w:hAnsi="Consolas"/>
+                <w:sz w:val="20"/>
+                <w:szCs w:val="20"/>
+              </w:rPr>
+              <w:t xml:space="preserve">STABILISER</w:t>
+            </w:r>
+          </w:p>
+        </w:tc>
+        <w:tc>
+          <w:tcPr>
+            <w:tcW w:type="dxa" w:w="3460"/>
+            <w:tcBorders>
+              <w:top w:val="single" w:color="CCCCCC" w:sz="1"/>
+              <w:left w:val="single" w:color="CCCCCC" w:sz="1"/>
+              <w:bottom w:val="single" w:color="CCCCCC" w:sz="1"/>
+              <w:right w:val="single" w:color="CCCCCC" w:sz="1"/>
+            </w:tcBorders>
+            <w:shd w:fill="F2F6FA" w:val="clear"/>
+            <w:tcMar>
+              <w:top w:type="dxa" w:w="80"/>
+              <w:left w:type="dxa" w:w="120"/>
+              <w:bottom w:type="dxa" w:w="80"/>
+              <w:right w:type="dxa" w:w="120"/>
+            </w:tcMar>
+          </w:tcPr>
+          <w:p>
+            <w:r>
+              <w:rPr>
+                <w:rFonts w:ascii="Arial" w:cs="Arial" w:eastAsia="Arial" w:hAnsi="Arial"/>
+                <w:sz w:val="20"/>
+                <w:szCs w:val="20"/>
+              </w:rPr>
+              <w:t xml:space="preserve">21</w:t>
+            </w:r>
+          </w:p>
+        </w:tc>
+      </w:tr>
+      <w:tr>
+        <w:tc>
+          <w:tcPr>
+            <w:tcW w:type="dxa" w:w="5900"/>
+            <w:tcBorders>
+              <w:top w:val="single" w:color="CCCCCC" w:sz="1"/>
+              <w:left w:val="single" w:color="CCCCCC" w:sz="1"/>
+              <w:bottom w:val="single" w:color="CCCCCC" w:sz="1"/>
+              <w:right w:val="single" w:color="CCCCCC" w:sz="1"/>
+            </w:tcBorders>
+            <w:shd w:fill="FFFFFF" w:val="clear"/>
+            <w:tcMar>
+              <w:top w:type="dxa" w:w="80"/>
+              <w:left w:type="dxa" w:w="120"/>
+              <w:bottom w:type="dxa" w:w="80"/>
+              <w:right w:type="dxa" w:w="120"/>
+            </w:tcMar>
+          </w:tcPr>
+          <w:p>
+            <w:r>
+              <w:rPr>
+                <w:rFonts w:ascii="Consolas" w:cs="Consolas" w:eastAsia="Consolas" w:hAnsi="Consolas"/>
+                <w:sz w:val="20"/>
+                <w:szCs w:val="20"/>
+              </w:rPr>
+              <w:t xml:space="preserve">NEGATIVE_ALLOSTERIC_MODULATOR</w:t>
+            </w:r>
+          </w:p>
+        </w:tc>
+        <w:tc>
+          <w:tcPr>
+            <w:tcW w:type="dxa" w:w="3460"/>
+            <w:tcBorders>
+              <w:top w:val="single" w:color="CCCCCC" w:sz="1"/>
+              <w:left w:val="single" w:color="CCCCCC" w:sz="1"/>
+              <w:bottom w:val="single" w:color="CCCCCC" w:sz="1"/>
+              <w:right w:val="single" w:color="CCCCCC" w:sz="1"/>
+            </w:tcBorders>
+            <w:shd w:fill="FFFFFF" w:val="clear"/>
+            <w:tcMar>
+              <w:top w:type="dxa" w:w="80"/>
+              <w:left w:type="dxa" w:w="120"/>
+              <w:bottom w:type="dxa" w:w="80"/>
+              <w:right w:type="dxa" w:w="120"/>
+            </w:tcMar>
+          </w:tcPr>
+          <w:p>
+            <w:r>
+              <w:rPr>
+                <w:rFonts w:ascii="Arial" w:cs="Arial" w:eastAsia="Arial" w:hAnsi="Arial"/>
+                <w:sz w:val="20"/>
+                <w:szCs w:val="20"/>
+              </w:rPr>
+              <w:t xml:space="preserve">17</w:t>
+            </w:r>
+          </w:p>
+        </w:tc>
+      </w:tr>
+      <w:tr>
+        <w:tc>
+          <w:tcPr>
+            <w:tcW w:type="dxa" w:w="5900"/>
+            <w:tcBorders>
+              <w:top w:val="single" w:color="CCCCCC" w:sz="1"/>
+              <w:left w:val="single" w:color="CCCCCC" w:sz="1"/>
+              <w:bottom w:val="single" w:color="CCCCCC" w:sz="1"/>
+              <w:right w:val="single" w:color="CCCCCC" w:sz="1"/>
+            </w:tcBorders>
+            <w:shd w:fill="F2F6FA" w:val="clear"/>
+            <w:tcMar>
+              <w:top w:type="dxa" w:w="80"/>
+              <w:left w:type="dxa" w:w="120"/>
+              <w:bottom w:type="dxa" w:w="80"/>
+              <w:right w:type="dxa" w:w="120"/>
+            </w:tcMar>
+          </w:tcPr>
+          <w:p>
+            <w:r>
+              <w:rPr>
+                <w:rFonts w:ascii="Consolas" w:cs="Consolas" w:eastAsia="Consolas" w:hAnsi="Consolas"/>
+                <w:sz w:val="20"/>
+                <w:szCs w:val="20"/>
+              </w:rPr>
+              <w:t xml:space="preserve">ALLOSTERIC_ANTAGONIST</w:t>
+            </w:r>
+          </w:p>
+        </w:tc>
+        <w:tc>
+          <w:tcPr>
+            <w:tcW w:type="dxa" w:w="3460"/>
+            <w:tcBorders>
+              <w:top w:val="single" w:color="CCCCCC" w:sz="1"/>
+              <w:left w:val="single" w:color="CCCCCC" w:sz="1"/>
+              <w:bottom w:val="single" w:color="CCCCCC" w:sz="1"/>
+              <w:right w:val="single" w:color="CCCCCC" w:sz="1"/>
+            </w:tcBorders>
+            <w:shd w:fill="F2F6FA" w:val="clear"/>
+            <w:tcMar>
+              <w:top w:type="dxa" w:w="80"/>
+              <w:left w:type="dxa" w:w="120"/>
+              <w:bottom w:type="dxa" w:w="80"/>
+              <w:right w:type="dxa" w:w="120"/>
+            </w:tcMar>
+          </w:tcPr>
+          <w:p>
+            <w:r>
+              <w:rPr>
+                <w:rFonts w:ascii="Arial" w:cs="Arial" w:eastAsia="Arial" w:hAnsi="Arial"/>
+                <w:sz w:val="20"/>
+                <w:szCs w:val="20"/>
+              </w:rPr>
+              <w:t xml:space="preserve">16</w:t>
+            </w:r>
+          </w:p>
+        </w:tc>
+      </w:tr>
+      <w:tr>
+        <w:tc>
+          <w:tcPr>
+            <w:tcW w:type="dxa" w:w="5900"/>
+            <w:tcBorders>
+              <w:top w:val="single" w:color="CCCCCC" w:sz="1"/>
+              <w:left w:val="single" w:color="CCCCCC" w:sz="1"/>
+              <w:bottom w:val="single" w:color="CCCCCC" w:sz="1"/>
+              <w:right w:val="single" w:color="CCCCCC" w:sz="1"/>
+            </w:tcBorders>
+            <w:shd w:fill="FFFFFF" w:val="clear"/>
+            <w:tcMar>
+              <w:top w:type="dxa" w:w="80"/>
+              <w:left w:type="dxa" w:w="120"/>
+              <w:bottom w:type="dxa" w:w="80"/>
+              <w:right w:type="dxa" w:w="120"/>
+            </w:tcMar>
+          </w:tcPr>
+          <w:p>
+            <w:r>
+              <w:rPr>
+                <w:rFonts w:ascii="Consolas" w:cs="Consolas" w:eastAsia="Consolas" w:hAnsi="Consolas"/>
+                <w:sz w:val="20"/>
+                <w:szCs w:val="20"/>
+              </w:rPr>
+              <w:t xml:space="preserve">OPENER</w:t>
+            </w:r>
+          </w:p>
+        </w:tc>
+        <w:tc>
+          <w:tcPr>
+            <w:tcW w:type="dxa" w:w="3460"/>
+            <w:tcBorders>
+              <w:top w:val="single" w:color="CCCCCC" w:sz="1"/>
+              <w:left w:val="single" w:color="CCCCCC" w:sz="1"/>
+              <w:bottom w:val="single" w:color="CCCCCC" w:sz="1"/>
+              <w:right w:val="single" w:color="CCCCCC" w:sz="1"/>
+            </w:tcBorders>
+            <w:shd w:fill="FFFFFF" w:val="clear"/>
+            <w:tcMar>
+              <w:top w:type="dxa" w:w="80"/>
+              <w:left w:type="dxa" w:w="120"/>
+              <w:bottom w:type="dxa" w:w="80"/>
+              <w:right w:type="dxa" w:w="120"/>
+            </w:tcMar>
+          </w:tcPr>
+          <w:p>
+            <w:r>
+              <w:rPr>
+                <w:rFonts w:ascii="Arial" w:cs="Arial" w:eastAsia="Arial" w:hAnsi="Arial"/>
+                <w:sz w:val="20"/>
+                <w:szCs w:val="20"/>
+              </w:rPr>
+              <w:t xml:space="preserve">10</w:t>
+            </w:r>
+          </w:p>
+        </w:tc>
+      </w:tr>
+      <w:tr>
+        <w:tc>
+          <w:tcPr>
+            <w:tcW w:type="dxa" w:w="5900"/>
+            <w:tcBorders>
+              <w:top w:val="single" w:color="CCCCCC" w:sz="1"/>
+              <w:left w:val="single" w:color="CCCCCC" w:sz="1"/>
+              <w:bottom w:val="single" w:color="CCCCCC" w:sz="1"/>
+              <w:right w:val="single" w:color="CCCCCC" w:sz="1"/>
+            </w:tcBorders>
+            <w:shd w:fill="F2F6FA" w:val="clear"/>
+            <w:tcMar>
+              <w:top w:type="dxa" w:w="80"/>
+              <w:left w:type="dxa" w:w="120"/>
+              <w:bottom w:type="dxa" w:w="80"/>
+              <w:right w:type="dxa" w:w="120"/>
+            </w:tcMar>
+          </w:tcPr>
+          <w:p>
+            <w:r>
+              <w:rPr>
+                <w:rFonts w:ascii="Consolas" w:cs="Consolas" w:eastAsia="Consolas" w:hAnsi="Consolas"/>
+                <w:sz w:val="20"/>
+                <w:szCs w:val="20"/>
+              </w:rPr>
+              <w:t xml:space="preserve">ACTIVATOR</w:t>
+            </w:r>
+          </w:p>
+        </w:tc>
+        <w:tc>
+          <w:tcPr>
+            <w:tcW w:type="dxa" w:w="3460"/>
+            <w:tcBorders>
+              <w:top w:val="single" w:color="CCCCCC" w:sz="1"/>
+              <w:left w:val="single" w:color="CCCCCC" w:sz="1"/>
+              <w:bottom w:val="single" w:color="CCCCCC" w:sz="1"/>
+              <w:right w:val="single" w:color="CCCCCC" w:sz="1"/>
+            </w:tcBorders>
+            <w:shd w:fill="F2F6FA" w:val="clear"/>
+            <w:tcMar>
+              <w:top w:type="dxa" w:w="80"/>
+              <w:left w:type="dxa" w:w="120"/>
+              <w:bottom w:type="dxa" w:w="80"/>
+              <w:right w:type="dxa" w:w="120"/>
+            </w:tcMar>
+          </w:tcPr>
+          <w:p>
+            <w:r>
+              <w:rPr>
+                <w:rFonts w:ascii="Arial" w:cs="Arial" w:eastAsia="Arial" w:hAnsi="Arial"/>
+                <w:sz w:val="20"/>
+                <w:szCs w:val="20"/>
+              </w:rPr>
+              <w:t xml:space="preserve">7</w:t>
+            </w:r>
+          </w:p>
+        </w:tc>
+      </w:tr>
+      <w:tr>
+        <w:tc>
+          <w:tcPr>
+            <w:tcW w:type="dxa" w:w="5900"/>
+            <w:tcBorders>
+              <w:top w:val="single" w:color="CCCCCC" w:sz="1"/>
+              <w:left w:val="single" w:color="CCCCCC" w:sz="1"/>
+              <w:bottom w:val="single" w:color="CCCCCC" w:sz="1"/>
+              <w:right w:val="single" w:color="CCCCCC" w:sz="1"/>
+            </w:tcBorders>
+            <w:shd w:fill="FFFFFF" w:val="clear"/>
+            <w:tcMar>
+              <w:top w:type="dxa" w:w="80"/>
+              <w:left w:type="dxa" w:w="120"/>
+              <w:bottom w:type="dxa" w:w="80"/>
+              <w:right w:type="dxa" w:w="120"/>
+            </w:tcMar>
+          </w:tcPr>
+          <w:p>
+            <w:r>
+              <w:rPr>
+                <w:rFonts w:ascii="Consolas" w:cs="Consolas" w:eastAsia="Consolas" w:hAnsi="Consolas"/>
+                <w:sz w:val="20"/>
+                <w:szCs w:val="20"/>
+              </w:rPr>
+              <w:t xml:space="preserve">RELEASING_AGENT</w:t>
+            </w:r>
+          </w:p>
+        </w:tc>
+        <w:tc>
+          <w:tcPr>
+            <w:tcW w:type="dxa" w:w="3460"/>
+            <w:tcBorders>
+              <w:top w:val="single" w:color="CCCCCC" w:sz="1"/>
+              <w:left w:val="single" w:color="CCCCCC" w:sz="1"/>
+              <w:bottom w:val="single" w:color="CCCCCC" w:sz="1"/>
+              <w:right w:val="single" w:color="CCCCCC" w:sz="1"/>
+            </w:tcBorders>
+            <w:shd w:fill="FFFFFF" w:val="clear"/>
+            <w:tcMar>
+              <w:top w:type="dxa" w:w="80"/>
+              <w:left w:type="dxa" w:w="120"/>
+              <w:bottom w:type="dxa" w:w="80"/>
+              <w:right w:type="dxa" w:w="120"/>
+            </w:tcMar>
+          </w:tcPr>
+          <w:p>
+            <w:r>
+              <w:rPr>
+                <w:rFonts w:ascii="Arial" w:cs="Arial" w:eastAsia="Arial" w:hAnsi="Arial"/>
+                <w:sz w:val="20"/>
+                <w:szCs w:val="20"/>
+              </w:rPr>
+              <w:t xml:space="preserve">6</w:t>
+            </w:r>
+          </w:p>
+        </w:tc>
+      </w:tr>
+      <w:tr>
+        <w:tc>
+          <w:tcPr>
+            <w:tcW w:type="dxa" w:w="5900"/>
+            <w:tcBorders>
+              <w:top w:val="single" w:color="CCCCCC" w:sz="1"/>
+              <w:left w:val="single" w:color="CCCCCC" w:sz="1"/>
+              <w:bottom w:val="single" w:color="CCCCCC" w:sz="1"/>
+              <w:right w:val="single" w:color="CCCCCC" w:sz="1"/>
+            </w:tcBorders>
+            <w:shd w:fill="F2F6FA" w:val="clear"/>
+            <w:tcMar>
+              <w:top w:type="dxa" w:w="80"/>
+              <w:left w:type="dxa" w:w="120"/>
+              <w:bottom w:type="dxa" w:w="80"/>
+              <w:right w:type="dxa" w:w="120"/>
+            </w:tcMar>
+          </w:tcPr>
+          <w:p>
+            <w:r>
+              <w:rPr>
+                <w:rFonts w:ascii="Consolas" w:cs="Consolas" w:eastAsia="Consolas" w:hAnsi="Consolas"/>
+                <w:sz w:val="20"/>
+                <w:szCs w:val="20"/>
+              </w:rPr>
+              <w:t xml:space="preserve">INVERSE_AGONIST</w:t>
+            </w:r>
+          </w:p>
+        </w:tc>
+        <w:tc>
+          <w:tcPr>
+            <w:tcW w:type="dxa" w:w="3460"/>
+            <w:tcBorders>
+              <w:top w:val="single" w:color="CCCCCC" w:sz="1"/>
+              <w:left w:val="single" w:color="CCCCCC" w:sz="1"/>
+              <w:bottom w:val="single" w:color="CCCCCC" w:sz="1"/>
+              <w:right w:val="single" w:color="CCCCCC" w:sz="1"/>
+            </w:tcBorders>
+            <w:shd w:fill="F2F6FA" w:val="clear"/>
+            <w:tcMar>
+              <w:top w:type="dxa" w:w="80"/>
+              <w:left w:type="dxa" w:w="120"/>
+              <w:bottom w:type="dxa" w:w="80"/>
+              <w:right w:type="dxa" w:w="120"/>
+            </w:tcMar>
+          </w:tcPr>
+          <w:p>
+            <w:r>
+              <w:rPr>
+                <w:rFonts w:ascii="Arial" w:cs="Arial" w:eastAsia="Arial" w:hAnsi="Arial"/>
+                <w:sz w:val="20"/>
+                <w:szCs w:val="20"/>
+              </w:rPr>
+              <w:t xml:space="preserve">6</w:t>
+            </w:r>
+          </w:p>
+        </w:tc>
+      </w:tr>
+      <w:tr>
+        <w:tc>
+          <w:tcPr>
+            <w:tcW w:type="dxa" w:w="5900"/>
+            <w:tcBorders>
+              <w:top w:val="single" w:color="CCCCCC" w:sz="1"/>
+              <w:left w:val="single" w:color="CCCCCC" w:sz="1"/>
+              <w:bottom w:val="single" w:color="CCCCCC" w:sz="1"/>
+              <w:right w:val="single" w:color="CCCCCC" w:sz="1"/>
+            </w:tcBorders>
+            <w:shd w:fill="FFFFFF" w:val="clear"/>
+            <w:tcMar>
+              <w:top w:type="dxa" w:w="80"/>
+              <w:left w:type="dxa" w:w="120"/>
+              <w:bottom w:type="dxa" w:w="80"/>
+              <w:right w:type="dxa" w:w="120"/>
+            </w:tcMar>
+          </w:tcPr>
+          <w:p>
+            <w:r>
+              <w:rPr>
+                <w:rFonts w:ascii="Consolas" w:cs="Consolas" w:eastAsia="Consolas" w:hAnsi="Consolas"/>
+                <w:sz w:val="20"/>
+                <w:szCs w:val="20"/>
+              </w:rPr>
+              <w:t xml:space="preserve">BINDING_AGENT</w:t>
+            </w:r>
+          </w:p>
+        </w:tc>
+        <w:tc>
+          <w:tcPr>
+            <w:tcW w:type="dxa" w:w="3460"/>
+            <w:tcBorders>
+              <w:top w:val="single" w:color="CCCCCC" w:sz="1"/>
+              <w:left w:val="single" w:color="CCCCCC" w:sz="1"/>
+              <w:bottom w:val="single" w:color="CCCCCC" w:sz="1"/>
+              <w:right w:val="single" w:color="CCCCCC" w:sz="1"/>
+            </w:tcBorders>
+            <w:shd w:fill="FFFFFF" w:val="clear"/>
+            <w:tcMar>
+              <w:top w:type="dxa" w:w="80"/>
+              <w:left w:type="dxa" w:w="120"/>
+              <w:bottom w:type="dxa" w:w="80"/>
+              <w:right w:type="dxa" w:w="120"/>
+            </w:tcMar>
+          </w:tcPr>
+          <w:p>
+            <w:r>
+              <w:rPr>
+                <w:rFonts w:ascii="Arial" w:cs="Arial" w:eastAsia="Arial" w:hAnsi="Arial"/>
+                <w:sz w:val="20"/>
+                <w:szCs w:val="20"/>
+              </w:rPr>
+              <w:t xml:space="preserve">4</w:t>
+            </w:r>
+          </w:p>
+        </w:tc>
+      </w:tr>
+      <w:tr>
+        <w:tc>
+          <w:tcPr>
+            <w:tcW w:type="dxa" w:w="5900"/>
+            <w:tcBorders>
+              <w:top w:val="single" w:color="CCCCCC" w:sz="1"/>
+              <w:left w:val="single" w:color="CCCCCC" w:sz="1"/>
+              <w:bottom w:val="single" w:color="CCCCCC" w:sz="1"/>
+              <w:right w:val="single" w:color="CCCCCC" w:sz="1"/>
+            </w:tcBorders>
+            <w:shd w:fill="F2F6FA" w:val="clear"/>
+            <w:tcMar>
+              <w:top w:type="dxa" w:w="80"/>
+              <w:left w:type="dxa" w:w="120"/>
+              <w:bottom w:type="dxa" w:w="80"/>
+              <w:right w:type="dxa" w:w="120"/>
+            </w:tcMar>
+          </w:tcPr>
+          <w:p>
+            <w:r>
+              <w:rPr>
+                <w:rFonts w:ascii="Consolas" w:cs="Consolas" w:eastAsia="Consolas" w:hAnsi="Consolas"/>
+                <w:sz w:val="20"/>
+                <w:szCs w:val="20"/>
+              </w:rPr>
+              <w:t xml:space="preserve">NEGATIVE_MODULATOR</w:t>
+            </w:r>
+          </w:p>
+        </w:tc>
+        <w:tc>
+          <w:tcPr>
+            <w:tcW w:type="dxa" w:w="3460"/>
+            <w:tcBorders>
+              <w:top w:val="single" w:color="CCCCCC" w:sz="1"/>
+              <w:left w:val="single" w:color="CCCCCC" w:sz="1"/>
+              <w:bottom w:val="single" w:color="CCCCCC" w:sz="1"/>
+              <w:right w:val="single" w:color="CCCCCC" w:sz="1"/>
+            </w:tcBorders>
+            <w:shd w:fill="F2F6FA" w:val="clear"/>
+            <w:tcMar>
+              <w:top w:type="dxa" w:w="80"/>
+              <w:left w:type="dxa" w:w="120"/>
+              <w:bottom w:type="dxa" w:w="80"/>
+              <w:right w:type="dxa" w:w="120"/>
+            </w:tcMar>
+          </w:tcPr>
+          <w:p>
+            <w:r>
+              <w:rPr>
+                <w:rFonts w:ascii="Arial" w:cs="Arial" w:eastAsia="Arial" w:hAnsi="Arial"/>
+                <w:sz w:val="20"/>
+                <w:szCs w:val="20"/>
+              </w:rPr>
+              <w:t xml:space="preserve">3</w:t>
+            </w:r>
+          </w:p>
+        </w:tc>
+      </w:tr>
+      <w:tr>
+        <w:tc>
+          <w:tcPr>
+            <w:tcW w:type="dxa" w:w="5900"/>
+            <w:tcBorders>
+              <w:top w:val="single" w:color="CCCCCC" w:sz="1"/>
+              <w:left w:val="single" w:color="CCCCCC" w:sz="1"/>
+              <w:bottom w:val="single" w:color="CCCCCC" w:sz="1"/>
+              <w:right w:val="single" w:color="CCCCCC" w:sz="1"/>
+            </w:tcBorders>
+            <w:shd w:fill="FFFFFF" w:val="clear"/>
+            <w:tcMar>
+              <w:top w:type="dxa" w:w="80"/>
+              <w:left w:type="dxa" w:w="120"/>
+              <w:bottom w:type="dxa" w:w="80"/>
+              <w:right w:type="dxa" w:w="120"/>
+            </w:tcMar>
+          </w:tcPr>
+          <w:p>
+            <w:r>
+              <w:rPr>
+                <w:rFonts w:ascii="Consolas" w:cs="Consolas" w:eastAsia="Consolas" w:hAnsi="Consolas"/>
+                <w:sz w:val="20"/>
+                <w:szCs w:val="20"/>
+              </w:rPr>
+              <w:t xml:space="preserve">SUBSTRATE</w:t>
+            </w:r>
+          </w:p>
+        </w:tc>
+        <w:tc>
+          <w:tcPr>
+            <w:tcW w:type="dxa" w:w="3460"/>
+            <w:tcBorders>
+              <w:top w:val="single" w:color="CCCCCC" w:sz="1"/>
+              <w:left w:val="single" w:color="CCCCCC" w:sz="1"/>
+              <w:bottom w:val="single" w:color="CCCCCC" w:sz="1"/>
+              <w:right w:val="single" w:color="CCCCCC" w:sz="1"/>
+            </w:tcBorders>
+            <w:shd w:fill="FFFFFF" w:val="clear"/>
+            <w:tcMar>
+              <w:top w:type="dxa" w:w="80"/>
+              <w:left w:type="dxa" w:w="120"/>
+              <w:bottom w:type="dxa" w:w="80"/>
+              <w:right w:type="dxa" w:w="120"/>
+            </w:tcMar>
+          </w:tcPr>
+          <w:p>
+            <w:r>
+              <w:rPr>
+                <w:rFonts w:ascii="Arial" w:cs="Arial" w:eastAsia="Arial" w:hAnsi="Arial"/>
+                <w:sz w:val="20"/>
+                <w:szCs w:val="20"/>
+              </w:rPr>
+              <w:t xml:space="preserve">3</w:t>
+            </w:r>
+          </w:p>
+        </w:tc>
+      </w:tr>
+      <w:tr>
+        <w:tc>
+          <w:tcPr>
+            <w:tcW w:type="dxa" w:w="5900"/>
+            <w:tcBorders>
+              <w:top w:val="single" w:color="CCCCCC" w:sz="1"/>
+              <w:left w:val="single" w:color="CCCCCC" w:sz="1"/>
+              <w:bottom w:val="single" w:color="CCCCCC" w:sz="1"/>
+              <w:right w:val="single" w:color="CCCCCC" w:sz="1"/>
+            </w:tcBorders>
+            <w:shd w:fill="F2F6FA" w:val="clear"/>
+            <w:tcMar>
+              <w:top w:type="dxa" w:w="80"/>
+              <w:left w:type="dxa" w:w="120"/>
+              <w:bottom w:type="dxa" w:w="80"/>
+              <w:right w:type="dxa" w:w="120"/>
+            </w:tcMar>
+          </w:tcPr>
+          <w:p>
+            <w:r>
+              <w:rPr>
+                <w:rFonts w:ascii="Consolas" w:cs="Consolas" w:eastAsia="Consolas" w:hAnsi="Consolas"/>
+                <w:sz w:val="20"/>
+                <w:szCs w:val="20"/>
+              </w:rPr>
+              <w:t xml:space="preserve">DEGRADER</w:t>
+            </w:r>
+          </w:p>
+        </w:tc>
+        <w:tc>
+          <w:tcPr>
+            <w:tcW w:type="dxa" w:w="3460"/>
+            <w:tcBorders>
+              <w:top w:val="single" w:color="CCCCCC" w:sz="1"/>
+              <w:left w:val="single" w:color="CCCCCC" w:sz="1"/>
+              <w:bottom w:val="single" w:color="CCCCCC" w:sz="1"/>
+              <w:right w:val="single" w:color="CCCCCC" w:sz="1"/>
+            </w:tcBorders>
+            <w:shd w:fill="F2F6FA" w:val="clear"/>
+            <w:tcMar>
+              <w:top w:type="dxa" w:w="80"/>
+              <w:left w:type="dxa" w:w="120"/>
+              <w:bottom w:type="dxa" w:w="80"/>
+              <w:right w:type="dxa" w:w="120"/>
+            </w:tcMar>
+          </w:tcPr>
+          <w:p>
+            <w:r>
+              <w:rPr>
+                <w:rFonts w:ascii="Arial" w:cs="Arial" w:eastAsia="Arial" w:hAnsi="Arial"/>
+                <w:sz w:val="20"/>
+                <w:szCs w:val="20"/>
+              </w:rPr>
+              <w:t xml:space="preserve">2</w:t>
+            </w:r>
+          </w:p>
+        </w:tc>
+      </w:tr>
+    </w:tbl>
+    <w:p>
+      <w:pPr>
+        <w:spacing w:before="200"/>
+      </w:pPr>
+      <w:r>
+        <w:t xml:space="preserve">Most volume is concentrated in 5 relations (ASSOCIATED_WITH, EXPRESSION_PRESENT/EXPRESSION_ABSENT, SYNERGISTIC_INTERACTION, INTERACTS_WITH); the rest — mostly drug-mechanism terms like AGONIST, ANTAGONIST, INHIBITOR — are long-tail but semantically precise for pharmacology-specific queries.</w:t>
       </w:r>
     </w:p>
     <w:sectPr>

</xml_diff>

<commit_message>
Remove em-dashes from ARCHITECTURE.docx
Replaces each em-dash with the punctuation that keeps the sentence
readable (colon, semicolon, comma, or a sentence break) without changing
any other content. ARCHITECTURE.md is left as-is per request.
</commit_message>
<xml_diff>
--- a/ARCHITECTURE.docx
+++ b/ARCHITECTURE.docx
@@ -44,7 +44,7 @@
         <w:pStyle w:val="Heading2"/>
       </w:pPr>
       <w:r>
-        <w:t xml:space="preserve">nodes.parquet — one row per entity</w:t>
+        <w:t xml:space="preserve">nodes.parquet: one row per entity</w:t>
       </w:r>
     </w:p>
     <w:tbl>
@@ -409,7 +409,7 @@
                 <w:sz w:val="20"/>
                 <w:szCs w:val="20"/>
               </w:rPr>
-              <w:t xml:space="preserve">type-specific attributes — genes carry symbol/biotype/genomic coordinates, diseases/drugs carry name/description/synonyms, etc.</w:t>
+              <w:t xml:space="preserve">type-specific attributes: genes carry symbol/biotype/genomic coordinates, diseases/drugs carry name/description/synonyms, etc.</w:t>
             </w:r>
           </w:p>
         </w:tc>
@@ -425,7 +425,7 @@
         <w:pStyle w:val="Heading2"/>
       </w:pPr>
       <w:r>
-        <w:t xml:space="preserve">edges.parquet — one row per relationship</w:t>
+        <w:t xml:space="preserve">edges.parquet: one row per relationship</w:t>
       </w:r>
     </w:p>
     <w:tbl>
@@ -973,7 +973,7 @@
         <w:spacing w:after="160"/>
       </w:pPr>
       <w:r>
-        <w:t xml:space="preserve">Both files together are ~326 MB and encode the full graph: 190K nodes, 21.8M edges. There is no vector index and no graph database in this setup — it is plain columnar data queried directly.</w:t>
+        <w:t xml:space="preserve">Both files together are ~326 MB and encode the full graph: 190K nodes, 21.8M edges. There is no vector index and no graph database in this setup; it is plain columnar data queried directly.</w:t>
       </w:r>
     </w:p>
     <w:p>
@@ -997,7 +997,7 @@
         <w:spacing w:after="160"/>
       </w:pPr>
       <w:r>
-        <w:t xml:space="preserve">The LLM (OpenAI, via chat.py) never touches Parquet, SQL, or DuckDB directly. It only sees seven tool/function definitions — a JSON schema describing what each tool takes and returns:</w:t>
+        <w:t xml:space="preserve">The LLM (OpenAI, via chat.py) never touches Parquet, SQL, or DuckDB directly. It only sees seven tool/function definitions, each a JSON schema describing what the tool takes and returns:</w:t>
       </w:r>
     </w:p>
     <w:tbl>
@@ -1305,7 +1305,7 @@
                 <w:sz w:val="20"/>
                 <w:szCs w:val="20"/>
               </w:rPr>
-              <w:t xml:space="preserve">same join, plus TRY_CAST(json_extract(properties, sort_by)) and ORDER BY ... DESC LIMIT top_n — for “strongest”/“top” questions</w:t>
+              <w:t xml:space="preserve">same join, plus TRY_CAST(json_extract(properties, sort_by)) and ORDER BY ... DESC LIMIT top_n, used for “strongest”/“top” questions</w:t>
             </w:r>
           </w:p>
         </w:tc>
@@ -1523,7 +1523,7 @@
         <w:spacing w:after="160"/>
       </w:pPr>
       <w:r>
-        <w:t xml:space="preserve">chat.py intercepts that, calls the real Python function in kg.py against the actual Parquet data, and feeds the JSON result back into the conversation as a tool message. The LLM only ever reasons over what these functions return — it cannot see or invent graph data outside of what a tool call surfaces.</w:t>
+        <w:t xml:space="preserve">chat.py intercepts that, calls the real Python function in kg.py against the actual Parquet data, and feeds the JSON result back into the conversation as a tool message. The LLM only ever reasons over what these functions return; it cannot see or invent graph data outside of what a tool call surfaces.</w:t>
       </w:r>
     </w:p>
     <w:p>
@@ -1531,7 +1531,7 @@
         <w:spacing w:after="160"/>
       </w:pPr>
       <w:r>
-        <w:t xml:space="preserve">The KG itself has no “understanding” — it is inert rows. All reasoning (which tool to call, how to interpret the result, when to stop) is done by the LLM.</w:t>
+        <w:t xml:space="preserve">The KG itself has no “understanding.” It is inert rows. All reasoning (which tool to call, how to interpret the result, when to stop) is done by the LLM.</w:t>
       </w:r>
     </w:p>
     <w:p>
@@ -1625,7 +1625,7 @@
         <w:spacing w:after="80"/>
       </w:pPr>
       <w:r>
-        <w:t xml:space="preserve">Repeat until the model responds with plain text instead of a tool call — that is the final answer, printed to the user.</w:t>
+        <w:t xml:space="preserve">Repeat until the model responds with plain text instead of a tool call; that is the final answer, printed to the user.</w:t>
       </w:r>
     </w:p>
     <w:p>
@@ -1645,7 +1645,7 @@
           <w:b w:val="false"/>
           <w:bCs w:val="false"/>
         </w:rPr>
-        <w:t xml:space="preserve">The system prompt enforces one important rule: always resolve a name to a node id via search_nodes before calling get_node/get_neighbors. This exists because graph ids are opaque strings the model can't guess (e.g. MONDO_0005180 for “Parkinson disease”) — it must look them up first.</w:t>
+        <w:t xml:space="preserve">The system prompt enforces one important rule: always resolve a name to a node id via search_nodes before calling get_node/get_neighbors. This exists because graph ids are opaque strings the model can't guess (e.g. MONDO_0005180 for “Parkinson disease”); it must look them up first.</w:t>
       </w:r>
     </w:p>
     <w:p>
@@ -1945,7 +1945,7 @@
         <w:spacing w:after="160"/>
       </w:pPr>
       <w:r>
-        <w:t xml:space="preserve">Every fact in the final answer (gene names, ids, scores) traces back to a specific SQL query result from step 2 or 4 — the LLM's job in this pipeline is orchestration and natural-language synthesis, not recalling biomedical facts from its own training data.</w:t>
+        <w:t xml:space="preserve">Every fact in the final answer (gene names, ids, scores) traces back to a specific SQL query result from step 2 or 4. The LLM's job in this pipeline is orchestration and natural-language synthesis, not recalling biomedical facts from its own training data.</w:t>
       </w:r>
     </w:p>
     <w:p>
@@ -1953,7 +1953,7 @@
         <w:spacing w:after="160"/>
       </w:pPr>
       <w:r>
-        <w:t xml:space="preserve">A follow-up question like “what are the strongest gene associations for Parkinson disease?” runs the same shape of loop but calls rank_neighbors instead of get_neighbors in step 4, since the model recognizes “strongest” as a request to sort by evidence_score rather than return an arbitrary slice. Against the real graph this correctly surfaces LRRK2, SNCA, PRKN, PINK1, PARK7, and GBA1 — the genes established in the literature as most strongly linked to Parkinson's disease — ranked by evidence score rather than insertion order.</w:t>
+        <w:t xml:space="preserve">A follow-up question like “what are the strongest gene associations for Parkinson disease?” runs the same shape of loop but calls rank_neighbors instead of get_neighbors in step 4, since the model recognizes “strongest” as a request to sort by evidence_score rather than return an arbitrary slice. Against the real graph this correctly surfaces LRRK2, SNCA, PRKN, PINK1, PARK7, and GBA1, the genes established in the literature as most strongly linked to Parkinson's disease, ranked by evidence score rather than insertion order.</w:t>
       </w:r>
     </w:p>
     <w:p>
@@ -6750,7 +6750,7 @@
         <w:spacing w:before="200"/>
       </w:pPr>
       <w:r>
-        <w:t xml:space="preserve">Most volume is concentrated in 5 relations (ASSOCIATED_WITH, EXPRESSION_PRESENT/EXPRESSION_ABSENT, SYNERGISTIC_INTERACTION, INTERACTS_WITH); the rest — mostly drug-mechanism terms like AGONIST, ANTAGONIST, INHIBITOR — are long-tail but semantically precise for pharmacology-specific queries.</w:t>
+        <w:t xml:space="preserve">Most volume is concentrated in 5 relations (ASSOCIATED_WITH, EXPRESSION_PRESENT/EXPRESSION_ABSENT, SYNERGISTIC_INTERACTION, INTERACTS_WITH); the rest, mostly drug-mechanism terms like AGONIST, ANTAGONIST, INHIBITOR, are long-tail but semantically precise for pharmacology-specific queries.</w:t>
       </w:r>
     </w:p>
     <w:sectPr>

</xml_diff>

<commit_message>
Embed rendered diagram image in section 5 instead of ASCII art
Renders diagram.tex to diagram.png (300 DPI) and embeds it in both
ARCHITECTURE.md and ARCHITECTURE.docx, replacing the ASCII-art box
diagram with the actual TikZ rendering.
</commit_message>
<xml_diff>
--- a/ARCHITECTURE.docx
+++ b/ARCHITECTURE.docx
@@ -2482,142 +2482,64 @@
     </w:p>
     <w:p>
       <w:pPr>
-        <w:pBdr>
-          <w:top w:val="single" w:color="DDDDDD" w:sz="4"/>
-          <w:bottom w:val="single" w:color="DDDDDD" w:sz="4"/>
-          <w:left w:val="single" w:color="DDDDDD" w:sz="4"/>
-          <w:right w:val="single" w:color="DDDDDD" w:sz="4"/>
-        </w:pBdr>
-        <w:shd w:fill="F5F5F5" w:val="clear"/>
-        <w:spacing w:after="240" w:before="120"/>
+        <w:spacing w:after="80" w:before="120"/>
+        <w:jc w:val="center"/>
       </w:pPr>
       <w:r>
+        <w:drawing>
+          <wp:inline distT="0" distB="0" distL="0" distR="0">
+            <wp:extent cx="5943600" cy="2114550"/>
+            <wp:effectExtent t="0" r="0" b="0" l="0"/>
+            <wp:docPr id="1" name="Summary diagram" descr="User question flows down to the OpenAI LLM, which exchanges tool calls (JSON) and tool results (JSON) with chat.py, which exchanges SQL over Parquet and rows/JSON properties with kg.py (DuckDB) over nodes.parquet/edges.parquet; the LLM then produces the final answer." title="Summary diagram"/>
+            <wp:cNvGraphicFramePr>
+              <a:graphicFrameLocks xmlns:a="http://schemas.openxmlformats.org/drawingml/2006/main" noChangeAspect="1"/>
+            </wp:cNvGraphicFramePr>
+            <a:graphic xmlns:a="http://schemas.openxmlformats.org/drawingml/2006/main">
+              <a:graphicData uri="http://schemas.openxmlformats.org/drawingml/2006/picture">
+                <pic:pic xmlns:pic="http://schemas.openxmlformats.org/drawingml/2006/picture">
+                  <pic:nvPicPr>
+                    <pic:cNvPr id="0" name="" descr=""/>
+                    <pic:cNvPicPr>
+                      <a:picLocks noChangeAspect="1" noChangeArrowheads="1"/>
+                    </pic:cNvPicPr>
+                  </pic:nvPicPr>
+                  <pic:blipFill>
+                    <a:blip r:embed="rId7" cstate="none"/>
+                    <a:srcRect/>
+                    <a:stretch>
+                      <a:fillRect/>
+                    </a:stretch>
+                  </pic:blipFill>
+                  <pic:spPr bwMode="auto">
+                    <a:xfrm>
+                      <a:off x="0" y="0"/>
+                      <a:ext cx="5943600" cy="2114550"/>
+                    </a:xfrm>
+                    <a:prstGeom prst="rect">
+                      <a:avLst/>
+                    </a:prstGeom>
+                  </pic:spPr>
+                </pic:pic>
+              </a:graphicData>
+            </a:graphic>
+          </wp:inline>
+        </w:drawing>
+      </w:r>
+    </w:p>
+    <w:p>
+      <w:pPr>
+        <w:spacing w:after="240"/>
+        <w:jc w:val="center"/>
+      </w:pPr>
+      <w:r>
         <w:rPr>
-          <w:rFonts w:ascii="Consolas" w:cs="Consolas" w:eastAsia="Consolas" w:hAnsi="Consolas"/>
+          <w:i/>
+          <w:iCs/>
+          <w:color w:val="666666"/>
           <w:sz w:val="18"/>
           <w:szCs w:val="18"/>
         </w:rPr>
-        <w:t xml:space="preserve"> User question</w:t>
-      </w:r>
-      <w:r>
-        <w:br/>
-        <w:t xml:space="preserve"/>
-      </w:r>
-      <w:r>
-        <w:rPr>
-          <w:rFonts w:ascii="Consolas" w:cs="Consolas" w:eastAsia="Consolas" w:hAnsi="Consolas"/>
-          <w:sz w:val="18"/>
-          <w:szCs w:val="18"/>
-        </w:rPr>
-        <w:t xml:space="preserve">      |</w:t>
-      </w:r>
-      <w:r>
-        <w:br/>
-        <w:t xml:space="preserve"/>
-      </w:r>
-      <w:r>
-        <w:rPr>
-          <w:rFonts w:ascii="Consolas" w:cs="Consolas" w:eastAsia="Consolas" w:hAnsi="Consolas"/>
-          <w:sz w:val="18"/>
-          <w:szCs w:val="18"/>
-        </w:rPr>
-        <w:t xml:space="preserve">      v</w:t>
-      </w:r>
-      <w:r>
-        <w:br/>
-        <w:t xml:space="preserve"/>
-      </w:r>
-      <w:r>
-        <w:rPr>
-          <w:rFonts w:ascii="Consolas" w:cs="Consolas" w:eastAsia="Consolas" w:hAnsi="Consolas"/>
-          <w:sz w:val="18"/>
-          <w:szCs w:val="18"/>
-        </w:rPr>
-        <w:t xml:space="preserve"> +-------------+   tool call (JSON)   +-----------+   SQL over Parquet   +---------------------+</w:t>
-      </w:r>
-      <w:r>
-        <w:br/>
-        <w:t xml:space="preserve"/>
-      </w:r>
-      <w:r>
-        <w:rPr>
-          <w:rFonts w:ascii="Consolas" w:cs="Consolas" w:eastAsia="Consolas" w:hAnsi="Consolas"/>
-          <w:sz w:val="18"/>
-          <w:szCs w:val="18"/>
-        </w:rPr>
-        <w:t xml:space="preserve"> |  OpenAI LLM | -------------------&gt; |  chat.py  | -------------------&gt; |  kg.py (DuckDB)     |</w:t>
-      </w:r>
-      <w:r>
-        <w:br/>
-        <w:t xml:space="preserve"/>
-      </w:r>
-      <w:r>
-        <w:rPr>
-          <w:rFonts w:ascii="Consolas" w:cs="Consolas" w:eastAsia="Consolas" w:hAnsi="Consolas"/>
-          <w:sz w:val="18"/>
-          <w:szCs w:val="18"/>
-        </w:rPr>
-        <w:t xml:space="preserve"> | (reasoning, |                      | (dispatch)|                      |  nodes.parquet      |</w:t>
-      </w:r>
-      <w:r>
-        <w:br/>
-        <w:t xml:space="preserve"/>
-      </w:r>
-      <w:r>
-        <w:rPr>
-          <w:rFonts w:ascii="Consolas" w:cs="Consolas" w:eastAsia="Consolas" w:hAnsi="Consolas"/>
-          <w:sz w:val="18"/>
-          <w:szCs w:val="18"/>
-        </w:rPr>
-        <w:t xml:space="preserve"> |  synthesis) | &lt;------------------- |           | &lt;------------------- |  edges.parquet      |</w:t>
-      </w:r>
-      <w:r>
-        <w:br/>
-        <w:t xml:space="preserve"/>
-      </w:r>
-      <w:r>
-        <w:rPr>
-          <w:rFonts w:ascii="Consolas" w:cs="Consolas" w:eastAsia="Consolas" w:hAnsi="Consolas"/>
-          <w:sz w:val="18"/>
-          <w:szCs w:val="18"/>
-        </w:rPr>
-        <w:t xml:space="preserve"> +-------------+   tool result (JSON) +-----------+   rows / JSON props  +---------------------+</w:t>
-      </w:r>
-      <w:r>
-        <w:br/>
-        <w:t xml:space="preserve"/>
-      </w:r>
-      <w:r>
-        <w:rPr>
-          <w:rFonts w:ascii="Consolas" w:cs="Consolas" w:eastAsia="Consolas" w:hAnsi="Consolas"/>
-          <w:sz w:val="18"/>
-          <w:szCs w:val="18"/>
-        </w:rPr>
-        <w:t xml:space="preserve">      |</w:t>
-      </w:r>
-      <w:r>
-        <w:br/>
-        <w:t xml:space="preserve"/>
-      </w:r>
-      <w:r>
-        <w:rPr>
-          <w:rFonts w:ascii="Consolas" w:cs="Consolas" w:eastAsia="Consolas" w:hAnsi="Consolas"/>
-          <w:sz w:val="18"/>
-          <w:szCs w:val="18"/>
-        </w:rPr>
-        <w:t xml:space="preserve">      v</w:t>
-      </w:r>
-      <w:r>
-        <w:br/>
-        <w:t xml:space="preserve"/>
-      </w:r>
-      <w:r>
-        <w:rPr>
-          <w:rFonts w:ascii="Consolas" w:cs="Consolas" w:eastAsia="Consolas" w:hAnsi="Consolas"/>
-          <w:sz w:val="18"/>
-          <w:szCs w:val="18"/>
-        </w:rPr>
-        <w:t xml:space="preserve"> Final answer, grounded in retrieved rows</w:t>
+        <w:t xml:space="preserve">Source: diagram.tex, a standalone TikZ diagram (compile with pdflatex diagram.tex).</w:t>
       </w:r>
     </w:p>
     <w:p>

</xml_diff>